<commit_message>
fixed formatting in trust
</commit_message>
<xml_diff>
--- a/static/templates/joint_template.docx
+++ b/static/templates/joint_template.docx
@@ -1811,7 +1811,7 @@
     </w:p>
     <w:p>
       <w:pPr>
-        <w:pStyle w:val="Body"/>
+        <w:pStyle w:val="heading 6"/>
         <w:ind w:left="363" w:firstLine="0"/>
         <w:rPr>
           <w:b w:val="1"/>
@@ -4901,7 +4901,7 @@
           <w:tab w:val="left" w:pos="962"/>
         </w:tabs>
         <w:spacing w:before="118" w:line="309" w:lineRule="auto"/>
-        <w:ind w:left="958" w:right="649" w:firstLine="0"/>
+        <w:ind w:right="649" w:firstLine="0"/>
         <w:rPr>
           <w:outline w:val="0"/>
           <w:color w:val="030303"/>
@@ -4928,8 +4928,6 @@
             </w14:solidFill>
           </w14:textFill>
         </w:rPr>
-        <w:tab/>
-        <w:tab/>
       </w:r>
     </w:p>
     <w:p>
@@ -4967,78 +4965,6 @@
             </w14:solidFill>
           </w14:textFill>
         </w:rPr>
-        <mc:AlternateContent>
-          <mc:Choice Requires="wps">
-            <w:drawing xmlns:a="http://schemas.openxmlformats.org/drawingml/2006/main">
-              <wp:anchor distT="0" distB="0" distL="0" distR="0" simplePos="0" relativeHeight="251663360" behindDoc="0" locked="0" layoutInCell="1" allowOverlap="1">
-                <wp:simplePos x="0" y="0"/>
-                <wp:positionH relativeFrom="column">
-                  <wp:posOffset>0</wp:posOffset>
-                </wp:positionH>
-                <wp:positionV relativeFrom="line">
-                  <wp:posOffset>58356</wp:posOffset>
-                </wp:positionV>
-                <wp:extent cx="6743700" cy="12700"/>
-                <wp:effectExtent l="0" t="0" r="0" b="0"/>
-                <wp:wrapTopAndBottom distT="0" distB="0"/>
-                <wp:docPr id="1073741829" name="officeArt object" descr="Rectangle"/>
-                <wp:cNvGraphicFramePr/>
-                <a:graphic xmlns:a="http://schemas.openxmlformats.org/drawingml/2006/main">
-                  <a:graphicData uri="http://schemas.microsoft.com/office/word/2010/wordprocessingShape">
-                    <wps:wsp>
-                      <wps:cNvSpPr/>
-                      <wps:spPr>
-                        <a:xfrm>
-                          <a:off x="0" y="0"/>
-                          <a:ext cx="6743700" cy="12700"/>
-                        </a:xfrm>
-                        <a:prstGeom prst="rect">
-                          <a:avLst/>
-                        </a:prstGeom>
-                        <a:solidFill>
-                          <a:srgbClr val="000000"/>
-                        </a:solidFill>
-                        <a:ln w="12700" cap="flat">
-                          <a:noFill/>
-                          <a:miter lim="400000"/>
-                        </a:ln>
-                        <a:effectLst/>
-                      </wps:spPr>
-                      <wps:bodyPr/>
-                    </wps:wsp>
-                  </a:graphicData>
-                </a:graphic>
-              </wp:anchor>
-            </w:drawing>
-          </mc:Choice>
-          <mc:Fallback>
-            <w:pict>
-              <v:rect id="_x0000_s1030" style="visibility:visible;position:absolute;margin-left:0.0pt;margin-top:4.6pt;width:531.0pt;height:1.0pt;z-index:251663360;mso-position-horizontal:absolute;mso-position-horizontal-relative:text;mso-position-vertical:absolute;mso-position-vertical-relative:line;mso-wrap-distance-left:0.0pt;mso-wrap-distance-top:0.0pt;mso-wrap-distance-right:0.0pt;mso-wrap-distance-bottom:0.0pt;">
-                <v:fill color="#000000" opacity="100.0%" type="solid"/>
-                <v:stroke on="f" weight="1.0pt" dashstyle="solid" endcap="flat" miterlimit="400.0%" joinstyle="miter" linestyle="single" startarrow="none" startarrowwidth="medium" startarrowlength="medium" endarrow="none" endarrowwidth="medium" endarrowlength="medium"/>
-                <w10:wrap type="topAndBottom" side="bothSides" anchorx="text"/>
-              </v:rect>
-            </w:pict>
-          </mc:Fallback>
-        </mc:AlternateContent>
-      </w:r>
-      <w:r>
-        <w:rPr>
-          <w:outline w:val="0"/>
-          <w:color w:val="030303"/>
-          <w:sz w:val="27"/>
-          <w:szCs w:val="27"/>
-          <w:u w:color="030303"/>
-          <w14:textFill>
-            <w14:solidFill>
-              <w14:srgbClr w14:val="030303"/>
-            </w14:solidFill>
-          </w14:textFill>
-        </w:rPr>
-        <w:tab/>
-      </w:r>
-      <w:r>
-        <w:tab/>
       </w:r>
     </w:p>
     <w:p>
@@ -6137,7 +6063,7 @@
     </w:p>
     <w:p>
       <w:pPr>
-        <w:pStyle w:val="heading 6"/>
+        <w:pStyle w:val="Body"/>
         <w:spacing w:before="1"/>
         <w:ind w:firstLine="363"/>
         <w:rPr>
@@ -6681,23 +6607,7 @@
                 <w:rtl w:val="0"/>
                 <w:lang w:val="en-US"/>
               </w:rPr>
-              <w:t>{#</w:t>
-            </w:r>
-            <w:r>
-              <w:rPr>
-                <w:shd w:val="nil" w:color="auto" w:fill="auto"/>
-                <w:rtl w:val="0"/>
-                <w:lang w:val="en-US"/>
-              </w:rPr>
-              <w:t>wifeHeirs</w:t>
-            </w:r>
-            <w:r>
-              <w:rPr>
-                <w:shd w:val="nil" w:color="auto" w:fill="auto"/>
-                <w:rtl w:val="0"/>
-                <w:lang w:val="en-US"/>
-              </w:rPr>
-              <w:t>}{heirName}</w:t>
+              <w:t>{#wifeHeirs}{heirName}</w:t>
             </w:r>
           </w:p>
         </w:tc>
@@ -6729,23 +6639,7 @@
                 <w:rtl w:val="0"/>
                 <w:lang w:val="en-US"/>
               </w:rPr>
-              <w:t>{heirRelationship}{/</w:t>
-            </w:r>
-            <w:r>
-              <w:rPr>
-                <w:shd w:val="nil" w:color="auto" w:fill="auto"/>
-                <w:rtl w:val="0"/>
-                <w:lang w:val="en-US"/>
-              </w:rPr>
-              <w:t>wifeHeirs</w:t>
-            </w:r>
-            <w:r>
-              <w:rPr>
-                <w:shd w:val="nil" w:color="auto" w:fill="auto"/>
-                <w:rtl w:val="0"/>
-                <w:lang w:val="en-US"/>
-              </w:rPr>
-              <w:t>}</w:t>
+              <w:t>{heirRelationship}{/wifeHeirs}</w:t>
             </w:r>
           </w:p>
         </w:tc>
@@ -6763,7 +6657,7 @@
     </w:p>
     <w:p>
       <w:pPr>
-        <w:pStyle w:val="heading 5"/>
+        <w:pStyle w:val="Body"/>
       </w:pPr>
       <w:r>
         <mc:AlternateContent>
@@ -6824,13 +6718,13 @@
     </w:p>
     <w:p>
       <w:pPr>
-        <w:pStyle w:val="heading 5"/>
+        <w:pStyle w:val="Body"/>
         <w:ind w:firstLine="363"/>
       </w:pPr>
     </w:p>
     <w:p>
       <w:pPr>
-        <w:pStyle w:val="heading 5"/>
+        <w:pStyle w:val="heading 6"/>
         <w:ind w:firstLine="363"/>
       </w:pPr>
       <w:r>
@@ -7233,24 +7127,7 @@
             </w14:solidFill>
           </w14:textFill>
         </w:rPr>
-        <w:t>{#trustees</w:t>
-      </w:r>
-      <w:r>
-        <w:rPr>
-          <w:outline w:val="0"/>
-          <w:color w:val="030303"/>
-          <w:sz w:val="27"/>
-          <w:szCs w:val="27"/>
-          <w:u w:color="030303"/>
-          <w:rtl w:val="0"/>
-          <w:lang w:val="en-US"/>
-          <w14:textFill>
-            <w14:solidFill>
-              <w14:srgbClr w14:val="030303"/>
-            </w14:solidFill>
-          </w14:textFill>
-        </w:rPr>
-        <w:t>}</w:t>
+        <w:t>{#trustees}</w:t>
       </w:r>
     </w:p>
     <w:p>
@@ -9282,7 +9159,7 @@
     </w:p>
     <w:p>
       <w:pPr>
-        <w:pStyle w:val="heading 5"/>
+        <w:pStyle w:val="heading 6"/>
         <w:spacing w:before="62"/>
         <w:ind w:firstLine="363"/>
       </w:pPr>
@@ -10778,22 +10655,7 @@
             </w14:solidFill>
           </w14:textFill>
         </w:rPr>
-        <w:t>A</w:t>
-      </w:r>
-      <w:r>
-        <w:rPr>
-          <w:outline w:val="0"/>
-          <w:color w:val="030303"/>
-          <w:u w:color="030303"/>
-          <w:rtl w:val="0"/>
-          <w:lang w:val="en-US"/>
-          <w14:textFill>
-            <w14:solidFill>
-              <w14:srgbClr w14:val="030303"/>
-            </w14:solidFill>
-          </w14:textFill>
-        </w:rPr>
-        <w:t>RTICLE TEN</w:t>
+        <w:t>ARTICLE TEN</w:t>
       </w:r>
     </w:p>
     <w:p>
@@ -11006,266 +10868,468 @@
     <w:p>
       <w:pPr>
         <w:pStyle w:val="Body"/>
-        <w:tabs>
-          <w:tab w:val="left" w:pos="960"/>
-        </w:tabs>
-        <w:spacing w:before="71" w:line="304" w:lineRule="auto"/>
-        <w:ind w:right="474"/>
-        <w:rPr>
-          <w:outline w:val="0"/>
-          <w:color w:val="030303"/>
-          <w:sz w:val="27"/>
-          <w:szCs w:val="27"/>
-          <w:u w:color="030303"/>
-          <w14:textFill>
-            <w14:solidFill>
-              <w14:srgbClr w14:val="030303"/>
-            </w14:solidFill>
-          </w14:textFill>
-        </w:rPr>
       </w:pPr>
       <w:r>
-        <w:rPr>
-          <w:outline w:val="0"/>
-          <w:color w:val="030303"/>
-          <w:sz w:val="27"/>
-          <w:szCs w:val="27"/>
-          <w:u w:color="030303"/>
-          <w:rtl w:val="0"/>
-          <w:lang w:val="en-US"/>
-          <w14:textFill>
-            <w14:solidFill>
-              <w14:srgbClr w14:val="030303"/>
-            </w14:solidFill>
-          </w14:textFill>
-        </w:rPr>
-        <w:t>{^husbandCharitable}</w:t>
+        <w:t xml:space="preserve">{#hasHusbandCharitable}</w:t>
+      </w:r>
+    </w:p>
+    <w:tbl>
+      <w:tblPr>
+        <w:tblW w:w="11018" w:type="dxa"/>
+        <w:jc w:val="left"/>
+        <w:tblInd w:w="609" w:type="dxa"/>
+        <w:tblBorders>
+          <w:top w:val="single" w:color="ffffff" w:sz="8" w:space="0" w:shadow="0" w:frame="0"/>
+          <w:left w:val="single" w:color="ffffff" w:sz="8" w:space="0" w:shadow="0" w:frame="0"/>
+          <w:bottom w:val="single" w:color="ffffff" w:sz="8" w:space="0" w:shadow="0" w:frame="0"/>
+          <w:right w:val="single" w:color="ffffff" w:sz="8" w:space="0" w:shadow="0" w:frame="0"/>
+          <w:insideH w:val="single" w:color="ffffff" w:sz="8" w:space="0" w:shadow="0" w:frame="0"/>
+          <w:insideV w:val="single" w:color="ffffff" w:sz="8" w:space="0" w:shadow="0" w:frame="0"/>
+        </w:tblBorders>
+        <w:shd w:val="clear" w:color="auto" w:fill="ced7e7"/>
+        <w:tblLayout w:type="fixed"/>
+      </w:tblPr>
+      <w:tblGrid>
+        <w:gridCol w:w="5509"/>
+        <w:gridCol w:w="5509"/>
+      </w:tblGrid>
+      <w:tr>
+        <w:tblPrEx>
+          <w:shd w:val="clear" w:color="auto" w:fill="ced7e7"/>
+        </w:tblPrEx>
+        <w:trPr>
+          <w:trHeight w:val="310" w:hRule="atLeast"/>
+        </w:trPr>
+        <w:tc>
+          <w:tcPr>
+            <w:tcW w:type="dxa" w:w="5509"/>
+            <w:tcBorders>
+              <w:top w:val="single" w:color="000000" w:sz="8" w:space="0" w:shadow="0" w:frame="0"/>
+              <w:left w:val="single" w:color="000000" w:sz="8" w:space="0" w:shadow="0" w:frame="0"/>
+              <w:bottom w:val="single" w:color="000000" w:sz="8" w:space="0" w:shadow="0" w:frame="0"/>
+              <w:right w:val="single" w:color="000000" w:sz="8" w:space="0" w:shadow="0" w:frame="0"/>
+            </w:tcBorders>
+            <w:shd w:val="clear" w:color="auto" w:fill="auto"/>
+            <w:tcMar>
+              <w:top w:type="dxa" w:w="80"/>
+              <w:left w:type="dxa" w:w="577"/>
+              <w:bottom w:type="dxa" w:w="80"/>
+              <w:right w:type="dxa" w:w="80"/>
+            </w:tcMar>
+            <w:vAlign w:val="top"/>
+          </w:tcPr>
+          <w:p>
+            <w:pPr>
+              <w:pStyle w:val="Body"/>
+            </w:pPr>
+            <w:r>
+              <w:rPr>
+                <w:b/>
+                <w:sz w:val="24"/>
+                <w:szCs w:val="24"/>
+              </w:rPr>
+              <w:t xml:space="preserve">Charity</w:t>
+            </w:r>
+          </w:p>
+        </w:tc>
+        <w:tc>
+          <w:tcPr>
+            <w:tcW w:type="dxa" w:w="5509"/>
+            <w:tcBorders>
+              <w:top w:val="single" w:color="000000" w:sz="8" w:space="0" w:shadow="0" w:frame="0"/>
+              <w:left w:val="single" w:color="000000" w:sz="8" w:space="0" w:shadow="0" w:frame="0"/>
+              <w:bottom w:val="single" w:color="000000" w:sz="8" w:space="0" w:shadow="0" w:frame="0"/>
+              <w:right w:val="single" w:color="000000" w:sz="8" w:space="0" w:shadow="0" w:frame="0"/>
+            </w:tcBorders>
+            <w:shd w:val="clear" w:color="auto" w:fill="auto"/>
+            <w:tcMar>
+              <w:top w:type="dxa" w:w="80"/>
+              <w:left w:type="dxa" w:w="577"/>
+              <w:bottom w:type="dxa" w:w="80"/>
+              <w:right w:type="dxa" w:w="80"/>
+            </w:tcMar>
+            <w:vAlign w:val="top"/>
+          </w:tcPr>
+          <w:p>
+            <w:pPr>
+              <w:pStyle w:val="Body"/>
+            </w:pPr>
+            <w:r>
+              <w:rPr>
+                <w:b/>
+                <w:sz w:val="24"/>
+                <w:szCs w:val="24"/>
+              </w:rPr>
+              <w:t xml:space="preserve">Percentage</w:t>
+            </w:r>
+          </w:p>
+        </w:tc>
+      </w:tr>
+      <w:tr>
+        <w:tblPrEx>
+          <w:shd w:val="clear" w:color="auto" w:fill="ced7e7"/>
+        </w:tblPrEx>
+        <w:trPr>
+          <w:trHeight w:val="251" w:hRule="atLeast"/>
+        </w:trPr>
+        <w:tc>
+          <w:tcPr>
+            <w:tcW w:type="dxa" w:w="5509"/>
+            <w:tcBorders>
+              <w:top w:val="single" w:color="000000" w:sz="8" w:space="0" w:shadow="0" w:frame="0"/>
+              <w:left w:val="single" w:color="000000" w:sz="8" w:space="0" w:shadow="0" w:frame="0"/>
+              <w:bottom w:val="single" w:color="000000" w:sz="8" w:space="0" w:shadow="0" w:frame="0"/>
+              <w:right w:val="single" w:color="000000" w:sz="8" w:space="0" w:shadow="0" w:frame="0"/>
+            </w:tcBorders>
+            <w:shd w:val="clear" w:color="auto" w:fill="auto"/>
+            <w:tcMar>
+              <w:top w:type="dxa" w:w="80"/>
+              <w:left w:type="dxa" w:w="80"/>
+              <w:bottom w:type="dxa" w:w="80"/>
+              <w:right w:type="dxa" w:w="80"/>
+            </w:tcMar>
+            <w:vAlign w:val="top"/>
+          </w:tcPr>
+          <w:p>
+            <w:pPr>
+              <w:pStyle w:val="Body"/>
+            </w:pPr>
+            <w:r>
+              <w:t xml:space="preserve">{#husbandCharitable}{charityName}</w:t>
+            </w:r>
+          </w:p>
+        </w:tc>
+        <w:tc>
+          <w:tcPr>
+            <w:tcW w:type="dxa" w:w="5509"/>
+            <w:tcBorders>
+              <w:top w:val="single" w:color="000000" w:sz="8" w:space="0" w:shadow="0" w:frame="0"/>
+              <w:left w:val="single" w:color="000000" w:sz="8" w:space="0" w:shadow="0" w:frame="0"/>
+              <w:bottom w:val="single" w:color="000000" w:sz="8" w:space="0" w:shadow="0" w:frame="0"/>
+              <w:right w:val="single" w:color="000000" w:sz="8" w:space="0" w:shadow="0" w:frame="0"/>
+            </w:tcBorders>
+            <w:shd w:val="clear" w:color="auto" w:fill="auto"/>
+            <w:tcMar>
+              <w:top w:type="dxa" w:w="80"/>
+              <w:left w:type="dxa" w:w="80"/>
+              <w:bottom w:type="dxa" w:w="80"/>
+              <w:right w:type="dxa" w:w="80"/>
+            </w:tcMar>
+            <w:vAlign w:val="top"/>
+          </w:tcPr>
+          <w:p>
+            <w:pPr>
+              <w:pStyle w:val="Body"/>
+            </w:pPr>
+            <w:r>
+              <w:t xml:space="preserve">{percentage}%{/husbandCharitable}</w:t>
+            </w:r>
+          </w:p>
+        </w:tc>
+      </w:tr>
+    </w:tbl>
+    <w:p>
+      <w:pPr>
+        <w:pStyle w:val="Body"/>
+      </w:pPr>
+      <w:r>
+        <w:t xml:space="preserve">{/hasHusbandCharitable}</w:t>
       </w:r>
     </w:p>
     <w:p>
       <w:pPr>
         <w:pStyle w:val="Body"/>
-        <w:tabs>
-          <w:tab w:val="left" w:pos="960"/>
-        </w:tabs>
-        <w:spacing w:before="71" w:line="304" w:lineRule="auto"/>
-        <w:ind w:right="474"/>
-        <w:rPr>
-          <w:outline w:val="0"/>
-          <w:color w:val="030303"/>
-          <w:sz w:val="27"/>
-          <w:szCs w:val="27"/>
-          <w:u w:color="030303"/>
-          <w14:textFill>
-            <w14:solidFill>
-              <w14:srgbClr w14:val="030303"/>
-            </w14:solidFill>
-          </w14:textFill>
-        </w:rPr>
       </w:pPr>
       <w:r>
-        <w:rPr>
-          <w:outline w:val="0"/>
-          <w:color w:val="030303"/>
-          <w:sz w:val="27"/>
-          <w:szCs w:val="27"/>
-          <w:u w:color="030303"/>
-          <w:rtl w:val="0"/>
-          <w:lang w:val="en-US"/>
-          <w14:textFill>
-            <w14:solidFill>
-              <w14:srgbClr w14:val="030303"/>
-            </w14:solidFill>
-          </w14:textFill>
-        </w:rPr>
-        <w:tab/>
-        <w:t>Husband has made no charitable bequests under this Article</w:t>
+        <w:t xml:space="preserve">{^hasHusbandCharitable}</w:t>
       </w:r>
     </w:p>
     <w:p>
       <w:pPr>
         <w:pStyle w:val="Body"/>
-        <w:tabs>
-          <w:tab w:val="left" w:pos="960"/>
-        </w:tabs>
-        <w:spacing w:before="71" w:line="304" w:lineRule="auto"/>
-        <w:ind w:right="474"/>
-        <w:rPr>
-          <w:outline w:val="0"/>
-          <w:color w:val="030303"/>
-          <w:sz w:val="27"/>
-          <w:szCs w:val="27"/>
-          <w:u w:color="030303"/>
-          <w14:textFill>
-            <w14:solidFill>
-              <w14:srgbClr w14:val="030303"/>
-            </w14:solidFill>
-          </w14:textFill>
-        </w:rPr>
       </w:pPr>
       <w:r>
-        <w:rPr>
-          <w:outline w:val="0"/>
-          <w:color w:val="030303"/>
-          <w:sz w:val="27"/>
-          <w:szCs w:val="27"/>
-          <w:u w:color="030303"/>
-          <w:rtl w:val="0"/>
-          <w:lang w:val="en-US"/>
-          <w14:textFill>
-            <w14:solidFill>
-              <w14:srgbClr w14:val="030303"/>
-            </w14:solidFill>
-          </w14:textFill>
-        </w:rPr>
-        <w:t>{/husbandCharitable}</w:t>
+        <w:t xml:space="preserve">Husband has made no charitable bequests under this Article</w:t>
       </w:r>
     </w:p>
     <w:p>
       <w:pPr>
         <w:pStyle w:val="Body"/>
-        <w:tabs>
-          <w:tab w:val="left" w:pos="960"/>
-        </w:tabs>
-        <w:spacing w:before="71" w:line="304" w:lineRule="auto"/>
-        <w:ind w:right="474"/>
-        <w:rPr>
-          <w:outline w:val="0"/>
-          <w:color w:val="030303"/>
-          <w:sz w:val="27"/>
-          <w:szCs w:val="27"/>
-          <w:u w:color="030303"/>
-          <w14:textFill>
-            <w14:solidFill>
-              <w14:srgbClr w14:val="030303"/>
-            </w14:solidFill>
-          </w14:textFill>
-        </w:rPr>
       </w:pPr>
+      <w:r>
+        <w:t xml:space="preserve">{/hasHusbandCharitable}</w:t>
+      </w:r>
     </w:p>
     <w:p>
       <w:pPr>
         <w:pStyle w:val="Body"/>
-        <w:tabs>
-          <w:tab w:val="left" w:pos="960"/>
-        </w:tabs>
-        <w:spacing w:before="71" w:line="304" w:lineRule="auto"/>
-        <w:ind w:right="474"/>
-        <w:rPr>
-          <w:outline w:val="0"/>
-          <w:color w:val="030303"/>
-          <w:sz w:val="27"/>
-          <w:szCs w:val="27"/>
-          <w:u w:color="030303"/>
-          <w14:textFill>
-            <w14:solidFill>
-              <w14:srgbClr w14:val="030303"/>
-            </w14:solidFill>
-          </w14:textFill>
-        </w:rPr>
       </w:pPr>
       <w:r>
-        <w:rPr>
-          <w:outline w:val="0"/>
-          <w:color w:val="030303"/>
-          <w:sz w:val="27"/>
-          <w:szCs w:val="27"/>
-          <w:u w:color="030303"/>
-          <w:rtl w:val="0"/>
-          <w:lang w:val="en-US"/>
-          <w14:textFill>
-            <w14:solidFill>
-              <w14:srgbClr w14:val="030303"/>
-            </w14:solidFill>
-          </w14:textFill>
-        </w:rPr>
-        <w:tab/>
-        <w:t>{:table husbandCharitable}</w:t>
+        <w:t xml:space="preserve"/>
       </w:r>
     </w:p>
     <w:p>
       <w:pPr>
         <w:pStyle w:val="Body"/>
-        <w:tabs>
-          <w:tab w:val="left" w:pos="960"/>
-        </w:tabs>
-        <w:spacing w:before="71" w:line="304" w:lineRule="auto"/>
-        <w:ind w:right="474"/>
-        <w:rPr>
-          <w:outline w:val="0"/>
-          <w:color w:val="030303"/>
-          <w:sz w:val="27"/>
-          <w:szCs w:val="27"/>
-          <w:u w:color="030303"/>
-          <w14:textFill>
-            <w14:solidFill>
-              <w14:srgbClr w14:val="030303"/>
-            </w14:solidFill>
-          </w14:textFill>
-        </w:rPr>
       </w:pPr>
+      <w:r>
+        <w:t xml:space="preserve">{#hasHusbandNonCharitable}</w:t>
+      </w:r>
+    </w:p>
+    <w:tbl>
+      <w:tblPr>
+        <w:tblW w:w="11018" w:type="dxa"/>
+        <w:jc w:val="left"/>
+        <w:tblInd w:w="609" w:type="dxa"/>
+        <w:tblBorders>
+          <w:top w:val="single" w:color="ffffff" w:sz="8" w:space="0" w:shadow="0" w:frame="0"/>
+          <w:left w:val="single" w:color="ffffff" w:sz="8" w:space="0" w:shadow="0" w:frame="0"/>
+          <w:bottom w:val="single" w:color="ffffff" w:sz="8" w:space="0" w:shadow="0" w:frame="0"/>
+          <w:right w:val="single" w:color="ffffff" w:sz="8" w:space="0" w:shadow="0" w:frame="0"/>
+          <w:insideH w:val="single" w:color="ffffff" w:sz="8" w:space="0" w:shadow="0" w:frame="0"/>
+          <w:insideV w:val="single" w:color="ffffff" w:sz="8" w:space="0" w:shadow="0" w:frame="0"/>
+        </w:tblBorders>
+        <w:shd w:val="clear" w:color="auto" w:fill="ced7e7"/>
+        <w:tblLayout w:type="fixed"/>
+      </w:tblPr>
+      <w:tblGrid>
+        <w:gridCol w:w="3673"/>
+        <w:gridCol w:w="3673"/>
+        <w:gridCol w:w="3672"/>
+      </w:tblGrid>
+      <w:tr>
+        <w:tblPrEx>
+          <w:shd w:val="clear" w:color="auto" w:fill="ced7e7"/>
+        </w:tblPrEx>
+        <w:trPr>
+          <w:trHeight w:val="310" w:hRule="atLeast"/>
+        </w:trPr>
+        <w:tc>
+          <w:tcPr>
+            <w:tcW w:type="dxa" w:w="3673"/>
+            <w:tcBorders>
+              <w:top w:val="single" w:color="000000" w:sz="8" w:space="0" w:shadow="0" w:frame="0"/>
+              <w:left w:val="single" w:color="000000" w:sz="8" w:space="0" w:shadow="0" w:frame="0"/>
+              <w:bottom w:val="single" w:color="000000" w:sz="8" w:space="0" w:shadow="0" w:frame="0"/>
+              <w:right w:val="single" w:color="000000" w:sz="8" w:space="0" w:shadow="0" w:frame="0"/>
+            </w:tcBorders>
+            <w:shd w:val="clear" w:color="auto" w:fill="auto"/>
+            <w:tcMar>
+              <w:top w:type="dxa" w:w="80"/>
+              <w:left w:type="dxa" w:w="577"/>
+              <w:bottom w:type="dxa" w:w="80"/>
+              <w:right w:type="dxa" w:w="80"/>
+            </w:tcMar>
+            <w:vAlign w:val="top"/>
+          </w:tcPr>
+          <w:p>
+            <w:pPr>
+              <w:pStyle w:val="Body"/>
+            </w:pPr>
+            <w:r>
+              <w:rPr>
+                <w:b/>
+                <w:sz w:val="24"/>
+                <w:szCs w:val="24"/>
+              </w:rPr>
+              <w:t xml:space="preserve">Recipient</w:t>
+            </w:r>
+          </w:p>
+        </w:tc>
+        <w:tc>
+          <w:tcPr>
+            <w:tcW w:type="dxa" w:w="3673"/>
+            <w:tcBorders>
+              <w:top w:val="single" w:color="000000" w:sz="8" w:space="0" w:shadow="0" w:frame="0"/>
+              <w:left w:val="single" w:color="000000" w:sz="8" w:space="0" w:shadow="0" w:frame="0"/>
+              <w:bottom w:val="single" w:color="000000" w:sz="8" w:space="0" w:shadow="0" w:frame="0"/>
+              <w:right w:val="single" w:color="000000" w:sz="8" w:space="0" w:shadow="0" w:frame="0"/>
+            </w:tcBorders>
+            <w:shd w:val="clear" w:color="auto" w:fill="auto"/>
+            <w:tcMar>
+              <w:top w:type="dxa" w:w="80"/>
+              <w:left w:type="dxa" w:w="577"/>
+              <w:bottom w:type="dxa" w:w="80"/>
+              <w:right w:type="dxa" w:w="80"/>
+            </w:tcMar>
+            <w:vAlign w:val="top"/>
+          </w:tcPr>
+          <w:p>
+            <w:pPr>
+              <w:pStyle w:val="Body"/>
+            </w:pPr>
+            <w:r>
+              <w:rPr>
+                <w:b/>
+                <w:sz w:val="24"/>
+                <w:szCs w:val="24"/>
+              </w:rPr>
+              <w:t xml:space="preserve">Relationship</w:t>
+            </w:r>
+          </w:p>
+        </w:tc>
+        <w:tc>
+          <w:tcPr>
+            <w:tcW w:type="dxa" w:w="3672"/>
+            <w:tcBorders>
+              <w:top w:val="single" w:color="000000" w:sz="8" w:space="0" w:shadow="0" w:frame="0"/>
+              <w:left w:val="single" w:color="000000" w:sz="8" w:space="0" w:shadow="0" w:frame="0"/>
+              <w:bottom w:val="single" w:color="000000" w:sz="8" w:space="0" w:shadow="0" w:frame="0"/>
+              <w:right w:val="single" w:color="000000" w:sz="8" w:space="0" w:shadow="0" w:frame="0"/>
+            </w:tcBorders>
+            <w:shd w:val="clear" w:color="auto" w:fill="auto"/>
+            <w:tcMar>
+              <w:top w:type="dxa" w:w="80"/>
+              <w:left w:type="dxa" w:w="577"/>
+              <w:bottom w:type="dxa" w:w="80"/>
+              <w:right w:type="dxa" w:w="80"/>
+            </w:tcMar>
+            <w:vAlign w:val="top"/>
+          </w:tcPr>
+          <w:p>
+            <w:pPr>
+              <w:pStyle w:val="Body"/>
+            </w:pPr>
+            <w:r>
+              <w:rPr>
+                <w:b/>
+                <w:sz w:val="24"/>
+                <w:szCs w:val="24"/>
+              </w:rPr>
+              <w:t xml:space="preserve">Percentage</w:t>
+            </w:r>
+          </w:p>
+        </w:tc>
+      </w:tr>
+      <w:tr>
+        <w:tblPrEx>
+          <w:shd w:val="clear" w:color="auto" w:fill="ced7e7"/>
+        </w:tblPrEx>
+        <w:trPr>
+          <w:trHeight w:val="251" w:hRule="atLeast"/>
+        </w:trPr>
+        <w:tc>
+          <w:tcPr>
+            <w:tcW w:type="dxa" w:w="3673"/>
+            <w:tcBorders>
+              <w:top w:val="single" w:color="000000" w:sz="8" w:space="0" w:shadow="0" w:frame="0"/>
+              <w:left w:val="single" w:color="000000" w:sz="8" w:space="0" w:shadow="0" w:frame="0"/>
+              <w:bottom w:val="single" w:color="000000" w:sz="8" w:space="0" w:shadow="0" w:frame="0"/>
+              <w:right w:val="single" w:color="000000" w:sz="8" w:space="0" w:shadow="0" w:frame="0"/>
+            </w:tcBorders>
+            <w:shd w:val="clear" w:color="auto" w:fill="auto"/>
+            <w:tcMar>
+              <w:top w:type="dxa" w:w="80"/>
+              <w:left w:type="dxa" w:w="80"/>
+              <w:bottom w:type="dxa" w:w="80"/>
+              <w:right w:type="dxa" w:w="80"/>
+            </w:tcMar>
+            <w:vAlign w:val="top"/>
+          </w:tcPr>
+          <w:p>
+            <w:pPr>
+              <w:pStyle w:val="Body"/>
+            </w:pPr>
+            <w:r>
+              <w:t xml:space="preserve">{#husbandNonCharitable}{recipientName}</w:t>
+            </w:r>
+          </w:p>
+        </w:tc>
+        <w:tc>
+          <w:tcPr>
+            <w:tcW w:type="dxa" w:w="3673"/>
+            <w:tcBorders>
+              <w:top w:val="single" w:color="000000" w:sz="8" w:space="0" w:shadow="0" w:frame="0"/>
+              <w:left w:val="single" w:color="000000" w:sz="8" w:space="0" w:shadow="0" w:frame="0"/>
+              <w:bottom w:val="single" w:color="000000" w:sz="8" w:space="0" w:shadow="0" w:frame="0"/>
+              <w:right w:val="single" w:color="000000" w:sz="8" w:space="0" w:shadow="0" w:frame="0"/>
+            </w:tcBorders>
+            <w:shd w:val="clear" w:color="auto" w:fill="auto"/>
+            <w:tcMar>
+              <w:top w:type="dxa" w:w="80"/>
+              <w:left w:type="dxa" w:w="80"/>
+              <w:bottom w:type="dxa" w:w="80"/>
+              <w:right w:type="dxa" w:w="80"/>
+            </w:tcMar>
+            <w:vAlign w:val="top"/>
+          </w:tcPr>
+          <w:p>
+            <w:pPr>
+              <w:pStyle w:val="Body"/>
+            </w:pPr>
+            <w:r>
+              <w:t xml:space="preserve">{relationship}</w:t>
+            </w:r>
+          </w:p>
+        </w:tc>
+        <w:tc>
+          <w:tcPr>
+            <w:tcW w:type="dxa" w:w="3672"/>
+            <w:tcBorders>
+              <w:top w:val="single" w:color="000000" w:sz="8" w:space="0" w:shadow="0" w:frame="0"/>
+              <w:left w:val="single" w:color="000000" w:sz="8" w:space="0" w:shadow="0" w:frame="0"/>
+              <w:bottom w:val="single" w:color="000000" w:sz="8" w:space="0" w:shadow="0" w:frame="0"/>
+              <w:right w:val="single" w:color="000000" w:sz="8" w:space="0" w:shadow="0" w:frame="0"/>
+            </w:tcBorders>
+            <w:shd w:val="clear" w:color="auto" w:fill="auto"/>
+            <w:tcMar>
+              <w:top w:type="dxa" w:w="80"/>
+              <w:left w:type="dxa" w:w="80"/>
+              <w:bottom w:type="dxa" w:w="80"/>
+              <w:right w:type="dxa" w:w="80"/>
+            </w:tcMar>
+            <w:vAlign w:val="top"/>
+          </w:tcPr>
+          <w:p>
+            <w:pPr>
+              <w:pStyle w:val="Body"/>
+            </w:pPr>
+            <w:r>
+              <w:t xml:space="preserve">{percentage}%{/husbandNonCharitable}</w:t>
+            </w:r>
+          </w:p>
+        </w:tc>
+      </w:tr>
+    </w:tbl>
+    <w:p>
+      <w:pPr>
+        <w:pStyle w:val="Body"/>
+      </w:pPr>
+      <w:r>
+        <w:t xml:space="preserve">{/hasHusbandNonCharitable}</w:t>
+      </w:r>
     </w:p>
     <w:p>
       <w:pPr>
         <w:pStyle w:val="Body"/>
-        <w:tabs>
-          <w:tab w:val="left" w:pos="960"/>
-        </w:tabs>
-        <w:spacing w:before="71" w:line="304" w:lineRule="auto"/>
-        <w:ind w:right="474"/>
-        <w:rPr>
-          <w:outline w:val="0"/>
-          <w:color w:val="030303"/>
-          <w:sz w:val="27"/>
-          <w:szCs w:val="27"/>
-          <w:u w:color="030303"/>
-          <w14:textFill>
-            <w14:solidFill>
-              <w14:srgbClr w14:val="030303"/>
-            </w14:solidFill>
-          </w14:textFill>
-        </w:rPr>
       </w:pPr>
       <w:r>
-        <w:rPr>
-          <w:outline w:val="0"/>
-          <w:color w:val="030303"/>
-          <w:sz w:val="27"/>
-          <w:szCs w:val="27"/>
-          <w:u w:color="030303"/>
-          <w:rtl w:val="0"/>
-          <w:lang w:val="en-US"/>
-          <w14:textFill>
-            <w14:solidFill>
-              <w14:srgbClr w14:val="030303"/>
-            </w14:solidFill>
-          </w14:textFill>
-        </w:rPr>
-        <w:tab/>
-        <w:t>{:table husbandNonCharitable}</w:t>
+        <w:t xml:space="preserve">{^hasHusbandNonCharitable}</w:t>
       </w:r>
     </w:p>
     <w:p>
       <w:pPr>
         <w:pStyle w:val="Body"/>
-        <w:tabs>
-          <w:tab w:val="left" w:pos="960"/>
-        </w:tabs>
-        <w:spacing w:before="71" w:line="304" w:lineRule="auto"/>
-        <w:ind w:right="474"/>
-        <w:rPr>
-          <w:outline w:val="0"/>
-          <w:color w:val="030303"/>
-          <w:sz w:val="27"/>
-          <w:szCs w:val="27"/>
-          <w:u w:color="030303"/>
-          <w14:textFill>
-            <w14:solidFill>
-              <w14:srgbClr w14:val="030303"/>
-            </w14:solidFill>
-          </w14:textFill>
-        </w:rPr>
       </w:pPr>
+      <w:r>
+        <w:t xml:space="preserve">Husband has made no non-charitable bequests under this Article</w:t>
+      </w:r>
+    </w:p>
+    <w:p>
+      <w:pPr>
+        <w:pStyle w:val="Body"/>
+      </w:pPr>
+      <w:r>
+        <w:t xml:space="preserve">{/hasHusbandNonCharitable}</w:t>
+      </w:r>
+    </w:p>
+    <w:p>
+      <w:pPr>
+        <w:pStyle w:val="Body"/>
+      </w:pPr>
+      <w:r>
+        <w:t xml:space="preserve"/>
+      </w:r>
     </w:p>
     <w:p>
       <w:pPr>
@@ -11332,266 +11396,468 @@
     <w:p>
       <w:pPr>
         <w:pStyle w:val="Body"/>
-        <w:tabs>
-          <w:tab w:val="left" w:pos="960"/>
-        </w:tabs>
-        <w:spacing w:before="71" w:line="304" w:lineRule="auto"/>
-        <w:ind w:right="474"/>
-        <w:rPr>
-          <w:outline w:val="0"/>
-          <w:color w:val="030303"/>
-          <w:sz w:val="27"/>
-          <w:szCs w:val="27"/>
-          <w:u w:color="030303"/>
-          <w14:textFill>
-            <w14:solidFill>
-              <w14:srgbClr w14:val="030303"/>
-            </w14:solidFill>
-          </w14:textFill>
-        </w:rPr>
       </w:pPr>
       <w:r>
-        <w:rPr>
-          <w:outline w:val="0"/>
-          <w:color w:val="030303"/>
-          <w:sz w:val="27"/>
-          <w:szCs w:val="27"/>
-          <w:u w:color="030303"/>
-          <w:rtl w:val="0"/>
-          <w:lang w:val="en-US"/>
-          <w14:textFill>
-            <w14:solidFill>
-              <w14:srgbClr w14:val="030303"/>
-            </w14:solidFill>
-          </w14:textFill>
-        </w:rPr>
-        <w:t>{^wifeCharitable}</w:t>
+        <w:t xml:space="preserve">{#hasWifeCharitable}</w:t>
+      </w:r>
+    </w:p>
+    <w:tbl>
+      <w:tblPr>
+        <w:tblW w:w="11018" w:type="dxa"/>
+        <w:jc w:val="left"/>
+        <w:tblInd w:w="609" w:type="dxa"/>
+        <w:tblBorders>
+          <w:top w:val="single" w:color="ffffff" w:sz="8" w:space="0" w:shadow="0" w:frame="0"/>
+          <w:left w:val="single" w:color="ffffff" w:sz="8" w:space="0" w:shadow="0" w:frame="0"/>
+          <w:bottom w:val="single" w:color="ffffff" w:sz="8" w:space="0" w:shadow="0" w:frame="0"/>
+          <w:right w:val="single" w:color="ffffff" w:sz="8" w:space="0" w:shadow="0" w:frame="0"/>
+          <w:insideH w:val="single" w:color="ffffff" w:sz="8" w:space="0" w:shadow="0" w:frame="0"/>
+          <w:insideV w:val="single" w:color="ffffff" w:sz="8" w:space="0" w:shadow="0" w:frame="0"/>
+        </w:tblBorders>
+        <w:shd w:val="clear" w:color="auto" w:fill="ced7e7"/>
+        <w:tblLayout w:type="fixed"/>
+      </w:tblPr>
+      <w:tblGrid>
+        <w:gridCol w:w="5509"/>
+        <w:gridCol w:w="5509"/>
+      </w:tblGrid>
+      <w:tr>
+        <w:tblPrEx>
+          <w:shd w:val="clear" w:color="auto" w:fill="ced7e7"/>
+        </w:tblPrEx>
+        <w:trPr>
+          <w:trHeight w:val="310" w:hRule="atLeast"/>
+        </w:trPr>
+        <w:tc>
+          <w:tcPr>
+            <w:tcW w:type="dxa" w:w="5509"/>
+            <w:tcBorders>
+              <w:top w:val="single" w:color="000000" w:sz="8" w:space="0" w:shadow="0" w:frame="0"/>
+              <w:left w:val="single" w:color="000000" w:sz="8" w:space="0" w:shadow="0" w:frame="0"/>
+              <w:bottom w:val="single" w:color="000000" w:sz="8" w:space="0" w:shadow="0" w:frame="0"/>
+              <w:right w:val="single" w:color="000000" w:sz="8" w:space="0" w:shadow="0" w:frame="0"/>
+            </w:tcBorders>
+            <w:shd w:val="clear" w:color="auto" w:fill="auto"/>
+            <w:tcMar>
+              <w:top w:type="dxa" w:w="80"/>
+              <w:left w:type="dxa" w:w="577"/>
+              <w:bottom w:type="dxa" w:w="80"/>
+              <w:right w:type="dxa" w:w="80"/>
+            </w:tcMar>
+            <w:vAlign w:val="top"/>
+          </w:tcPr>
+          <w:p>
+            <w:pPr>
+              <w:pStyle w:val="Body"/>
+            </w:pPr>
+            <w:r>
+              <w:rPr>
+                <w:b/>
+                <w:sz w:val="24"/>
+                <w:szCs w:val="24"/>
+              </w:rPr>
+              <w:t xml:space="preserve">Charity</w:t>
+            </w:r>
+          </w:p>
+        </w:tc>
+        <w:tc>
+          <w:tcPr>
+            <w:tcW w:type="dxa" w:w="5509"/>
+            <w:tcBorders>
+              <w:top w:val="single" w:color="000000" w:sz="8" w:space="0" w:shadow="0" w:frame="0"/>
+              <w:left w:val="single" w:color="000000" w:sz="8" w:space="0" w:shadow="0" w:frame="0"/>
+              <w:bottom w:val="single" w:color="000000" w:sz="8" w:space="0" w:shadow="0" w:frame="0"/>
+              <w:right w:val="single" w:color="000000" w:sz="8" w:space="0" w:shadow="0" w:frame="0"/>
+            </w:tcBorders>
+            <w:shd w:val="clear" w:color="auto" w:fill="auto"/>
+            <w:tcMar>
+              <w:top w:type="dxa" w:w="80"/>
+              <w:left w:type="dxa" w:w="577"/>
+              <w:bottom w:type="dxa" w:w="80"/>
+              <w:right w:type="dxa" w:w="80"/>
+            </w:tcMar>
+            <w:vAlign w:val="top"/>
+          </w:tcPr>
+          <w:p>
+            <w:pPr>
+              <w:pStyle w:val="Body"/>
+            </w:pPr>
+            <w:r>
+              <w:rPr>
+                <w:b/>
+                <w:sz w:val="24"/>
+                <w:szCs w:val="24"/>
+              </w:rPr>
+              <w:t xml:space="preserve">Percentage</w:t>
+            </w:r>
+          </w:p>
+        </w:tc>
+      </w:tr>
+      <w:tr>
+        <w:tblPrEx>
+          <w:shd w:val="clear" w:color="auto" w:fill="ced7e7"/>
+        </w:tblPrEx>
+        <w:trPr>
+          <w:trHeight w:val="251" w:hRule="atLeast"/>
+        </w:trPr>
+        <w:tc>
+          <w:tcPr>
+            <w:tcW w:type="dxa" w:w="5509"/>
+            <w:tcBorders>
+              <w:top w:val="single" w:color="000000" w:sz="8" w:space="0" w:shadow="0" w:frame="0"/>
+              <w:left w:val="single" w:color="000000" w:sz="8" w:space="0" w:shadow="0" w:frame="0"/>
+              <w:bottom w:val="single" w:color="000000" w:sz="8" w:space="0" w:shadow="0" w:frame="0"/>
+              <w:right w:val="single" w:color="000000" w:sz="8" w:space="0" w:shadow="0" w:frame="0"/>
+            </w:tcBorders>
+            <w:shd w:val="clear" w:color="auto" w:fill="auto"/>
+            <w:tcMar>
+              <w:top w:type="dxa" w:w="80"/>
+              <w:left w:type="dxa" w:w="80"/>
+              <w:bottom w:type="dxa" w:w="80"/>
+              <w:right w:type="dxa" w:w="80"/>
+            </w:tcMar>
+            <w:vAlign w:val="top"/>
+          </w:tcPr>
+          <w:p>
+            <w:pPr>
+              <w:pStyle w:val="Body"/>
+            </w:pPr>
+            <w:r>
+              <w:t xml:space="preserve">{#wifeCharitable}{charityName}</w:t>
+            </w:r>
+          </w:p>
+        </w:tc>
+        <w:tc>
+          <w:tcPr>
+            <w:tcW w:type="dxa" w:w="5509"/>
+            <w:tcBorders>
+              <w:top w:val="single" w:color="000000" w:sz="8" w:space="0" w:shadow="0" w:frame="0"/>
+              <w:left w:val="single" w:color="000000" w:sz="8" w:space="0" w:shadow="0" w:frame="0"/>
+              <w:bottom w:val="single" w:color="000000" w:sz="8" w:space="0" w:shadow="0" w:frame="0"/>
+              <w:right w:val="single" w:color="000000" w:sz="8" w:space="0" w:shadow="0" w:frame="0"/>
+            </w:tcBorders>
+            <w:shd w:val="clear" w:color="auto" w:fill="auto"/>
+            <w:tcMar>
+              <w:top w:type="dxa" w:w="80"/>
+              <w:left w:type="dxa" w:w="80"/>
+              <w:bottom w:type="dxa" w:w="80"/>
+              <w:right w:type="dxa" w:w="80"/>
+            </w:tcMar>
+            <w:vAlign w:val="top"/>
+          </w:tcPr>
+          <w:p>
+            <w:pPr>
+              <w:pStyle w:val="Body"/>
+            </w:pPr>
+            <w:r>
+              <w:t xml:space="preserve">{percentage}%{/wifeCharitable}</w:t>
+            </w:r>
+          </w:p>
+        </w:tc>
+      </w:tr>
+    </w:tbl>
+    <w:p>
+      <w:pPr>
+        <w:pStyle w:val="Body"/>
+      </w:pPr>
+      <w:r>
+        <w:t xml:space="preserve">{/hasWifeCharitable}</w:t>
       </w:r>
     </w:p>
     <w:p>
       <w:pPr>
         <w:pStyle w:val="Body"/>
-        <w:tabs>
-          <w:tab w:val="left" w:pos="960"/>
-        </w:tabs>
-        <w:spacing w:before="71" w:line="304" w:lineRule="auto"/>
-        <w:ind w:right="474"/>
-        <w:rPr>
-          <w:outline w:val="0"/>
-          <w:color w:val="030303"/>
-          <w:sz w:val="27"/>
-          <w:szCs w:val="27"/>
-          <w:u w:color="030303"/>
-          <w14:textFill>
-            <w14:solidFill>
-              <w14:srgbClr w14:val="030303"/>
-            </w14:solidFill>
-          </w14:textFill>
-        </w:rPr>
       </w:pPr>
       <w:r>
-        <w:rPr>
-          <w:outline w:val="0"/>
-          <w:color w:val="030303"/>
-          <w:sz w:val="27"/>
-          <w:szCs w:val="27"/>
-          <w:u w:color="030303"/>
-          <w:rtl w:val="0"/>
-          <w:lang w:val="en-US"/>
-          <w14:textFill>
-            <w14:solidFill>
-              <w14:srgbClr w14:val="030303"/>
-            </w14:solidFill>
-          </w14:textFill>
-        </w:rPr>
-        <w:tab/>
-        <w:t>Wife has made no charitable bequests under this Article</w:t>
+        <w:t xml:space="preserve">{^hasWifeCharitable}</w:t>
       </w:r>
     </w:p>
     <w:p>
       <w:pPr>
         <w:pStyle w:val="Body"/>
-        <w:tabs>
-          <w:tab w:val="left" w:pos="960"/>
-        </w:tabs>
-        <w:spacing w:before="71" w:line="304" w:lineRule="auto"/>
-        <w:ind w:right="474"/>
-        <w:rPr>
-          <w:outline w:val="0"/>
-          <w:color w:val="030303"/>
-          <w:sz w:val="27"/>
-          <w:szCs w:val="27"/>
-          <w:u w:color="030303"/>
-          <w14:textFill>
-            <w14:solidFill>
-              <w14:srgbClr w14:val="030303"/>
-            </w14:solidFill>
-          </w14:textFill>
-        </w:rPr>
       </w:pPr>
       <w:r>
-        <w:rPr>
-          <w:outline w:val="0"/>
-          <w:color w:val="030303"/>
-          <w:sz w:val="27"/>
-          <w:szCs w:val="27"/>
-          <w:u w:color="030303"/>
-          <w:rtl w:val="0"/>
-          <w:lang w:val="en-US"/>
-          <w14:textFill>
-            <w14:solidFill>
-              <w14:srgbClr w14:val="030303"/>
-            </w14:solidFill>
-          </w14:textFill>
-        </w:rPr>
-        <w:t>{/wifeCharitable}</w:t>
+        <w:t xml:space="preserve">Wife has made no charitable bequests under this Article</w:t>
       </w:r>
     </w:p>
     <w:p>
       <w:pPr>
         <w:pStyle w:val="Body"/>
-        <w:tabs>
-          <w:tab w:val="left" w:pos="960"/>
-        </w:tabs>
-        <w:spacing w:before="71" w:line="304" w:lineRule="auto"/>
-        <w:ind w:right="474"/>
-        <w:rPr>
-          <w:outline w:val="0"/>
-          <w:color w:val="030303"/>
-          <w:sz w:val="27"/>
-          <w:szCs w:val="27"/>
-          <w:u w:color="030303"/>
-          <w14:textFill>
-            <w14:solidFill>
-              <w14:srgbClr w14:val="030303"/>
-            </w14:solidFill>
-          </w14:textFill>
-        </w:rPr>
       </w:pPr>
+      <w:r>
+        <w:t xml:space="preserve">{/hasWifeCharitable}</w:t>
+      </w:r>
     </w:p>
     <w:p>
       <w:pPr>
         <w:pStyle w:val="Body"/>
-        <w:tabs>
-          <w:tab w:val="left" w:pos="960"/>
-        </w:tabs>
-        <w:spacing w:before="71" w:line="304" w:lineRule="auto"/>
-        <w:ind w:right="474"/>
-        <w:rPr>
-          <w:outline w:val="0"/>
-          <w:color w:val="030303"/>
-          <w:sz w:val="27"/>
-          <w:szCs w:val="27"/>
-          <w:u w:color="030303"/>
-          <w14:textFill>
-            <w14:solidFill>
-              <w14:srgbClr w14:val="030303"/>
-            </w14:solidFill>
-          </w14:textFill>
-        </w:rPr>
       </w:pPr>
       <w:r>
-        <w:rPr>
-          <w:outline w:val="0"/>
-          <w:color w:val="030303"/>
-          <w:sz w:val="27"/>
-          <w:szCs w:val="27"/>
-          <w:u w:color="030303"/>
-          <w:rtl w:val="0"/>
-          <w:lang w:val="en-US"/>
-          <w14:textFill>
-            <w14:solidFill>
-              <w14:srgbClr w14:val="030303"/>
-            </w14:solidFill>
-          </w14:textFill>
-        </w:rPr>
-        <w:tab/>
-        <w:t>{:table wifeCharitable}</w:t>
+        <w:t xml:space="preserve"/>
       </w:r>
     </w:p>
     <w:p>
       <w:pPr>
         <w:pStyle w:val="Body"/>
-        <w:tabs>
-          <w:tab w:val="left" w:pos="960"/>
-        </w:tabs>
-        <w:spacing w:before="71" w:line="304" w:lineRule="auto"/>
-        <w:ind w:right="474"/>
-        <w:rPr>
-          <w:outline w:val="0"/>
-          <w:color w:val="030303"/>
-          <w:sz w:val="27"/>
-          <w:szCs w:val="27"/>
-          <w:u w:color="030303"/>
-          <w14:textFill>
-            <w14:solidFill>
-              <w14:srgbClr w14:val="030303"/>
-            </w14:solidFill>
-          </w14:textFill>
-        </w:rPr>
       </w:pPr>
+      <w:r>
+        <w:t xml:space="preserve">{#hasWifeNonCharitable}</w:t>
+      </w:r>
+    </w:p>
+    <w:tbl>
+      <w:tblPr>
+        <w:tblW w:w="11018" w:type="dxa"/>
+        <w:jc w:val="left"/>
+        <w:tblInd w:w="609" w:type="dxa"/>
+        <w:tblBorders>
+          <w:top w:val="single" w:color="ffffff" w:sz="8" w:space="0" w:shadow="0" w:frame="0"/>
+          <w:left w:val="single" w:color="ffffff" w:sz="8" w:space="0" w:shadow="0" w:frame="0"/>
+          <w:bottom w:val="single" w:color="ffffff" w:sz="8" w:space="0" w:shadow="0" w:frame="0"/>
+          <w:right w:val="single" w:color="ffffff" w:sz="8" w:space="0" w:shadow="0" w:frame="0"/>
+          <w:insideH w:val="single" w:color="ffffff" w:sz="8" w:space="0" w:shadow="0" w:frame="0"/>
+          <w:insideV w:val="single" w:color="ffffff" w:sz="8" w:space="0" w:shadow="0" w:frame="0"/>
+        </w:tblBorders>
+        <w:shd w:val="clear" w:color="auto" w:fill="ced7e7"/>
+        <w:tblLayout w:type="fixed"/>
+      </w:tblPr>
+      <w:tblGrid>
+        <w:gridCol w:w="3673"/>
+        <w:gridCol w:w="3673"/>
+        <w:gridCol w:w="3672"/>
+      </w:tblGrid>
+      <w:tr>
+        <w:tblPrEx>
+          <w:shd w:val="clear" w:color="auto" w:fill="ced7e7"/>
+        </w:tblPrEx>
+        <w:trPr>
+          <w:trHeight w:val="310" w:hRule="atLeast"/>
+        </w:trPr>
+        <w:tc>
+          <w:tcPr>
+            <w:tcW w:type="dxa" w:w="3673"/>
+            <w:tcBorders>
+              <w:top w:val="single" w:color="000000" w:sz="8" w:space="0" w:shadow="0" w:frame="0"/>
+              <w:left w:val="single" w:color="000000" w:sz="8" w:space="0" w:shadow="0" w:frame="0"/>
+              <w:bottom w:val="single" w:color="000000" w:sz="8" w:space="0" w:shadow="0" w:frame="0"/>
+              <w:right w:val="single" w:color="000000" w:sz="8" w:space="0" w:shadow="0" w:frame="0"/>
+            </w:tcBorders>
+            <w:shd w:val="clear" w:color="auto" w:fill="auto"/>
+            <w:tcMar>
+              <w:top w:type="dxa" w:w="80"/>
+              <w:left w:type="dxa" w:w="577"/>
+              <w:bottom w:type="dxa" w:w="80"/>
+              <w:right w:type="dxa" w:w="80"/>
+            </w:tcMar>
+            <w:vAlign w:val="top"/>
+          </w:tcPr>
+          <w:p>
+            <w:pPr>
+              <w:pStyle w:val="Body"/>
+            </w:pPr>
+            <w:r>
+              <w:rPr>
+                <w:b/>
+                <w:sz w:val="24"/>
+                <w:szCs w:val="24"/>
+              </w:rPr>
+              <w:t xml:space="preserve">Recipient</w:t>
+            </w:r>
+          </w:p>
+        </w:tc>
+        <w:tc>
+          <w:tcPr>
+            <w:tcW w:type="dxa" w:w="3673"/>
+            <w:tcBorders>
+              <w:top w:val="single" w:color="000000" w:sz="8" w:space="0" w:shadow="0" w:frame="0"/>
+              <w:left w:val="single" w:color="000000" w:sz="8" w:space="0" w:shadow="0" w:frame="0"/>
+              <w:bottom w:val="single" w:color="000000" w:sz="8" w:space="0" w:shadow="0" w:frame="0"/>
+              <w:right w:val="single" w:color="000000" w:sz="8" w:space="0" w:shadow="0" w:frame="0"/>
+            </w:tcBorders>
+            <w:shd w:val="clear" w:color="auto" w:fill="auto"/>
+            <w:tcMar>
+              <w:top w:type="dxa" w:w="80"/>
+              <w:left w:type="dxa" w:w="577"/>
+              <w:bottom w:type="dxa" w:w="80"/>
+              <w:right w:type="dxa" w:w="80"/>
+            </w:tcMar>
+            <w:vAlign w:val="top"/>
+          </w:tcPr>
+          <w:p>
+            <w:pPr>
+              <w:pStyle w:val="Body"/>
+            </w:pPr>
+            <w:r>
+              <w:rPr>
+                <w:b/>
+                <w:sz w:val="24"/>
+                <w:szCs w:val="24"/>
+              </w:rPr>
+              <w:t xml:space="preserve">Relationship</w:t>
+            </w:r>
+          </w:p>
+        </w:tc>
+        <w:tc>
+          <w:tcPr>
+            <w:tcW w:type="dxa" w:w="3672"/>
+            <w:tcBorders>
+              <w:top w:val="single" w:color="000000" w:sz="8" w:space="0" w:shadow="0" w:frame="0"/>
+              <w:left w:val="single" w:color="000000" w:sz="8" w:space="0" w:shadow="0" w:frame="0"/>
+              <w:bottom w:val="single" w:color="000000" w:sz="8" w:space="0" w:shadow="0" w:frame="0"/>
+              <w:right w:val="single" w:color="000000" w:sz="8" w:space="0" w:shadow="0" w:frame="0"/>
+            </w:tcBorders>
+            <w:shd w:val="clear" w:color="auto" w:fill="auto"/>
+            <w:tcMar>
+              <w:top w:type="dxa" w:w="80"/>
+              <w:left w:type="dxa" w:w="577"/>
+              <w:bottom w:type="dxa" w:w="80"/>
+              <w:right w:type="dxa" w:w="80"/>
+            </w:tcMar>
+            <w:vAlign w:val="top"/>
+          </w:tcPr>
+          <w:p>
+            <w:pPr>
+              <w:pStyle w:val="Body"/>
+            </w:pPr>
+            <w:r>
+              <w:rPr>
+                <w:b/>
+                <w:sz w:val="24"/>
+                <w:szCs w:val="24"/>
+              </w:rPr>
+              <w:t xml:space="preserve">Percentage</w:t>
+            </w:r>
+          </w:p>
+        </w:tc>
+      </w:tr>
+      <w:tr>
+        <w:tblPrEx>
+          <w:shd w:val="clear" w:color="auto" w:fill="ced7e7"/>
+        </w:tblPrEx>
+        <w:trPr>
+          <w:trHeight w:val="251" w:hRule="atLeast"/>
+        </w:trPr>
+        <w:tc>
+          <w:tcPr>
+            <w:tcW w:type="dxa" w:w="3673"/>
+            <w:tcBorders>
+              <w:top w:val="single" w:color="000000" w:sz="8" w:space="0" w:shadow="0" w:frame="0"/>
+              <w:left w:val="single" w:color="000000" w:sz="8" w:space="0" w:shadow="0" w:frame="0"/>
+              <w:bottom w:val="single" w:color="000000" w:sz="8" w:space="0" w:shadow="0" w:frame="0"/>
+              <w:right w:val="single" w:color="000000" w:sz="8" w:space="0" w:shadow="0" w:frame="0"/>
+            </w:tcBorders>
+            <w:shd w:val="clear" w:color="auto" w:fill="auto"/>
+            <w:tcMar>
+              <w:top w:type="dxa" w:w="80"/>
+              <w:left w:type="dxa" w:w="80"/>
+              <w:bottom w:type="dxa" w:w="80"/>
+              <w:right w:type="dxa" w:w="80"/>
+            </w:tcMar>
+            <w:vAlign w:val="top"/>
+          </w:tcPr>
+          <w:p>
+            <w:pPr>
+              <w:pStyle w:val="Body"/>
+            </w:pPr>
+            <w:r>
+              <w:t xml:space="preserve">{#wifeNonCharitable}{recipientName}</w:t>
+            </w:r>
+          </w:p>
+        </w:tc>
+        <w:tc>
+          <w:tcPr>
+            <w:tcW w:type="dxa" w:w="3673"/>
+            <w:tcBorders>
+              <w:top w:val="single" w:color="000000" w:sz="8" w:space="0" w:shadow="0" w:frame="0"/>
+              <w:left w:val="single" w:color="000000" w:sz="8" w:space="0" w:shadow="0" w:frame="0"/>
+              <w:bottom w:val="single" w:color="000000" w:sz="8" w:space="0" w:shadow="0" w:frame="0"/>
+              <w:right w:val="single" w:color="000000" w:sz="8" w:space="0" w:shadow="0" w:frame="0"/>
+            </w:tcBorders>
+            <w:shd w:val="clear" w:color="auto" w:fill="auto"/>
+            <w:tcMar>
+              <w:top w:type="dxa" w:w="80"/>
+              <w:left w:type="dxa" w:w="80"/>
+              <w:bottom w:type="dxa" w:w="80"/>
+              <w:right w:type="dxa" w:w="80"/>
+            </w:tcMar>
+            <w:vAlign w:val="top"/>
+          </w:tcPr>
+          <w:p>
+            <w:pPr>
+              <w:pStyle w:val="Body"/>
+            </w:pPr>
+            <w:r>
+              <w:t xml:space="preserve">{relationship}</w:t>
+            </w:r>
+          </w:p>
+        </w:tc>
+        <w:tc>
+          <w:tcPr>
+            <w:tcW w:type="dxa" w:w="3672"/>
+            <w:tcBorders>
+              <w:top w:val="single" w:color="000000" w:sz="8" w:space="0" w:shadow="0" w:frame="0"/>
+              <w:left w:val="single" w:color="000000" w:sz="8" w:space="0" w:shadow="0" w:frame="0"/>
+              <w:bottom w:val="single" w:color="000000" w:sz="8" w:space="0" w:shadow="0" w:frame="0"/>
+              <w:right w:val="single" w:color="000000" w:sz="8" w:space="0" w:shadow="0" w:frame="0"/>
+            </w:tcBorders>
+            <w:shd w:val="clear" w:color="auto" w:fill="auto"/>
+            <w:tcMar>
+              <w:top w:type="dxa" w:w="80"/>
+              <w:left w:type="dxa" w:w="80"/>
+              <w:bottom w:type="dxa" w:w="80"/>
+              <w:right w:type="dxa" w:w="80"/>
+            </w:tcMar>
+            <w:vAlign w:val="top"/>
+          </w:tcPr>
+          <w:p>
+            <w:pPr>
+              <w:pStyle w:val="Body"/>
+            </w:pPr>
+            <w:r>
+              <w:t xml:space="preserve">{percentage}%{/wifeNonCharitable}</w:t>
+            </w:r>
+          </w:p>
+        </w:tc>
+      </w:tr>
+    </w:tbl>
+    <w:p>
+      <w:pPr>
+        <w:pStyle w:val="Body"/>
+      </w:pPr>
+      <w:r>
+        <w:t xml:space="preserve">{/hasWifeNonCharitable}</w:t>
+      </w:r>
     </w:p>
     <w:p>
       <w:pPr>
         <w:pStyle w:val="Body"/>
-        <w:tabs>
-          <w:tab w:val="left" w:pos="960"/>
-        </w:tabs>
-        <w:spacing w:before="71" w:line="304" w:lineRule="auto"/>
-        <w:ind w:right="474"/>
-        <w:rPr>
-          <w:outline w:val="0"/>
-          <w:color w:val="030303"/>
-          <w:sz w:val="27"/>
-          <w:szCs w:val="27"/>
-          <w:u w:color="030303"/>
-          <w14:textFill>
-            <w14:solidFill>
-              <w14:srgbClr w14:val="030303"/>
-            </w14:solidFill>
-          </w14:textFill>
-        </w:rPr>
       </w:pPr>
       <w:r>
-        <w:rPr>
-          <w:outline w:val="0"/>
-          <w:color w:val="030303"/>
-          <w:sz w:val="27"/>
-          <w:szCs w:val="27"/>
-          <w:u w:color="030303"/>
-          <w:rtl w:val="0"/>
-          <w:lang w:val="en-US"/>
-          <w14:textFill>
-            <w14:solidFill>
-              <w14:srgbClr w14:val="030303"/>
-            </w14:solidFill>
-          </w14:textFill>
-        </w:rPr>
-        <w:tab/>
-        <w:t>{:table wifeNonCharitable}</w:t>
+        <w:t xml:space="preserve">{^hasWifeNonCharitable}</w:t>
       </w:r>
     </w:p>
     <w:p>
       <w:pPr>
         <w:pStyle w:val="Body"/>
-        <w:tabs>
-          <w:tab w:val="left" w:pos="960"/>
-        </w:tabs>
-        <w:spacing w:before="71" w:line="304" w:lineRule="auto"/>
-        <w:ind w:right="474"/>
-        <w:rPr>
-          <w:outline w:val="0"/>
-          <w:color w:val="030303"/>
-          <w:sz w:val="27"/>
-          <w:szCs w:val="27"/>
-          <w:u w:color="030303"/>
-          <w14:textFill>
-            <w14:solidFill>
-              <w14:srgbClr w14:val="030303"/>
-            </w14:solidFill>
-          </w14:textFill>
-        </w:rPr>
       </w:pPr>
+      <w:r>
+        <w:t xml:space="preserve">Wife has made no non-charitable bequests under this Article</w:t>
+      </w:r>
+    </w:p>
+    <w:p>
+      <w:pPr>
+        <w:pStyle w:val="Body"/>
+      </w:pPr>
+      <w:r>
+        <w:t xml:space="preserve">{/hasWifeNonCharitable}</w:t>
+      </w:r>
+    </w:p>
+    <w:p>
+      <w:pPr>
+        <w:pStyle w:val="Body"/>
+      </w:pPr>
+      <w:r>
+        <w:t xml:space="preserve"/>
+      </w:r>
     </w:p>
     <w:p>
       <w:pPr>
@@ -11631,43 +11897,7 @@
             </w14:solidFill>
           </w14:textFill>
         </w:rPr>
-        <w:t xml:space="preserve"> </w:t>
-      </w:r>
-      <w:r>
-        <w:rPr>
-          <w:b w:val="1"/>
-          <w:bCs w:val="1"/>
-          <w:outline w:val="0"/>
-          <w:color w:val="030303"/>
-          <w:sz w:val="26"/>
-          <w:szCs w:val="26"/>
-          <w:u w:color="030303"/>
-          <w:rtl w:val="0"/>
-          <w:lang w:val="en-US"/>
-          <w14:textFill>
-            <w14:solidFill>
-              <w14:srgbClr w14:val="030303"/>
-            </w14:solidFill>
-          </w14:textFill>
-        </w:rPr>
-        <w:t xml:space="preserve">One-Third Limitation: </w:t>
-      </w:r>
-      <w:r>
-        <w:rPr>
-          <w:outline w:val="0"/>
-          <w:color w:val="030303"/>
-          <w:sz w:val="27"/>
-          <w:szCs w:val="27"/>
-          <w:u w:color="030303"/>
-          <w:rtl w:val="0"/>
-          <w:lang w:val="en-US"/>
-          <w14:textFill>
-            <w14:solidFill>
-              <w14:srgbClr w14:val="030303"/>
-            </w14:solidFill>
-          </w14:textFill>
-        </w:rPr>
-        <w:t>The total of all bequests made by a Grantor under this Article shall not exceed one-third (1/3) of that Grantor's net distributable estate after payment of debts, funeral expenses, and administrative costs, unless all Islamic heirs of that Grantor consent in writing after death. If the total designated bequests exceed one-third (1/3), the Trustee shall proportionally reduce such bequests to comply with this limitation. No bequest shall be distributed to a person who qualifies as an Islamic heir of the Grantor at the time of death unless all other Islamic heirs provide written consent after death.</w:t>
+        <w:t>One-Third Limitation: The total of all bequests made by a Grantor under this Article shall not exceed one-third (1/3) of that Grantor's net distributable estate after payment of debts, funeral expenses, and administrative costs, unless all Islamic heirs of that Grantor consent in writing after death. If the total designated bequests exceed one-third (1/3), the Trustee shall proportionally reduce such bequests to comply with this limitation. No bequest shall be distributed to a person who qualifies as an Islamic heir of the Grantor at the time of death unless all other Islamic heirs provide written consent after death.</w:t>
       </w:r>
     </w:p>
     <w:p>
@@ -12478,7 +12708,7 @@
     </w:p>
     <w:p>
       <w:pPr>
-        <w:pStyle w:val="Body"/>
+        <w:pStyle w:val="heading 6"/>
         <w:ind w:left="363" w:firstLine="0"/>
         <w:rPr>
           <w:b w:val="1"/>
@@ -13615,22 +13845,7 @@
                 <w:rtl w:val="0"/>
                 <w:lang w:val="en-US"/>
               </w:rPr>
-              <w:t>{heirShare}{/</w:t>
-            </w:r>
-            <w:r>
-              <w:rPr>
-                <w:rtl w:val="0"/>
-                <w:lang w:val="en-US"/>
-              </w:rPr>
-              <w:t>husbandHeirs</w:t>
-            </w:r>
-            <w:r>
-              <w:rPr>
-                <w:shd w:val="nil" w:color="auto" w:fill="auto"/>
-                <w:rtl w:val="0"/>
-                <w:lang w:val="en-US"/>
-              </w:rPr>
-              <w:t>}</w:t>
+              <w:t>{heirShare}{/husbandHeirs}</w:t>
             </w:r>
           </w:p>
         </w:tc>
@@ -13648,7 +13863,7 @@
     </w:p>
     <w:p>
       <w:pPr>
-        <w:pStyle w:val="heading 5"/>
+        <w:pStyle w:val="Body"/>
       </w:pPr>
     </w:p>
     <w:p>
@@ -13873,23 +14088,7 @@
                 <w:rtl w:val="0"/>
                 <w:lang w:val="en-US"/>
               </w:rPr>
-              <w:t>{#</w:t>
-            </w:r>
-            <w:r>
-              <w:rPr>
-                <w:shd w:val="nil" w:color="auto" w:fill="auto"/>
-                <w:rtl w:val="0"/>
-                <w:lang w:val="en-US"/>
-              </w:rPr>
-              <w:t>wifeHeirs</w:t>
-            </w:r>
-            <w:r>
-              <w:rPr>
-                <w:shd w:val="nil" w:color="auto" w:fill="auto"/>
-                <w:rtl w:val="0"/>
-                <w:lang w:val="en-US"/>
-              </w:rPr>
-              <w:t>}{heirName}</w:t>
+              <w:t>{#wifeHeirs}{heirName}</w:t>
             </w:r>
           </w:p>
         </w:tc>
@@ -13953,22 +14152,7 @@
                 <w:rtl w:val="0"/>
                 <w:lang w:val="en-US"/>
               </w:rPr>
-              <w:t>{heirShare}{/</w:t>
-            </w:r>
-            <w:r>
-              <w:rPr>
-                <w:rtl w:val="0"/>
-                <w:lang w:val="en-US"/>
-              </w:rPr>
-              <w:t>wifeHeirs</w:t>
-            </w:r>
-            <w:r>
-              <w:rPr>
-                <w:shd w:val="nil" w:color="auto" w:fill="auto"/>
-                <w:rtl w:val="0"/>
-                <w:lang w:val="en-US"/>
-              </w:rPr>
-              <w:t>}</w:t>
+              <w:t>{heirShare}{/wifeHeirs}</w:t>
             </w:r>
           </w:p>
         </w:tc>
@@ -15033,159 +15217,7 @@
             </w14:solidFill>
           </w14:textFill>
         </w:rPr>
-        <w:t>{</w:t>
-      </w:r>
-      <w:r>
-        <w:rPr>
-          <w:outline w:val="0"/>
-          <w:color w:val="030303"/>
-          <w:sz w:val="26"/>
-          <w:szCs w:val="26"/>
-          <w:u w:color="030303"/>
-          <w:rtl w:val="0"/>
-          <w:lang w:val="en-US"/>
-          <w14:textFill>
-            <w14:solidFill>
-              <w14:srgbClr w14:val="030303"/>
-            </w14:solidFill>
-          </w14:textFill>
-        </w:rPr>
-        <w:t>firstPercent</w:t>
-      </w:r>
-      <w:r>
-        <w:rPr>
-          <w:caps w:val="0"/>
-          <w:smallCaps w:val="0"/>
-          <w:strike w:val="0"/>
-          <w:dstrike w:val="0"/>
-          <w:outline w:val="0"/>
-          <w:color w:val="030303"/>
-          <w:sz w:val="26"/>
-          <w:szCs w:val="26"/>
-          <w:u w:val="none" w:color="030303"/>
-          <w:shd w:val="nil" w:color="auto" w:fill="auto"/>
-          <w:vertAlign w:val="baseline"/>
-          <w:rtl w:val="0"/>
-          <w14:textFill>
-            <w14:solidFill>
-              <w14:srgbClr w14:val="030303"/>
-            </w14:solidFill>
-          </w14:textFill>
-        </w:rPr>
-        <w:t>}</w:t>
-      </w:r>
-      <w:r>
-        <w:rPr>
-          <w:caps w:val="0"/>
-          <w:smallCaps w:val="0"/>
-          <w:strike w:val="0"/>
-          <w:dstrike w:val="0"/>
-          <w:outline w:val="0"/>
-          <w:color w:val="030303"/>
-          <w:sz w:val="26"/>
-          <w:szCs w:val="26"/>
-          <w:u w:val="none" w:color="030303"/>
-          <w:shd w:val="nil" w:color="auto" w:fill="auto"/>
-          <w:vertAlign w:val="baseline"/>
-          <w:rtl w:val="0"/>
-          <w:lang w:val="en-US"/>
-          <w14:textFill>
-            <w14:solidFill>
-              <w14:srgbClr w14:val="030303"/>
-            </w14:solidFill>
-          </w14:textFill>
-        </w:rPr>
-        <w:t>%</w:t>
-      </w:r>
-      <w:r>
-        <w:rPr>
-          <w:caps w:val="0"/>
-          <w:smallCaps w:val="0"/>
-          <w:strike w:val="0"/>
-          <w:dstrike w:val="0"/>
-          <w:outline w:val="0"/>
-          <w:color w:val="030303"/>
-          <w:sz w:val="26"/>
-          <w:szCs w:val="26"/>
-          <w:u w:val="none" w:color="030303"/>
-          <w:shd w:val="nil" w:color="auto" w:fill="auto"/>
-          <w:vertAlign w:val="baseline"/>
-          <w:rtl w:val="0"/>
-          <w14:textFill>
-            <w14:solidFill>
-              <w14:srgbClr w14:val="030303"/>
-            </w14:solidFill>
-          </w14:textFill>
-        </w:rPr>
-        <w:t xml:space="preserve"> </w:t>
-      </w:r>
-      <w:r>
-        <w:rPr>
-          <w:b w:val="1"/>
-          <w:bCs w:val="1"/>
-          <w:caps w:val="0"/>
-          <w:smallCaps w:val="0"/>
-          <w:strike w:val="0"/>
-          <w:dstrike w:val="0"/>
-          <w:outline w:val="0"/>
-          <w:color w:val="030303"/>
-          <w:sz w:val="26"/>
-          <w:szCs w:val="26"/>
-          <w:u w:val="none" w:color="030303"/>
-          <w:shd w:val="nil" w:color="auto" w:fill="auto"/>
-          <w:vertAlign w:val="baseline"/>
-          <w:rtl w:val="0"/>
-          <w:lang w:val="en-US"/>
-          <w14:textFill>
-            <w14:solidFill>
-              <w14:srgbClr w14:val="030303"/>
-            </w14:solidFill>
-          </w14:textFill>
-        </w:rPr>
-        <w:t>of the trust property at age {</w:t>
-      </w:r>
-      <w:r>
-        <w:rPr>
-          <w:b w:val="1"/>
-          <w:bCs w:val="1"/>
-          <w:outline w:val="0"/>
-          <w:color w:val="030303"/>
-          <w:sz w:val="26"/>
-          <w:szCs w:val="26"/>
-          <w:u w:color="030303"/>
-          <w:rtl w:val="0"/>
-          <w:lang w:val="en-US"/>
-          <w14:textFill>
-            <w14:solidFill>
-              <w14:srgbClr w14:val="030303"/>
-            </w14:solidFill>
-          </w14:textFill>
-        </w:rPr>
-        <w:t>firstAge</w:t>
-      </w:r>
-      <w:r>
-        <w:rPr>
-          <w:b w:val="1"/>
-          <w:bCs w:val="1"/>
-          <w:caps w:val="0"/>
-          <w:smallCaps w:val="0"/>
-          <w:strike w:val="0"/>
-          <w:dstrike w:val="0"/>
-          <w:outline w:val="0"/>
-          <w:color w:val="030303"/>
-          <w:sz w:val="26"/>
-          <w:szCs w:val="26"/>
-          <w:u w:val="none" w:color="030303"/>
-          <w:shd w:val="nil" w:color="auto" w:fill="auto"/>
-          <w:vertAlign w:val="baseline"/>
-          <w:rtl w:val="0"/>
-          <w14:textFill>
-            <w14:solidFill>
-              <w14:srgbClr w14:val="030303"/>
-            </w14:solidFill>
-          </w14:textFill>
-        </w:rPr>
-        <w:t>};</w:t>
+        <w:t>{firstPercent}% of the trust property at age {firstAge};</w:t>
       </w:r>
     </w:p>
     <w:p>
@@ -15232,181 +15264,7 @@
             </w14:solidFill>
           </w14:textFill>
         </w:rPr>
-        <w:t>{</w:t>
-      </w:r>
-      <w:r>
-        <w:rPr>
-          <w:outline w:val="0"/>
-          <w:color w:val="030303"/>
-          <w:sz w:val="26"/>
-          <w:szCs w:val="26"/>
-          <w:u w:color="030303"/>
-          <w:rtl w:val="0"/>
-          <w:lang w:val="it-IT"/>
-          <w14:textFill>
-            <w14:solidFill>
-              <w14:srgbClr w14:val="030303"/>
-            </w14:solidFill>
-          </w14:textFill>
-        </w:rPr>
-        <w:t>secondPercent</w:t>
-      </w:r>
-      <w:r>
-        <w:rPr>
-          <w:caps w:val="0"/>
-          <w:smallCaps w:val="0"/>
-          <w:strike w:val="0"/>
-          <w:dstrike w:val="0"/>
-          <w:outline w:val="0"/>
-          <w:color w:val="030303"/>
-          <w:sz w:val="26"/>
-          <w:szCs w:val="26"/>
-          <w:u w:val="none" w:color="030303"/>
-          <w:shd w:val="nil" w:color="auto" w:fill="auto"/>
-          <w:vertAlign w:val="baseline"/>
-          <w:rtl w:val="0"/>
-          <w14:textFill>
-            <w14:solidFill>
-              <w14:srgbClr w14:val="030303"/>
-            </w14:solidFill>
-          </w14:textFill>
-        </w:rPr>
-        <w:t>}</w:t>
-      </w:r>
-      <w:r>
-        <w:rPr>
-          <w:caps w:val="0"/>
-          <w:smallCaps w:val="0"/>
-          <w:strike w:val="0"/>
-          <w:dstrike w:val="0"/>
-          <w:outline w:val="0"/>
-          <w:color w:val="030303"/>
-          <w:sz w:val="26"/>
-          <w:szCs w:val="26"/>
-          <w:u w:val="none" w:color="030303"/>
-          <w:shd w:val="nil" w:color="auto" w:fill="auto"/>
-          <w:vertAlign w:val="baseline"/>
-          <w:rtl w:val="0"/>
-          <w:lang w:val="en-US"/>
-          <w14:textFill>
-            <w14:solidFill>
-              <w14:srgbClr w14:val="030303"/>
-            </w14:solidFill>
-          </w14:textFill>
-        </w:rPr>
-        <w:t>%</w:t>
-      </w:r>
-      <w:r>
-        <w:rPr>
-          <w:caps w:val="0"/>
-          <w:smallCaps w:val="0"/>
-          <w:strike w:val="0"/>
-          <w:dstrike w:val="0"/>
-          <w:outline w:val="0"/>
-          <w:color w:val="030303"/>
-          <w:sz w:val="26"/>
-          <w:szCs w:val="26"/>
-          <w:u w:val="none" w:color="030303"/>
-          <w:shd w:val="nil" w:color="auto" w:fill="auto"/>
-          <w:vertAlign w:val="baseline"/>
-          <w:rtl w:val="0"/>
-          <w14:textFill>
-            <w14:solidFill>
-              <w14:srgbClr w14:val="030303"/>
-            </w14:solidFill>
-          </w14:textFill>
-        </w:rPr>
-        <w:t xml:space="preserve"> </w:t>
-      </w:r>
-      <w:r>
-        <w:rPr>
-          <w:b w:val="1"/>
-          <w:bCs w:val="1"/>
-          <w:caps w:val="0"/>
-          <w:smallCaps w:val="0"/>
-          <w:strike w:val="0"/>
-          <w:dstrike w:val="0"/>
-          <w:outline w:val="0"/>
-          <w:color w:val="030303"/>
-          <w:sz w:val="26"/>
-          <w:szCs w:val="26"/>
-          <w:u w:val="none" w:color="030303"/>
-          <w:shd w:val="nil" w:color="auto" w:fill="auto"/>
-          <w:vertAlign w:val="baseline"/>
-          <w:rtl w:val="0"/>
-          <w:lang w:val="en-US"/>
-          <w14:textFill>
-            <w14:solidFill>
-              <w14:srgbClr w14:val="030303"/>
-            </w14:solidFill>
-          </w14:textFill>
-        </w:rPr>
-        <w:t>of the trust property at age {</w:t>
-      </w:r>
-      <w:r>
-        <w:rPr>
-          <w:b w:val="1"/>
-          <w:bCs w:val="1"/>
-          <w:outline w:val="0"/>
-          <w:color w:val="030303"/>
-          <w:sz w:val="26"/>
-          <w:szCs w:val="26"/>
-          <w:u w:color="030303"/>
-          <w:rtl w:val="0"/>
-          <w:lang w:val="it-IT"/>
-          <w14:textFill>
-            <w14:solidFill>
-              <w14:srgbClr w14:val="030303"/>
-            </w14:solidFill>
-          </w14:textFill>
-        </w:rPr>
-        <w:t>secondAge</w:t>
-      </w:r>
-      <w:r>
-        <w:rPr>
-          <w:b w:val="1"/>
-          <w:bCs w:val="1"/>
-          <w:caps w:val="0"/>
-          <w:smallCaps w:val="0"/>
-          <w:strike w:val="0"/>
-          <w:dstrike w:val="0"/>
-          <w:outline w:val="0"/>
-          <w:color w:val="030303"/>
-          <w:sz w:val="26"/>
-          <w:szCs w:val="26"/>
-          <w:u w:val="none" w:color="030303"/>
-          <w:shd w:val="nil" w:color="auto" w:fill="auto"/>
-          <w:vertAlign w:val="baseline"/>
-          <w:rtl w:val="0"/>
-          <w14:textFill>
-            <w14:solidFill>
-              <w14:srgbClr w14:val="030303"/>
-            </w14:solidFill>
-          </w14:textFill>
-        </w:rPr>
-        <w:t xml:space="preserve">}; </w:t>
-      </w:r>
-      <w:r>
-        <w:rPr>
-          <w:caps w:val="0"/>
-          <w:smallCaps w:val="0"/>
-          <w:strike w:val="0"/>
-          <w:dstrike w:val="0"/>
-          <w:outline w:val="0"/>
-          <w:color w:val="030303"/>
-          <w:sz w:val="27"/>
-          <w:szCs w:val="27"/>
-          <w:u w:val="none" w:color="030303"/>
-          <w:shd w:val="nil" w:color="auto" w:fill="auto"/>
-          <w:vertAlign w:val="baseline"/>
-          <w:rtl w:val="0"/>
-          <w14:textFill>
-            <w14:solidFill>
-              <w14:srgbClr w14:val="030303"/>
-            </w14:solidFill>
-          </w14:textFill>
-        </w:rPr>
-        <w:t>and</w:t>
+        <w:t>{secondPercent}% of the trust property at age {secondAge}; and</w:t>
       </w:r>
     </w:p>
     <w:p>
@@ -15455,46 +15313,7 @@
             </w14:solidFill>
           </w14:textFill>
         </w:rPr>
-        <w:t xml:space="preserve">The remaining balance at age </w:t>
-      </w:r>
-      <w:r>
-        <w:rPr>
-          <w:outline w:val="0"/>
-          <w:color w:val="030303"/>
-          <w:sz w:val="27"/>
-          <w:szCs w:val="27"/>
-          <w:u w:color="030303"/>
-          <w:rtl w:val="0"/>
-          <w:lang w:val="en-US"/>
-          <w14:textFill>
-            <w14:solidFill>
-              <w14:srgbClr w14:val="030303"/>
-            </w14:solidFill>
-          </w14:textFill>
-        </w:rPr>
-        <w:t>{remainderAge}</w:t>
-      </w:r>
-      <w:r>
-        <w:rPr>
-          <w:caps w:val="0"/>
-          <w:smallCaps w:val="0"/>
-          <w:strike w:val="0"/>
-          <w:dstrike w:val="0"/>
-          <w:outline w:val="0"/>
-          <w:color w:val="030303"/>
-          <w:sz w:val="27"/>
-          <w:szCs w:val="27"/>
-          <w:u w:val="none" w:color="030303"/>
-          <w:shd w:val="nil" w:color="auto" w:fill="auto"/>
-          <w:vertAlign w:val="baseline"/>
-          <w:rtl w:val="0"/>
-          <w14:textFill>
-            <w14:solidFill>
-              <w14:srgbClr w14:val="030303"/>
-            </w14:solidFill>
-          </w14:textFill>
-        </w:rPr>
-        <w:t>.</w:t>
+        <w:t>The remaining balance at age {remainderAge}.</w:t>
       </w:r>
     </w:p>
     <w:p>
@@ -15569,72 +15388,7 @@
             </w14:solidFill>
           </w14:textFill>
         </w:rPr>
-        <w:t xml:space="preserve">{#mode === </w:t>
-      </w:r>
-      <w:r>
-        <w:rPr>
-          <w:outline w:val="0"/>
-          <w:color w:val="030303"/>
-          <w:sz w:val="27"/>
-          <w:szCs w:val="27"/>
-          <w:u w:color="030303"/>
-          <w:rtl w:val="1"/>
-          <w14:textFill>
-            <w14:solidFill>
-              <w14:srgbClr w14:val="030303"/>
-            </w14:solidFill>
-          </w14:textFill>
-        </w:rPr>
-        <w:t>‘</w:t>
-      </w:r>
-      <w:r>
-        <w:rPr>
-          <w:outline w:val="0"/>
-          <w:color w:val="030303"/>
-          <w:sz w:val="27"/>
-          <w:szCs w:val="27"/>
-          <w:u w:color="030303"/>
-          <w:rtl w:val="0"/>
-          <w:lang w:val="en-US"/>
-          <w14:textFill>
-            <w14:solidFill>
-              <w14:srgbClr w14:val="030303"/>
-            </w14:solidFill>
-          </w14:textFill>
-        </w:rPr>
-        <w:t>single-age</w:t>
-      </w:r>
-      <w:r>
-        <w:rPr>
-          <w:outline w:val="0"/>
-          <w:color w:val="030303"/>
-          <w:sz w:val="27"/>
-          <w:szCs w:val="27"/>
-          <w:u w:color="030303"/>
-          <w:rtl w:val="1"/>
-          <w14:textFill>
-            <w14:solidFill>
-              <w14:srgbClr w14:val="030303"/>
-            </w14:solidFill>
-          </w14:textFill>
-        </w:rPr>
-        <w:t>’</w:t>
-      </w:r>
-      <w:r>
-        <w:rPr>
-          <w:outline w:val="0"/>
-          <w:color w:val="030303"/>
-          <w:sz w:val="27"/>
-          <w:szCs w:val="27"/>
-          <w:u w:color="030303"/>
-          <w:rtl w:val="0"/>
-          <w14:textFill>
-            <w14:solidFill>
-              <w14:srgbClr w14:val="030303"/>
-            </w14:solidFill>
-          </w14:textFill>
-        </w:rPr>
-        <w:t>}</w:t>
+        <w:t>{#mode === 'single-age'}</w:t>
       </w:r>
     </w:p>
     <w:p>
@@ -15698,72 +15452,7 @@
             </w14:solidFill>
           </w14:textFill>
         </w:rPr>
-        <w:t xml:space="preserve">{/mode === </w:t>
-      </w:r>
-      <w:r>
-        <w:rPr>
-          <w:outline w:val="0"/>
-          <w:color w:val="030303"/>
-          <w:sz w:val="27"/>
-          <w:szCs w:val="27"/>
-          <w:u w:color="030303"/>
-          <w:rtl w:val="1"/>
-          <w14:textFill>
-            <w14:solidFill>
-              <w14:srgbClr w14:val="030303"/>
-            </w14:solidFill>
-          </w14:textFill>
-        </w:rPr>
-        <w:t>‘</w:t>
-      </w:r>
-      <w:r>
-        <w:rPr>
-          <w:outline w:val="0"/>
-          <w:color w:val="030303"/>
-          <w:sz w:val="27"/>
-          <w:szCs w:val="27"/>
-          <w:u w:color="030303"/>
-          <w:rtl w:val="0"/>
-          <w:lang w:val="en-US"/>
-          <w14:textFill>
-            <w14:solidFill>
-              <w14:srgbClr w14:val="030303"/>
-            </w14:solidFill>
-          </w14:textFill>
-        </w:rPr>
-        <w:t>single-age</w:t>
-      </w:r>
-      <w:r>
-        <w:rPr>
-          <w:outline w:val="0"/>
-          <w:color w:val="030303"/>
-          <w:sz w:val="27"/>
-          <w:szCs w:val="27"/>
-          <w:u w:color="030303"/>
-          <w:rtl w:val="1"/>
-          <w14:textFill>
-            <w14:solidFill>
-              <w14:srgbClr w14:val="030303"/>
-            </w14:solidFill>
-          </w14:textFill>
-        </w:rPr>
-        <w:t>’</w:t>
-      </w:r>
-      <w:r>
-        <w:rPr>
-          <w:outline w:val="0"/>
-          <w:color w:val="030303"/>
-          <w:sz w:val="27"/>
-          <w:szCs w:val="27"/>
-          <w:u w:color="030303"/>
-          <w:rtl w:val="0"/>
-          <w14:textFill>
-            <w14:solidFill>
-              <w14:srgbClr w14:val="030303"/>
-            </w14:solidFill>
-          </w14:textFill>
-        </w:rPr>
-        <w:t>}</w:t>
+        <w:t>{/mode === 'single-age'}</w:t>
       </w:r>
     </w:p>
     <w:p>
@@ -15774,32 +15463,7 @@
         <w:rPr>
           <w:rtl w:val="0"/>
         </w:rPr>
-        <w:t xml:space="preserve">{#mode === </w:t>
-      </w:r>
-      <w:r>
-        <w:rPr>
-          <w:rtl w:val="1"/>
-        </w:rPr>
-        <w:t>‘</w:t>
-      </w:r>
-      <w:r>
-        <w:rPr>
-          <w:rtl w:val="0"/>
-          <w:lang w:val="en-US"/>
-        </w:rPr>
-        <w:t>age-of-majority</w:t>
-      </w:r>
-      <w:r>
-        <w:rPr>
-          <w:rtl w:val="1"/>
-        </w:rPr>
-        <w:t>’</w:t>
-      </w:r>
-      <w:r>
-        <w:rPr>
-          <w:rtl w:val="0"/>
-        </w:rPr>
-        <w:t>}</w:t>
+        <w:t>{#mode === 'age-of-majority'}</w:t>
       </w:r>
     </w:p>
     <w:p>
@@ -16070,32 +15734,7 @@
         <w:rPr>
           <w:rtl w:val="0"/>
         </w:rPr>
-        <w:t xml:space="preserve">{/mode === </w:t>
-      </w:r>
-      <w:r>
-        <w:rPr>
-          <w:rtl w:val="1"/>
-        </w:rPr>
-        <w:t>‘</w:t>
-      </w:r>
-      <w:r>
-        <w:rPr>
-          <w:rtl w:val="0"/>
-          <w:lang w:val="en-US"/>
-        </w:rPr>
-        <w:t>age-of-majority</w:t>
-      </w:r>
-      <w:r>
-        <w:rPr>
-          <w:rtl w:val="1"/>
-        </w:rPr>
-        <w:t>’</w:t>
-      </w:r>
-      <w:r>
-        <w:rPr>
-          <w:rtl w:val="0"/>
-        </w:rPr>
-        <w:t>}</w:t>
+        <w:t>{/mode === 'age-of-majority'}</w:t>
       </w:r>
     </w:p>
     <w:p>
@@ -17560,7 +17199,7 @@
     </w:p>
     <w:p>
       <w:pPr>
-        <w:pStyle w:val="heading 6"/>
+        <w:pStyle w:val="Body"/>
         <w:ind w:firstLine="363"/>
         <w:rPr>
           <w:outline w:val="0"/>
@@ -18856,7 +18495,7 @@
     </w:p>
     <w:p>
       <w:pPr>
-        <w:pStyle w:val="heading 5"/>
+        <w:pStyle w:val="Body"/>
         <w:ind w:firstLine="363"/>
         <w:rPr>
           <w:outline w:val="0"/>
@@ -18938,7 +18577,7 @@
     </w:p>
     <w:p>
       <w:pPr>
-        <w:pStyle w:val="heading 5"/>
+        <w:pStyle w:val="Body"/>
         <w:ind w:left="0" w:firstLine="0"/>
         <w:rPr>
           <w:outline w:val="0"/>
@@ -18954,7 +18593,7 @@
     </w:p>
     <w:p>
       <w:pPr>
-        <w:pStyle w:val="heading 5"/>
+        <w:pStyle w:val="Body"/>
         <w:ind w:firstLine="363"/>
         <w:rPr>
           <w:outline w:val="0"/>
@@ -18970,7 +18609,7 @@
     </w:p>
     <w:p>
       <w:pPr>
-        <w:pStyle w:val="heading 5"/>
+        <w:pStyle w:val="heading 6"/>
         <w:ind w:firstLine="363"/>
       </w:pPr>
       <w:r>
@@ -19139,78 +18778,7 @@
             </w14:solidFill>
           </w14:textFill>
         </w:rPr>
-        <w:t xml:space="preserve"> </w:t>
-      </w:r>
-      <w:r>
-        <w:rPr>
-          <w:b w:val="1"/>
-          <w:bCs w:val="1"/>
-          <w:caps w:val="0"/>
-          <w:smallCaps w:val="0"/>
-          <w:strike w:val="0"/>
-          <w:dstrike w:val="0"/>
-          <w:outline w:val="0"/>
-          <w:color w:val="030303"/>
-          <w:sz w:val="26"/>
-          <w:szCs w:val="26"/>
-          <w:u w:val="none" w:color="030303"/>
-          <w:shd w:val="nil" w:color="auto" w:fill="auto"/>
-          <w:vertAlign w:val="baseline"/>
-          <w:rtl w:val="0"/>
-          <w:lang w:val="en-US"/>
-          <w14:textFill>
-            <w14:solidFill>
-              <w14:srgbClr w14:val="030303"/>
-            </w14:solidFill>
-          </w14:textFill>
-        </w:rPr>
-        <w:t xml:space="preserve">No-Contest: </w:t>
-      </w:r>
-      <w:r>
-        <w:rPr>
-          <w:caps w:val="0"/>
-          <w:smallCaps w:val="0"/>
-          <w:strike w:val="0"/>
-          <w:dstrike w:val="0"/>
-          <w:outline w:val="0"/>
-          <w:color w:val="030303"/>
-          <w:sz w:val="24"/>
-          <w:szCs w:val="24"/>
-          <w:u w:val="none" w:color="030303"/>
-          <w:shd w:val="nil" w:color="auto" w:fill="auto"/>
-          <w:vertAlign w:val="baseline"/>
-          <w:rtl w:val="0"/>
-          <w:lang w:val="en-US"/>
-          <w14:textFill>
-            <w14:solidFill>
-              <w14:srgbClr w14:val="030303"/>
-            </w14:solidFill>
-          </w14:textFill>
-        </w:rPr>
-        <w:t xml:space="preserve">If </w:t>
-      </w:r>
-      <w:r>
-        <w:rPr>
-          <w:caps w:val="0"/>
-          <w:smallCaps w:val="0"/>
-          <w:strike w:val="0"/>
-          <w:dstrike w:val="0"/>
-          <w:outline w:val="0"/>
-          <w:color w:val="030303"/>
-          <w:sz w:val="27"/>
-          <w:szCs w:val="27"/>
-          <w:u w:val="none" w:color="030303"/>
-          <w:shd w:val="nil" w:color="auto" w:fill="auto"/>
-          <w:vertAlign w:val="baseline"/>
-          <w:rtl w:val="0"/>
-          <w:lang w:val="en-US"/>
-          <w14:textFill>
-            <w14:solidFill>
-              <w14:srgbClr w14:val="030303"/>
-            </w14:solidFill>
-          </w14:textFill>
-        </w:rPr>
-        <w:t>any person contests the validity of this Trust or any amendment, or seeks to set aside any material provision of this Trust, that person shall forfeit any interest otherwise provided to that person under this Trust, and shall be treated as having predeceased the Grantor whose property is being administered, to the extent permitted by Texas law.</w:t>
+        <w:t>No-Contest: If any person contests the validity of this Trust or any amendment, or seeks to set aside any material provision of this Trust, that person shall forfeit any interest otherwise provided to that person under this Trust, and shall be treated as having predeceased the Grantor whose property is being administered, to the extent permitted by Texas law.</w:t>
       </w:r>
     </w:p>
     <w:p>
@@ -19497,55 +19065,7 @@
             </w14:solidFill>
           </w14:textFill>
         </w:rPr>
-        <w:t xml:space="preserve"> </w:t>
-      </w:r>
-      <w:r>
-        <w:rPr>
-          <w:b w:val="1"/>
-          <w:bCs w:val="1"/>
-          <w:caps w:val="0"/>
-          <w:smallCaps w:val="0"/>
-          <w:strike w:val="0"/>
-          <w:dstrike w:val="0"/>
-          <w:outline w:val="0"/>
-          <w:color w:val="030303"/>
-          <w:sz w:val="26"/>
-          <w:szCs w:val="26"/>
-          <w:u w:val="none" w:color="030303"/>
-          <w:shd w:val="nil" w:color="auto" w:fill="auto"/>
-          <w:vertAlign w:val="baseline"/>
-          <w:rtl w:val="0"/>
-          <w:lang w:val="en-US"/>
-          <w14:textFill>
-            <w14:solidFill>
-              <w14:srgbClr w14:val="030303"/>
-            </w14:solidFill>
-          </w14:textFill>
-        </w:rPr>
-        <w:t xml:space="preserve">Anti-Lapse Statutes Waived: </w:t>
-      </w:r>
-      <w:r>
-        <w:rPr>
-          <w:caps w:val="0"/>
-          <w:smallCaps w:val="0"/>
-          <w:strike w:val="0"/>
-          <w:dstrike w:val="0"/>
-          <w:outline w:val="0"/>
-          <w:color w:val="030303"/>
-          <w:sz w:val="27"/>
-          <w:szCs w:val="27"/>
-          <w:u w:val="none" w:color="030303"/>
-          <w:shd w:val="nil" w:color="auto" w:fill="auto"/>
-          <w:vertAlign w:val="baseline"/>
-          <w:rtl w:val="0"/>
-          <w:lang w:val="en-US"/>
-          <w14:textFill>
-            <w14:solidFill>
-              <w14:srgbClr w14:val="030303"/>
-            </w14:solidFill>
-          </w14:textFill>
-        </w:rPr>
-        <w:t>No anti-lapse statute of Texas or any other jurisdiction shall apply to alter the disposition of property under this Trust.</w:t>
+        <w:t>Anti-Lapse Statutes Waived: No anti-lapse statute of Texas or any other jurisdiction shall apply to alter the disposition of property under this Trust.</w:t>
       </w:r>
     </w:p>
     <w:p>
@@ -20409,64 +19929,7 @@
             </w14:solidFill>
           </w14:textFill>
         </w:rPr>
-        <w:t>We have executed this trust on the following date: {</w:t>
-      </w:r>
-      <w:r>
-        <w:rPr>
-          <w:i w:val="1"/>
-          <w:iCs w:val="1"/>
-          <w:outline w:val="0"/>
-          <w:color w:val="030303"/>
-          <w:sz w:val="26"/>
-          <w:szCs w:val="26"/>
-          <w:u w:color="030303"/>
-          <w:rtl w:val="0"/>
-          <w:lang w:val="nl-NL"/>
-          <w14:textFill>
-            <w14:solidFill>
-              <w14:srgbClr w14:val="030303"/>
-            </w14:solidFill>
-          </w14:textFill>
-        </w:rPr>
-        <w:t>trustDate</w:t>
-      </w:r>
-      <w:r>
-        <w:rPr>
-          <w:outline w:val="0"/>
-          <w:color w:val="030303"/>
-          <w:sz w:val="26"/>
-          <w:szCs w:val="26"/>
-          <w:u w:color="030303"/>
-          <w:rtl w:val="0"/>
-          <w14:textFill>
-            <w14:solidFill>
-              <w14:srgbClr w14:val="030303"/>
-            </w14:solidFill>
-          </w14:textFill>
-        </w:rPr>
-        <w:t>}</w:t>
-      </w:r>
-      <w:r>
-        <w:rPr>
-          <w:caps w:val="0"/>
-          <w:smallCaps w:val="0"/>
-          <w:strike w:val="0"/>
-          <w:dstrike w:val="0"/>
-          <w:outline w:val="0"/>
-          <w:color w:val="030303"/>
-          <w:sz w:val="27"/>
-          <w:szCs w:val="27"/>
-          <w:u w:val="none" w:color="030303"/>
-          <w:shd w:val="nil" w:color="auto" w:fill="auto"/>
-          <w:vertAlign w:val="baseline"/>
-          <w:rtl w:val="0"/>
-          <w14:textFill>
-            <w14:solidFill>
-              <w14:srgbClr w14:val="030303"/>
-            </w14:solidFill>
-          </w14:textFill>
-        </w:rPr>
-        <w:t>.</w:t>
+        <w:t>We have executed this trust on the following date: {trustDate}.</w:t>
       </w:r>
     </w:p>
     <w:p>
@@ -20567,55 +20030,34 @@
         </w:rPr>
         <w:t>{husbandFullName}, Grantor and Trustee</w:t>
       </w:r>
-      <w:r>
-        <w:rPr>
-          <w:outline w:val="0"/>
-          <w:color w:val="030303"/>
+    </w:p>
+    <w:p>
+      <w:pPr>
+        <w:pStyle w:val="Body"/>
+        <w:tabs>
+          <w:tab w:val="left" w:pos="6506"/>
+        </w:tabs>
+        <w:spacing w:before="63" w:line="278" w:lineRule="auto"/>
+        <w:ind w:left="357" w:right="1172" w:firstLine="5"/>
+        <w:rPr>
+          <w:caps w:val="0"/>
+          <w:smallCaps w:val="0"/>
+          <w:strike w:val="0"/>
+          <w:dstrike w:val="0"/>
+          <w:outline w:val="0"/>
+          <w:color w:val="000000"/>
           <w:sz w:val="27"/>
           <w:szCs w:val="27"/>
-          <w:u w:color="030303"/>
-          <w:rtl w:val="0"/>
-          <w14:textFill>
-            <w14:solidFill>
-              <w14:srgbClr w14:val="030303"/>
-            </w14:solidFill>
-          </w14:textFill>
-        </w:rPr>
-        <w:t xml:space="preserve"> {</w:t>
-      </w:r>
-      <w:r>
-        <w:rPr>
-          <w:outline w:val="0"/>
-          <w:color w:val="030303"/>
-          <w:sz w:val="27"/>
-          <w:szCs w:val="27"/>
-          <w:u w:color="030303"/>
-          <w:rtl w:val="0"/>
-          <w:lang w:val="en-US"/>
-          <w14:textFill>
-            <w14:solidFill>
-              <w14:srgbClr w14:val="030303"/>
-            </w14:solidFill>
-          </w14:textFill>
-        </w:rPr>
-        <w:t>wifeFullName</w:t>
-      </w:r>
-      <w:r>
-        <w:rPr>
-          <w:outline w:val="0"/>
-          <w:color w:val="030303"/>
-          <w:sz w:val="27"/>
-          <w:szCs w:val="27"/>
-          <w:u w:color="030303"/>
-          <w:rtl w:val="0"/>
-          <w14:textFill>
-            <w14:solidFill>
-              <w14:srgbClr w14:val="030303"/>
-            </w14:solidFill>
-          </w14:textFill>
-        </w:rPr>
-        <w:t>}</w:t>
-      </w:r>
+          <w:u w:val="none" w:color="000000"/>
+          <w:shd w:val="nil" w:color="auto" w:fill="auto"/>
+          <w:vertAlign w:val="baseline"/>
+          <w14:textFill>
+            <w14:solidFill>
+              <w14:srgbClr w14:val="000000"/>
+            </w14:solidFill>
+          </w14:textFill>
+        </w:rPr>
+      </w:pPr>
       <w:r>
         <w:rPr>
           <w:caps w:val="0"/>
@@ -20637,7 +20079,7 @@
             </w14:solidFill>
           </w14:textFill>
         </w:rPr>
-        <w:t>, Grantor and Trustee</w:t>
+        <w:t>{wifeFullName}, Grantor and Trustee</w:t>
       </w:r>
     </w:p>
     <w:p>
@@ -21580,7 +21022,7 @@
     </w:p>
     <w:p>
       <w:pPr>
-        <w:pStyle w:val="Heading 2"/>
+        <w:pStyle w:val="Body"/>
         <w:spacing w:before="1"/>
         <w:ind w:left="362" w:firstLine="0"/>
       </w:pPr>
@@ -21737,9 +21179,7 @@
             </w14:solidFill>
           </w14:textFill>
         </w:rPr>
-        <w:t>Section 1-</w:t>
-        <w:tab/>
-        <w:t>Husband's Separate Property</w:t>
+        <w:t>Section 1 - Husband's Separate Property</w:t>
       </w:r>
     </w:p>
     <w:p>
@@ -22130,7 +21570,7 @@
           <w:shd w:val="clear" w:color="auto" w:fill="ced7e7"/>
         </w:tblPrEx>
         <w:trPr>
-          <w:trHeight w:val="250" w:hRule="atLeast"/>
+          <w:trHeight w:val="420" w:hRule="atLeast"/>
         </w:trPr>
         <w:tc>
           <w:tcPr>
@@ -22198,7 +21638,7 @@
           <w:shd w:val="clear" w:color="auto" w:fill="ced7e7"/>
         </w:tblPrEx>
         <w:trPr>
-          <w:trHeight w:val="250" w:hRule="atLeast"/>
+          <w:trHeight w:val="420" w:hRule="atLeast"/>
         </w:trPr>
         <w:tc>
           <w:tcPr>
@@ -22266,7 +21706,7 @@
           <w:shd w:val="clear" w:color="auto" w:fill="ced7e7"/>
         </w:tblPrEx>
         <w:trPr>
-          <w:trHeight w:val="250" w:hRule="atLeast"/>
+          <w:trHeight w:val="420" w:hRule="atLeast"/>
         </w:trPr>
         <w:tc>
           <w:tcPr>
@@ -22334,7 +21774,7 @@
           <w:shd w:val="clear" w:color="auto" w:fill="ced7e7"/>
         </w:tblPrEx>
         <w:trPr>
-          <w:trHeight w:val="250" w:hRule="atLeast"/>
+          <w:trHeight w:val="420" w:hRule="atLeast"/>
         </w:trPr>
         <w:tc>
           <w:tcPr>
@@ -22397,6 +21837,326 @@
           <w:p/>
         </w:tc>
       </w:tr>
+      <w:tr>
+        <w:tblPrEx>
+          <w:shd w:val="clear" w:color="auto" w:fill="ced7e7"/>
+        </w:tblPrEx>
+        <w:trPr>
+          <w:trHeight w:val="420" w:hRule="atLeast"/>
+        </w:trPr>
+        <w:tc>
+          <w:tcPr>
+            <w:tcW w:type="dxa" w:w="3674"/>
+            <w:tcBorders>
+              <w:top w:val="single" w:color="000000" w:sz="8" w:space="0" w:shadow="0" w:frame="0"/>
+              <w:left w:val="single" w:color="000000" w:sz="8" w:space="0" w:shadow="0" w:frame="0"/>
+              <w:bottom w:val="single" w:color="000000" w:sz="8" w:space="0" w:shadow="0" w:frame="0"/>
+              <w:right w:val="single" w:color="000000" w:sz="8" w:space="0" w:shadow="0" w:frame="0"/>
+            </w:tcBorders>
+            <w:shd w:val="clear" w:color="auto" w:fill="auto"/>
+            <w:tcMar>
+              <w:top w:type="dxa" w:w="80"/>
+              <w:left w:type="dxa" w:w="80"/>
+              <w:bottom w:type="dxa" w:w="80"/>
+              <w:right w:type="dxa" w:w="80"/>
+            </w:tcMar>
+            <w:vAlign w:val="top"/>
+          </w:tcPr>
+          <w:p>
+            <w:r>
+              <w:t/>
+            </w:r>
+          </w:p>
+        </w:tc>
+        <w:tc>
+          <w:tcPr>
+            <w:tcW w:type="dxa" w:w="3674"/>
+            <w:tcBorders>
+              <w:top w:val="single" w:color="000000" w:sz="8" w:space="0" w:shadow="0" w:frame="0"/>
+              <w:left w:val="single" w:color="000000" w:sz="8" w:space="0" w:shadow="0" w:frame="0"/>
+              <w:bottom w:val="single" w:color="000000" w:sz="8" w:space="0" w:shadow="0" w:frame="0"/>
+              <w:right w:val="single" w:color="000000" w:sz="8" w:space="0" w:shadow="0" w:frame="0"/>
+            </w:tcBorders>
+            <w:shd w:val="clear" w:color="auto" w:fill="auto"/>
+            <w:tcMar>
+              <w:top w:type="dxa" w:w="80"/>
+              <w:left w:type="dxa" w:w="80"/>
+              <w:bottom w:type="dxa" w:w="80"/>
+              <w:right w:type="dxa" w:w="80"/>
+            </w:tcMar>
+            <w:vAlign w:val="top"/>
+          </w:tcPr>
+          <w:p>
+            <w:r>
+              <w:t/>
+            </w:r>
+          </w:p>
+        </w:tc>
+        <w:tc>
+          <w:tcPr>
+            <w:tcW w:type="dxa" w:w="3674"/>
+            <w:tcBorders>
+              <w:top w:val="single" w:color="000000" w:sz="8" w:space="0" w:shadow="0" w:frame="0"/>
+              <w:left w:val="single" w:color="000000" w:sz="8" w:space="0" w:shadow="0" w:frame="0"/>
+              <w:bottom w:val="single" w:color="000000" w:sz="8" w:space="0" w:shadow="0" w:frame="0"/>
+              <w:right w:val="single" w:color="000000" w:sz="8" w:space="0" w:shadow="0" w:frame="0"/>
+            </w:tcBorders>
+            <w:shd w:val="clear" w:color="auto" w:fill="auto"/>
+            <w:tcMar>
+              <w:top w:type="dxa" w:w="80"/>
+              <w:left w:type="dxa" w:w="80"/>
+              <w:bottom w:type="dxa" w:w="80"/>
+              <w:right w:type="dxa" w:w="80"/>
+            </w:tcMar>
+            <w:vAlign w:val="top"/>
+          </w:tcPr>
+          <w:p>
+            <w:r>
+              <w:t/>
+            </w:r>
+          </w:p>
+        </w:tc>
+      </w:tr>
+      <w:tr>
+        <w:tblPrEx>
+          <w:shd w:val="clear" w:color="auto" w:fill="ced7e7"/>
+        </w:tblPrEx>
+        <w:trPr>
+          <w:trHeight w:val="420" w:hRule="atLeast"/>
+        </w:trPr>
+        <w:tc>
+          <w:tcPr>
+            <w:tcW w:type="dxa" w:w="3674"/>
+            <w:tcBorders>
+              <w:top w:val="single" w:color="000000" w:sz="8" w:space="0" w:shadow="0" w:frame="0"/>
+              <w:left w:val="single" w:color="000000" w:sz="8" w:space="0" w:shadow="0" w:frame="0"/>
+              <w:bottom w:val="single" w:color="000000" w:sz="8" w:space="0" w:shadow="0" w:frame="0"/>
+              <w:right w:val="single" w:color="000000" w:sz="8" w:space="0" w:shadow="0" w:frame="0"/>
+            </w:tcBorders>
+            <w:shd w:val="clear" w:color="auto" w:fill="auto"/>
+            <w:tcMar>
+              <w:top w:type="dxa" w:w="80"/>
+              <w:left w:type="dxa" w:w="80"/>
+              <w:bottom w:type="dxa" w:w="80"/>
+              <w:right w:type="dxa" w:w="80"/>
+            </w:tcMar>
+            <w:vAlign w:val="top"/>
+          </w:tcPr>
+          <w:p>
+            <w:r>
+              <w:t/>
+            </w:r>
+          </w:p>
+        </w:tc>
+        <w:tc>
+          <w:tcPr>
+            <w:tcW w:type="dxa" w:w="3674"/>
+            <w:tcBorders>
+              <w:top w:val="single" w:color="000000" w:sz="8" w:space="0" w:shadow="0" w:frame="0"/>
+              <w:left w:val="single" w:color="000000" w:sz="8" w:space="0" w:shadow="0" w:frame="0"/>
+              <w:bottom w:val="single" w:color="000000" w:sz="8" w:space="0" w:shadow="0" w:frame="0"/>
+              <w:right w:val="single" w:color="000000" w:sz="8" w:space="0" w:shadow="0" w:frame="0"/>
+            </w:tcBorders>
+            <w:shd w:val="clear" w:color="auto" w:fill="auto"/>
+            <w:tcMar>
+              <w:top w:type="dxa" w:w="80"/>
+              <w:left w:type="dxa" w:w="80"/>
+              <w:bottom w:type="dxa" w:w="80"/>
+              <w:right w:type="dxa" w:w="80"/>
+            </w:tcMar>
+            <w:vAlign w:val="top"/>
+          </w:tcPr>
+          <w:p>
+            <w:r>
+              <w:t/>
+            </w:r>
+          </w:p>
+        </w:tc>
+        <w:tc>
+          <w:tcPr>
+            <w:tcW w:type="dxa" w:w="3674"/>
+            <w:tcBorders>
+              <w:top w:val="single" w:color="000000" w:sz="8" w:space="0" w:shadow="0" w:frame="0"/>
+              <w:left w:val="single" w:color="000000" w:sz="8" w:space="0" w:shadow="0" w:frame="0"/>
+              <w:bottom w:val="single" w:color="000000" w:sz="8" w:space="0" w:shadow="0" w:frame="0"/>
+              <w:right w:val="single" w:color="000000" w:sz="8" w:space="0" w:shadow="0" w:frame="0"/>
+            </w:tcBorders>
+            <w:shd w:val="clear" w:color="auto" w:fill="auto"/>
+            <w:tcMar>
+              <w:top w:type="dxa" w:w="80"/>
+              <w:left w:type="dxa" w:w="80"/>
+              <w:bottom w:type="dxa" w:w="80"/>
+              <w:right w:type="dxa" w:w="80"/>
+            </w:tcMar>
+            <w:vAlign w:val="top"/>
+          </w:tcPr>
+          <w:p>
+            <w:r>
+              <w:t/>
+            </w:r>
+          </w:p>
+        </w:tc>
+      </w:tr>
+      <w:tr>
+        <w:tblPrEx>
+          <w:shd w:val="clear" w:color="auto" w:fill="ced7e7"/>
+        </w:tblPrEx>
+        <w:trPr>
+          <w:trHeight w:val="420" w:hRule="atLeast"/>
+        </w:trPr>
+        <w:tc>
+          <w:tcPr>
+            <w:tcW w:type="dxa" w:w="3674"/>
+            <w:tcBorders>
+              <w:top w:val="single" w:color="000000" w:sz="8" w:space="0" w:shadow="0" w:frame="0"/>
+              <w:left w:val="single" w:color="000000" w:sz="8" w:space="0" w:shadow="0" w:frame="0"/>
+              <w:bottom w:val="single" w:color="000000" w:sz="8" w:space="0" w:shadow="0" w:frame="0"/>
+              <w:right w:val="single" w:color="000000" w:sz="8" w:space="0" w:shadow="0" w:frame="0"/>
+            </w:tcBorders>
+            <w:shd w:val="clear" w:color="auto" w:fill="auto"/>
+            <w:tcMar>
+              <w:top w:type="dxa" w:w="80"/>
+              <w:left w:type="dxa" w:w="80"/>
+              <w:bottom w:type="dxa" w:w="80"/>
+              <w:right w:type="dxa" w:w="80"/>
+            </w:tcMar>
+            <w:vAlign w:val="top"/>
+          </w:tcPr>
+          <w:p>
+            <w:r>
+              <w:t/>
+            </w:r>
+          </w:p>
+        </w:tc>
+        <w:tc>
+          <w:tcPr>
+            <w:tcW w:type="dxa" w:w="3674"/>
+            <w:tcBorders>
+              <w:top w:val="single" w:color="000000" w:sz="8" w:space="0" w:shadow="0" w:frame="0"/>
+              <w:left w:val="single" w:color="000000" w:sz="8" w:space="0" w:shadow="0" w:frame="0"/>
+              <w:bottom w:val="single" w:color="000000" w:sz="8" w:space="0" w:shadow="0" w:frame="0"/>
+              <w:right w:val="single" w:color="000000" w:sz="8" w:space="0" w:shadow="0" w:frame="0"/>
+            </w:tcBorders>
+            <w:shd w:val="clear" w:color="auto" w:fill="auto"/>
+            <w:tcMar>
+              <w:top w:type="dxa" w:w="80"/>
+              <w:left w:type="dxa" w:w="80"/>
+              <w:bottom w:type="dxa" w:w="80"/>
+              <w:right w:type="dxa" w:w="80"/>
+            </w:tcMar>
+            <w:vAlign w:val="top"/>
+          </w:tcPr>
+          <w:p>
+            <w:r>
+              <w:t/>
+            </w:r>
+          </w:p>
+        </w:tc>
+        <w:tc>
+          <w:tcPr>
+            <w:tcW w:type="dxa" w:w="3674"/>
+            <w:tcBorders>
+              <w:top w:val="single" w:color="000000" w:sz="8" w:space="0" w:shadow="0" w:frame="0"/>
+              <w:left w:val="single" w:color="000000" w:sz="8" w:space="0" w:shadow="0" w:frame="0"/>
+              <w:bottom w:val="single" w:color="000000" w:sz="8" w:space="0" w:shadow="0" w:frame="0"/>
+              <w:right w:val="single" w:color="000000" w:sz="8" w:space="0" w:shadow="0" w:frame="0"/>
+            </w:tcBorders>
+            <w:shd w:val="clear" w:color="auto" w:fill="auto"/>
+            <w:tcMar>
+              <w:top w:type="dxa" w:w="80"/>
+              <w:left w:type="dxa" w:w="80"/>
+              <w:bottom w:type="dxa" w:w="80"/>
+              <w:right w:type="dxa" w:w="80"/>
+            </w:tcMar>
+            <w:vAlign w:val="top"/>
+          </w:tcPr>
+          <w:p>
+            <w:r>
+              <w:t/>
+            </w:r>
+          </w:p>
+        </w:tc>
+      </w:tr>
+      <w:tr>
+        <w:tblPrEx>
+          <w:shd w:val="clear" w:color="auto" w:fill="ced7e7"/>
+        </w:tblPrEx>
+        <w:trPr>
+          <w:trHeight w:val="420" w:hRule="atLeast"/>
+        </w:trPr>
+        <w:tc>
+          <w:tcPr>
+            <w:tcW w:type="dxa" w:w="3674"/>
+            <w:tcBorders>
+              <w:top w:val="single" w:color="000000" w:sz="8" w:space="0" w:shadow="0" w:frame="0"/>
+              <w:left w:val="single" w:color="000000" w:sz="8" w:space="0" w:shadow="0" w:frame="0"/>
+              <w:bottom w:val="single" w:color="000000" w:sz="8" w:space="0" w:shadow="0" w:frame="0"/>
+              <w:right w:val="single" w:color="000000" w:sz="8" w:space="0" w:shadow="0" w:frame="0"/>
+            </w:tcBorders>
+            <w:shd w:val="clear" w:color="auto" w:fill="auto"/>
+            <w:tcMar>
+              <w:top w:type="dxa" w:w="80"/>
+              <w:left w:type="dxa" w:w="80"/>
+              <w:bottom w:type="dxa" w:w="80"/>
+              <w:right w:type="dxa" w:w="80"/>
+            </w:tcMar>
+            <w:vAlign w:val="top"/>
+          </w:tcPr>
+          <w:p>
+            <w:r>
+              <w:t/>
+            </w:r>
+          </w:p>
+        </w:tc>
+        <w:tc>
+          <w:tcPr>
+            <w:tcW w:type="dxa" w:w="3674"/>
+            <w:tcBorders>
+              <w:top w:val="single" w:color="000000" w:sz="8" w:space="0" w:shadow="0" w:frame="0"/>
+              <w:left w:val="single" w:color="000000" w:sz="8" w:space="0" w:shadow="0" w:frame="0"/>
+              <w:bottom w:val="single" w:color="000000" w:sz="8" w:space="0" w:shadow="0" w:frame="0"/>
+              <w:right w:val="single" w:color="000000" w:sz="8" w:space="0" w:shadow="0" w:frame="0"/>
+            </w:tcBorders>
+            <w:shd w:val="clear" w:color="auto" w:fill="auto"/>
+            <w:tcMar>
+              <w:top w:type="dxa" w:w="80"/>
+              <w:left w:type="dxa" w:w="80"/>
+              <w:bottom w:type="dxa" w:w="80"/>
+              <w:right w:type="dxa" w:w="80"/>
+            </w:tcMar>
+            <w:vAlign w:val="top"/>
+          </w:tcPr>
+          <w:p>
+            <w:r>
+              <w:t/>
+            </w:r>
+          </w:p>
+        </w:tc>
+        <w:tc>
+          <w:tcPr>
+            <w:tcW w:type="dxa" w:w="3674"/>
+            <w:tcBorders>
+              <w:top w:val="single" w:color="000000" w:sz="8" w:space="0" w:shadow="0" w:frame="0"/>
+              <w:left w:val="single" w:color="000000" w:sz="8" w:space="0" w:shadow="0" w:frame="0"/>
+              <w:bottom w:val="single" w:color="000000" w:sz="8" w:space="0" w:shadow="0" w:frame="0"/>
+              <w:right w:val="single" w:color="000000" w:sz="8" w:space="0" w:shadow="0" w:frame="0"/>
+            </w:tcBorders>
+            <w:shd w:val="clear" w:color="auto" w:fill="auto"/>
+            <w:tcMar>
+              <w:top w:type="dxa" w:w="80"/>
+              <w:left w:type="dxa" w:w="80"/>
+              <w:bottom w:type="dxa" w:w="80"/>
+              <w:right w:type="dxa" w:w="80"/>
+            </w:tcMar>
+            <w:vAlign w:val="top"/>
+          </w:tcPr>
+          <w:p>
+            <w:r>
+              <w:t/>
+            </w:r>
+          </w:p>
+        </w:tc>
+      </w:tr>
     </w:tbl>
     <w:p>
       <w:pPr>
@@ -22496,54 +22256,7 @@
             </w14:solidFill>
           </w14:textFill>
         </w:rPr>
-        <w:t xml:space="preserve">Section 2 </w:t>
-      </w:r>
-      <w:r>
-        <w:rPr>
-          <w:caps w:val="0"/>
-          <w:smallCaps w:val="0"/>
-          <w:strike w:val="0"/>
-          <w:dstrike w:val="0"/>
-          <w:outline w:val="0"/>
-          <w:color w:val="030303"/>
-          <w:sz w:val="27"/>
-          <w:szCs w:val="27"/>
-          <w:u w:val="none" w:color="030303"/>
-          <w:shd w:val="nil" w:color="auto" w:fill="auto"/>
-          <w:vertAlign w:val="baseline"/>
-          <w:rtl w:val="0"/>
-          <w14:textFill>
-            <w14:solidFill>
-              <w14:srgbClr w14:val="030303"/>
-            </w14:solidFill>
-          </w14:textFill>
-        </w:rPr>
-        <w:t xml:space="preserve">-  </w:t>
-      </w:r>
-      <w:r>
-        <w:rPr>
-          <w:b w:val="1"/>
-          <w:bCs w:val="1"/>
-          <w:caps w:val="0"/>
-          <w:smallCaps w:val="0"/>
-          <w:strike w:val="0"/>
-          <w:dstrike w:val="0"/>
-          <w:outline w:val="0"/>
-          <w:color w:val="030303"/>
-          <w:sz w:val="27"/>
-          <w:szCs w:val="27"/>
-          <w:u w:val="none" w:color="030303"/>
-          <w:shd w:val="nil" w:color="auto" w:fill="auto"/>
-          <w:vertAlign w:val="baseline"/>
-          <w:rtl w:val="0"/>
-          <w:lang w:val="en-US"/>
-          <w14:textFill>
-            <w14:solidFill>
-              <w14:srgbClr w14:val="030303"/>
-            </w14:solidFill>
-          </w14:textFill>
-        </w:rPr>
-        <w:t>Wife's Separate Property</w:t>
+        <w:t>Section 2 - Wife's Separate Property</w:t>
       </w:r>
     </w:p>
     <w:p>
@@ -22909,7 +22622,7 @@
           <w:shd w:val="clear" w:color="auto" w:fill="ced7e7"/>
         </w:tblPrEx>
         <w:trPr>
-          <w:trHeight w:val="250" w:hRule="atLeast"/>
+          <w:trHeight w:val="420" w:hRule="atLeast"/>
         </w:trPr>
         <w:tc>
           <w:tcPr>
@@ -22977,7 +22690,7 @@
           <w:shd w:val="clear" w:color="auto" w:fill="ced7e7"/>
         </w:tblPrEx>
         <w:trPr>
-          <w:trHeight w:val="250" w:hRule="atLeast"/>
+          <w:trHeight w:val="420" w:hRule="atLeast"/>
         </w:trPr>
         <w:tc>
           <w:tcPr>
@@ -23045,7 +22758,7 @@
           <w:shd w:val="clear" w:color="auto" w:fill="ced7e7"/>
         </w:tblPrEx>
         <w:trPr>
-          <w:trHeight w:val="250" w:hRule="atLeast"/>
+          <w:trHeight w:val="420" w:hRule="atLeast"/>
         </w:trPr>
         <w:tc>
           <w:tcPr>
@@ -23113,7 +22826,7 @@
           <w:shd w:val="clear" w:color="auto" w:fill="ced7e7"/>
         </w:tblPrEx>
         <w:trPr>
-          <w:trHeight w:val="250" w:hRule="atLeast"/>
+          <w:trHeight w:val="420" w:hRule="atLeast"/>
         </w:trPr>
         <w:tc>
           <w:tcPr>
@@ -23176,6 +22889,326 @@
           <w:p/>
         </w:tc>
       </w:tr>
+      <w:tr>
+        <w:tblPrEx>
+          <w:shd w:val="clear" w:color="auto" w:fill="ced7e7"/>
+        </w:tblPrEx>
+        <w:trPr>
+          <w:trHeight w:val="420" w:hRule="atLeast"/>
+        </w:trPr>
+        <w:tc>
+          <w:tcPr>
+            <w:tcW w:type="dxa" w:w="3674"/>
+            <w:tcBorders>
+              <w:top w:val="single" w:color="000000" w:sz="8" w:space="0" w:shadow="0" w:frame="0"/>
+              <w:left w:val="single" w:color="000000" w:sz="8" w:space="0" w:shadow="0" w:frame="0"/>
+              <w:bottom w:val="single" w:color="000000" w:sz="8" w:space="0" w:shadow="0" w:frame="0"/>
+              <w:right w:val="single" w:color="000000" w:sz="8" w:space="0" w:shadow="0" w:frame="0"/>
+            </w:tcBorders>
+            <w:shd w:val="clear" w:color="auto" w:fill="auto"/>
+            <w:tcMar>
+              <w:top w:type="dxa" w:w="80"/>
+              <w:left w:type="dxa" w:w="80"/>
+              <w:bottom w:type="dxa" w:w="80"/>
+              <w:right w:type="dxa" w:w="80"/>
+            </w:tcMar>
+            <w:vAlign w:val="top"/>
+          </w:tcPr>
+          <w:p>
+            <w:r>
+              <w:t/>
+            </w:r>
+          </w:p>
+        </w:tc>
+        <w:tc>
+          <w:tcPr>
+            <w:tcW w:type="dxa" w:w="3674"/>
+            <w:tcBorders>
+              <w:top w:val="single" w:color="000000" w:sz="8" w:space="0" w:shadow="0" w:frame="0"/>
+              <w:left w:val="single" w:color="000000" w:sz="8" w:space="0" w:shadow="0" w:frame="0"/>
+              <w:bottom w:val="single" w:color="000000" w:sz="8" w:space="0" w:shadow="0" w:frame="0"/>
+              <w:right w:val="single" w:color="000000" w:sz="8" w:space="0" w:shadow="0" w:frame="0"/>
+            </w:tcBorders>
+            <w:shd w:val="clear" w:color="auto" w:fill="auto"/>
+            <w:tcMar>
+              <w:top w:type="dxa" w:w="80"/>
+              <w:left w:type="dxa" w:w="80"/>
+              <w:bottom w:type="dxa" w:w="80"/>
+              <w:right w:type="dxa" w:w="80"/>
+            </w:tcMar>
+            <w:vAlign w:val="top"/>
+          </w:tcPr>
+          <w:p>
+            <w:r>
+              <w:t/>
+            </w:r>
+          </w:p>
+        </w:tc>
+        <w:tc>
+          <w:tcPr>
+            <w:tcW w:type="dxa" w:w="3674"/>
+            <w:tcBorders>
+              <w:top w:val="single" w:color="000000" w:sz="8" w:space="0" w:shadow="0" w:frame="0"/>
+              <w:left w:val="single" w:color="000000" w:sz="8" w:space="0" w:shadow="0" w:frame="0"/>
+              <w:bottom w:val="single" w:color="000000" w:sz="8" w:space="0" w:shadow="0" w:frame="0"/>
+              <w:right w:val="single" w:color="000000" w:sz="8" w:space="0" w:shadow="0" w:frame="0"/>
+            </w:tcBorders>
+            <w:shd w:val="clear" w:color="auto" w:fill="auto"/>
+            <w:tcMar>
+              <w:top w:type="dxa" w:w="80"/>
+              <w:left w:type="dxa" w:w="80"/>
+              <w:bottom w:type="dxa" w:w="80"/>
+              <w:right w:type="dxa" w:w="80"/>
+            </w:tcMar>
+            <w:vAlign w:val="top"/>
+          </w:tcPr>
+          <w:p>
+            <w:r>
+              <w:t/>
+            </w:r>
+          </w:p>
+        </w:tc>
+      </w:tr>
+      <w:tr>
+        <w:tblPrEx>
+          <w:shd w:val="clear" w:color="auto" w:fill="ced7e7"/>
+        </w:tblPrEx>
+        <w:trPr>
+          <w:trHeight w:val="420" w:hRule="atLeast"/>
+        </w:trPr>
+        <w:tc>
+          <w:tcPr>
+            <w:tcW w:type="dxa" w:w="3674"/>
+            <w:tcBorders>
+              <w:top w:val="single" w:color="000000" w:sz="8" w:space="0" w:shadow="0" w:frame="0"/>
+              <w:left w:val="single" w:color="000000" w:sz="8" w:space="0" w:shadow="0" w:frame="0"/>
+              <w:bottom w:val="single" w:color="000000" w:sz="8" w:space="0" w:shadow="0" w:frame="0"/>
+              <w:right w:val="single" w:color="000000" w:sz="8" w:space="0" w:shadow="0" w:frame="0"/>
+            </w:tcBorders>
+            <w:shd w:val="clear" w:color="auto" w:fill="auto"/>
+            <w:tcMar>
+              <w:top w:type="dxa" w:w="80"/>
+              <w:left w:type="dxa" w:w="80"/>
+              <w:bottom w:type="dxa" w:w="80"/>
+              <w:right w:type="dxa" w:w="80"/>
+            </w:tcMar>
+            <w:vAlign w:val="top"/>
+          </w:tcPr>
+          <w:p>
+            <w:r>
+              <w:t/>
+            </w:r>
+          </w:p>
+        </w:tc>
+        <w:tc>
+          <w:tcPr>
+            <w:tcW w:type="dxa" w:w="3674"/>
+            <w:tcBorders>
+              <w:top w:val="single" w:color="000000" w:sz="8" w:space="0" w:shadow="0" w:frame="0"/>
+              <w:left w:val="single" w:color="000000" w:sz="8" w:space="0" w:shadow="0" w:frame="0"/>
+              <w:bottom w:val="single" w:color="000000" w:sz="8" w:space="0" w:shadow="0" w:frame="0"/>
+              <w:right w:val="single" w:color="000000" w:sz="8" w:space="0" w:shadow="0" w:frame="0"/>
+            </w:tcBorders>
+            <w:shd w:val="clear" w:color="auto" w:fill="auto"/>
+            <w:tcMar>
+              <w:top w:type="dxa" w:w="80"/>
+              <w:left w:type="dxa" w:w="80"/>
+              <w:bottom w:type="dxa" w:w="80"/>
+              <w:right w:type="dxa" w:w="80"/>
+            </w:tcMar>
+            <w:vAlign w:val="top"/>
+          </w:tcPr>
+          <w:p>
+            <w:r>
+              <w:t/>
+            </w:r>
+          </w:p>
+        </w:tc>
+        <w:tc>
+          <w:tcPr>
+            <w:tcW w:type="dxa" w:w="3674"/>
+            <w:tcBorders>
+              <w:top w:val="single" w:color="000000" w:sz="8" w:space="0" w:shadow="0" w:frame="0"/>
+              <w:left w:val="single" w:color="000000" w:sz="8" w:space="0" w:shadow="0" w:frame="0"/>
+              <w:bottom w:val="single" w:color="000000" w:sz="8" w:space="0" w:shadow="0" w:frame="0"/>
+              <w:right w:val="single" w:color="000000" w:sz="8" w:space="0" w:shadow="0" w:frame="0"/>
+            </w:tcBorders>
+            <w:shd w:val="clear" w:color="auto" w:fill="auto"/>
+            <w:tcMar>
+              <w:top w:type="dxa" w:w="80"/>
+              <w:left w:type="dxa" w:w="80"/>
+              <w:bottom w:type="dxa" w:w="80"/>
+              <w:right w:type="dxa" w:w="80"/>
+            </w:tcMar>
+            <w:vAlign w:val="top"/>
+          </w:tcPr>
+          <w:p>
+            <w:r>
+              <w:t/>
+            </w:r>
+          </w:p>
+        </w:tc>
+      </w:tr>
+      <w:tr>
+        <w:tblPrEx>
+          <w:shd w:val="clear" w:color="auto" w:fill="ced7e7"/>
+        </w:tblPrEx>
+        <w:trPr>
+          <w:trHeight w:val="420" w:hRule="atLeast"/>
+        </w:trPr>
+        <w:tc>
+          <w:tcPr>
+            <w:tcW w:type="dxa" w:w="3674"/>
+            <w:tcBorders>
+              <w:top w:val="single" w:color="000000" w:sz="8" w:space="0" w:shadow="0" w:frame="0"/>
+              <w:left w:val="single" w:color="000000" w:sz="8" w:space="0" w:shadow="0" w:frame="0"/>
+              <w:bottom w:val="single" w:color="000000" w:sz="8" w:space="0" w:shadow="0" w:frame="0"/>
+              <w:right w:val="single" w:color="000000" w:sz="8" w:space="0" w:shadow="0" w:frame="0"/>
+            </w:tcBorders>
+            <w:shd w:val="clear" w:color="auto" w:fill="auto"/>
+            <w:tcMar>
+              <w:top w:type="dxa" w:w="80"/>
+              <w:left w:type="dxa" w:w="80"/>
+              <w:bottom w:type="dxa" w:w="80"/>
+              <w:right w:type="dxa" w:w="80"/>
+            </w:tcMar>
+            <w:vAlign w:val="top"/>
+          </w:tcPr>
+          <w:p>
+            <w:r>
+              <w:t/>
+            </w:r>
+          </w:p>
+        </w:tc>
+        <w:tc>
+          <w:tcPr>
+            <w:tcW w:type="dxa" w:w="3674"/>
+            <w:tcBorders>
+              <w:top w:val="single" w:color="000000" w:sz="8" w:space="0" w:shadow="0" w:frame="0"/>
+              <w:left w:val="single" w:color="000000" w:sz="8" w:space="0" w:shadow="0" w:frame="0"/>
+              <w:bottom w:val="single" w:color="000000" w:sz="8" w:space="0" w:shadow="0" w:frame="0"/>
+              <w:right w:val="single" w:color="000000" w:sz="8" w:space="0" w:shadow="0" w:frame="0"/>
+            </w:tcBorders>
+            <w:shd w:val="clear" w:color="auto" w:fill="auto"/>
+            <w:tcMar>
+              <w:top w:type="dxa" w:w="80"/>
+              <w:left w:type="dxa" w:w="80"/>
+              <w:bottom w:type="dxa" w:w="80"/>
+              <w:right w:type="dxa" w:w="80"/>
+            </w:tcMar>
+            <w:vAlign w:val="top"/>
+          </w:tcPr>
+          <w:p>
+            <w:r>
+              <w:t/>
+            </w:r>
+          </w:p>
+        </w:tc>
+        <w:tc>
+          <w:tcPr>
+            <w:tcW w:type="dxa" w:w="3674"/>
+            <w:tcBorders>
+              <w:top w:val="single" w:color="000000" w:sz="8" w:space="0" w:shadow="0" w:frame="0"/>
+              <w:left w:val="single" w:color="000000" w:sz="8" w:space="0" w:shadow="0" w:frame="0"/>
+              <w:bottom w:val="single" w:color="000000" w:sz="8" w:space="0" w:shadow="0" w:frame="0"/>
+              <w:right w:val="single" w:color="000000" w:sz="8" w:space="0" w:shadow="0" w:frame="0"/>
+            </w:tcBorders>
+            <w:shd w:val="clear" w:color="auto" w:fill="auto"/>
+            <w:tcMar>
+              <w:top w:type="dxa" w:w="80"/>
+              <w:left w:type="dxa" w:w="80"/>
+              <w:bottom w:type="dxa" w:w="80"/>
+              <w:right w:type="dxa" w:w="80"/>
+            </w:tcMar>
+            <w:vAlign w:val="top"/>
+          </w:tcPr>
+          <w:p>
+            <w:r>
+              <w:t/>
+            </w:r>
+          </w:p>
+        </w:tc>
+      </w:tr>
+      <w:tr>
+        <w:tblPrEx>
+          <w:shd w:val="clear" w:color="auto" w:fill="ced7e7"/>
+        </w:tblPrEx>
+        <w:trPr>
+          <w:trHeight w:val="420" w:hRule="atLeast"/>
+        </w:trPr>
+        <w:tc>
+          <w:tcPr>
+            <w:tcW w:type="dxa" w:w="3674"/>
+            <w:tcBorders>
+              <w:top w:val="single" w:color="000000" w:sz="8" w:space="0" w:shadow="0" w:frame="0"/>
+              <w:left w:val="single" w:color="000000" w:sz="8" w:space="0" w:shadow="0" w:frame="0"/>
+              <w:bottom w:val="single" w:color="000000" w:sz="8" w:space="0" w:shadow="0" w:frame="0"/>
+              <w:right w:val="single" w:color="000000" w:sz="8" w:space="0" w:shadow="0" w:frame="0"/>
+            </w:tcBorders>
+            <w:shd w:val="clear" w:color="auto" w:fill="auto"/>
+            <w:tcMar>
+              <w:top w:type="dxa" w:w="80"/>
+              <w:left w:type="dxa" w:w="80"/>
+              <w:bottom w:type="dxa" w:w="80"/>
+              <w:right w:type="dxa" w:w="80"/>
+            </w:tcMar>
+            <w:vAlign w:val="top"/>
+          </w:tcPr>
+          <w:p>
+            <w:r>
+              <w:t/>
+            </w:r>
+          </w:p>
+        </w:tc>
+        <w:tc>
+          <w:tcPr>
+            <w:tcW w:type="dxa" w:w="3674"/>
+            <w:tcBorders>
+              <w:top w:val="single" w:color="000000" w:sz="8" w:space="0" w:shadow="0" w:frame="0"/>
+              <w:left w:val="single" w:color="000000" w:sz="8" w:space="0" w:shadow="0" w:frame="0"/>
+              <w:bottom w:val="single" w:color="000000" w:sz="8" w:space="0" w:shadow="0" w:frame="0"/>
+              <w:right w:val="single" w:color="000000" w:sz="8" w:space="0" w:shadow="0" w:frame="0"/>
+            </w:tcBorders>
+            <w:shd w:val="clear" w:color="auto" w:fill="auto"/>
+            <w:tcMar>
+              <w:top w:type="dxa" w:w="80"/>
+              <w:left w:type="dxa" w:w="80"/>
+              <w:bottom w:type="dxa" w:w="80"/>
+              <w:right w:type="dxa" w:w="80"/>
+            </w:tcMar>
+            <w:vAlign w:val="top"/>
+          </w:tcPr>
+          <w:p>
+            <w:r>
+              <w:t/>
+            </w:r>
+          </w:p>
+        </w:tc>
+        <w:tc>
+          <w:tcPr>
+            <w:tcW w:type="dxa" w:w="3674"/>
+            <w:tcBorders>
+              <w:top w:val="single" w:color="000000" w:sz="8" w:space="0" w:shadow="0" w:frame="0"/>
+              <w:left w:val="single" w:color="000000" w:sz="8" w:space="0" w:shadow="0" w:frame="0"/>
+              <w:bottom w:val="single" w:color="000000" w:sz="8" w:space="0" w:shadow="0" w:frame="0"/>
+              <w:right w:val="single" w:color="000000" w:sz="8" w:space="0" w:shadow="0" w:frame="0"/>
+            </w:tcBorders>
+            <w:shd w:val="clear" w:color="auto" w:fill="auto"/>
+            <w:tcMar>
+              <w:top w:type="dxa" w:w="80"/>
+              <w:left w:type="dxa" w:w="80"/>
+              <w:bottom w:type="dxa" w:w="80"/>
+              <w:right w:type="dxa" w:w="80"/>
+            </w:tcMar>
+            <w:vAlign w:val="top"/>
+          </w:tcPr>
+          <w:p>
+            <w:r>
+              <w:t/>
+            </w:r>
+          </w:p>
+        </w:tc>
+      </w:tr>
     </w:tbl>
     <w:p>
       <w:pPr>
@@ -23312,54 +23345,7 @@
             </w14:solidFill>
           </w14:textFill>
         </w:rPr>
-        <w:t xml:space="preserve">Section 3 </w:t>
-      </w:r>
-      <w:r>
-        <w:rPr>
-          <w:caps w:val="0"/>
-          <w:smallCaps w:val="0"/>
-          <w:strike w:val="0"/>
-          <w:dstrike w:val="0"/>
-          <w:outline w:val="0"/>
-          <w:color w:val="030303"/>
-          <w:sz w:val="27"/>
-          <w:szCs w:val="27"/>
-          <w:u w:val="none" w:color="030303"/>
-          <w:shd w:val="nil" w:color="auto" w:fill="auto"/>
-          <w:vertAlign w:val="baseline"/>
-          <w:rtl w:val="0"/>
-          <w14:textFill>
-            <w14:solidFill>
-              <w14:srgbClr w14:val="030303"/>
-            </w14:solidFill>
-          </w14:textFill>
-        </w:rPr>
-        <w:t xml:space="preserve">-  </w:t>
-      </w:r>
-      <w:r>
-        <w:rPr>
-          <w:b w:val="1"/>
-          <w:bCs w:val="1"/>
-          <w:caps w:val="0"/>
-          <w:smallCaps w:val="0"/>
-          <w:strike w:val="0"/>
-          <w:dstrike w:val="0"/>
-          <w:outline w:val="0"/>
-          <w:color w:val="030303"/>
-          <w:sz w:val="27"/>
-          <w:szCs w:val="27"/>
-          <w:u w:val="none" w:color="030303"/>
-          <w:shd w:val="nil" w:color="auto" w:fill="auto"/>
-          <w:vertAlign w:val="baseline"/>
-          <w:rtl w:val="0"/>
-          <w:lang w:val="fr-FR"/>
-          <w14:textFill>
-            <w14:solidFill>
-              <w14:srgbClr w14:val="030303"/>
-            </w14:solidFill>
-          </w14:textFill>
-        </w:rPr>
-        <w:t>Asset Allocation Table</w:t>
+        <w:t>Section 3 - Asset Allocation Table</w:t>
       </w:r>
     </w:p>
     <w:p>
@@ -23802,7 +23788,7 @@
           <w:shd w:val="clear" w:color="auto" w:fill="ced7e7"/>
         </w:tblPrEx>
         <w:trPr>
-          <w:trHeight w:val="250" w:hRule="atLeast"/>
+          <w:trHeight w:val="420" w:hRule="atLeast"/>
         </w:trPr>
         <w:tc>
           <w:tcPr>
@@ -23870,7 +23856,7 @@
           <w:shd w:val="clear" w:color="auto" w:fill="ced7e7"/>
         </w:tblPrEx>
         <w:trPr>
-          <w:trHeight w:val="250" w:hRule="atLeast"/>
+          <w:trHeight w:val="420" w:hRule="atLeast"/>
         </w:trPr>
         <w:tc>
           <w:tcPr>
@@ -23938,7 +23924,7 @@
           <w:shd w:val="clear" w:color="auto" w:fill="ced7e7"/>
         </w:tblPrEx>
         <w:trPr>
-          <w:trHeight w:val="250" w:hRule="atLeast"/>
+          <w:trHeight w:val="420" w:hRule="atLeast"/>
         </w:trPr>
         <w:tc>
           <w:tcPr>
@@ -24006,7 +23992,7 @@
           <w:shd w:val="clear" w:color="auto" w:fill="ced7e7"/>
         </w:tblPrEx>
         <w:trPr>
-          <w:trHeight w:val="250" w:hRule="atLeast"/>
+          <w:trHeight w:val="420" w:hRule="atLeast"/>
         </w:trPr>
         <w:tc>
           <w:tcPr>
@@ -24069,6 +24055,326 @@
           <w:p/>
         </w:tc>
       </w:tr>
+      <w:tr>
+        <w:tblPrEx>
+          <w:shd w:val="clear" w:color="auto" w:fill="ced7e7"/>
+        </w:tblPrEx>
+        <w:trPr>
+          <w:trHeight w:val="420" w:hRule="atLeast"/>
+        </w:trPr>
+        <w:tc>
+          <w:tcPr>
+            <w:tcW w:type="dxa" w:w="3674"/>
+            <w:tcBorders>
+              <w:top w:val="single" w:color="000000" w:sz="8" w:space="0" w:shadow="0" w:frame="0"/>
+              <w:left w:val="single" w:color="000000" w:sz="8" w:space="0" w:shadow="0" w:frame="0"/>
+              <w:bottom w:val="single" w:color="000000" w:sz="8" w:space="0" w:shadow="0" w:frame="0"/>
+              <w:right w:val="single" w:color="000000" w:sz="8" w:space="0" w:shadow="0" w:frame="0"/>
+            </w:tcBorders>
+            <w:shd w:val="clear" w:color="auto" w:fill="auto"/>
+            <w:tcMar>
+              <w:top w:type="dxa" w:w="80"/>
+              <w:left w:type="dxa" w:w="80"/>
+              <w:bottom w:type="dxa" w:w="80"/>
+              <w:right w:type="dxa" w:w="80"/>
+            </w:tcMar>
+            <w:vAlign w:val="top"/>
+          </w:tcPr>
+          <w:p>
+            <w:r>
+              <w:t/>
+            </w:r>
+          </w:p>
+        </w:tc>
+        <w:tc>
+          <w:tcPr>
+            <w:tcW w:type="dxa" w:w="3674"/>
+            <w:tcBorders>
+              <w:top w:val="single" w:color="000000" w:sz="8" w:space="0" w:shadow="0" w:frame="0"/>
+              <w:left w:val="single" w:color="000000" w:sz="8" w:space="0" w:shadow="0" w:frame="0"/>
+              <w:bottom w:val="single" w:color="000000" w:sz="8" w:space="0" w:shadow="0" w:frame="0"/>
+              <w:right w:val="single" w:color="000000" w:sz="8" w:space="0" w:shadow="0" w:frame="0"/>
+            </w:tcBorders>
+            <w:shd w:val="clear" w:color="auto" w:fill="auto"/>
+            <w:tcMar>
+              <w:top w:type="dxa" w:w="80"/>
+              <w:left w:type="dxa" w:w="80"/>
+              <w:bottom w:type="dxa" w:w="80"/>
+              <w:right w:type="dxa" w:w="80"/>
+            </w:tcMar>
+            <w:vAlign w:val="top"/>
+          </w:tcPr>
+          <w:p>
+            <w:r>
+              <w:t/>
+            </w:r>
+          </w:p>
+        </w:tc>
+        <w:tc>
+          <w:tcPr>
+            <w:tcW w:type="dxa" w:w="3674"/>
+            <w:tcBorders>
+              <w:top w:val="single" w:color="000000" w:sz="8" w:space="0" w:shadow="0" w:frame="0"/>
+              <w:left w:val="single" w:color="000000" w:sz="8" w:space="0" w:shadow="0" w:frame="0"/>
+              <w:bottom w:val="single" w:color="000000" w:sz="8" w:space="0" w:shadow="0" w:frame="0"/>
+              <w:right w:val="single" w:color="000000" w:sz="8" w:space="0" w:shadow="0" w:frame="0"/>
+            </w:tcBorders>
+            <w:shd w:val="clear" w:color="auto" w:fill="auto"/>
+            <w:tcMar>
+              <w:top w:type="dxa" w:w="80"/>
+              <w:left w:type="dxa" w:w="80"/>
+              <w:bottom w:type="dxa" w:w="80"/>
+              <w:right w:type="dxa" w:w="80"/>
+            </w:tcMar>
+            <w:vAlign w:val="top"/>
+          </w:tcPr>
+          <w:p>
+            <w:r>
+              <w:t/>
+            </w:r>
+          </w:p>
+        </w:tc>
+      </w:tr>
+      <w:tr>
+        <w:tblPrEx>
+          <w:shd w:val="clear" w:color="auto" w:fill="ced7e7"/>
+        </w:tblPrEx>
+        <w:trPr>
+          <w:trHeight w:val="420" w:hRule="atLeast"/>
+        </w:trPr>
+        <w:tc>
+          <w:tcPr>
+            <w:tcW w:type="dxa" w:w="3674"/>
+            <w:tcBorders>
+              <w:top w:val="single" w:color="000000" w:sz="8" w:space="0" w:shadow="0" w:frame="0"/>
+              <w:left w:val="single" w:color="000000" w:sz="8" w:space="0" w:shadow="0" w:frame="0"/>
+              <w:bottom w:val="single" w:color="000000" w:sz="8" w:space="0" w:shadow="0" w:frame="0"/>
+              <w:right w:val="single" w:color="000000" w:sz="8" w:space="0" w:shadow="0" w:frame="0"/>
+            </w:tcBorders>
+            <w:shd w:val="clear" w:color="auto" w:fill="auto"/>
+            <w:tcMar>
+              <w:top w:type="dxa" w:w="80"/>
+              <w:left w:type="dxa" w:w="80"/>
+              <w:bottom w:type="dxa" w:w="80"/>
+              <w:right w:type="dxa" w:w="80"/>
+            </w:tcMar>
+            <w:vAlign w:val="top"/>
+          </w:tcPr>
+          <w:p>
+            <w:r>
+              <w:t/>
+            </w:r>
+          </w:p>
+        </w:tc>
+        <w:tc>
+          <w:tcPr>
+            <w:tcW w:type="dxa" w:w="3674"/>
+            <w:tcBorders>
+              <w:top w:val="single" w:color="000000" w:sz="8" w:space="0" w:shadow="0" w:frame="0"/>
+              <w:left w:val="single" w:color="000000" w:sz="8" w:space="0" w:shadow="0" w:frame="0"/>
+              <w:bottom w:val="single" w:color="000000" w:sz="8" w:space="0" w:shadow="0" w:frame="0"/>
+              <w:right w:val="single" w:color="000000" w:sz="8" w:space="0" w:shadow="0" w:frame="0"/>
+            </w:tcBorders>
+            <w:shd w:val="clear" w:color="auto" w:fill="auto"/>
+            <w:tcMar>
+              <w:top w:type="dxa" w:w="80"/>
+              <w:left w:type="dxa" w:w="80"/>
+              <w:bottom w:type="dxa" w:w="80"/>
+              <w:right w:type="dxa" w:w="80"/>
+            </w:tcMar>
+            <w:vAlign w:val="top"/>
+          </w:tcPr>
+          <w:p>
+            <w:r>
+              <w:t/>
+            </w:r>
+          </w:p>
+        </w:tc>
+        <w:tc>
+          <w:tcPr>
+            <w:tcW w:type="dxa" w:w="3674"/>
+            <w:tcBorders>
+              <w:top w:val="single" w:color="000000" w:sz="8" w:space="0" w:shadow="0" w:frame="0"/>
+              <w:left w:val="single" w:color="000000" w:sz="8" w:space="0" w:shadow="0" w:frame="0"/>
+              <w:bottom w:val="single" w:color="000000" w:sz="8" w:space="0" w:shadow="0" w:frame="0"/>
+              <w:right w:val="single" w:color="000000" w:sz="8" w:space="0" w:shadow="0" w:frame="0"/>
+            </w:tcBorders>
+            <w:shd w:val="clear" w:color="auto" w:fill="auto"/>
+            <w:tcMar>
+              <w:top w:type="dxa" w:w="80"/>
+              <w:left w:type="dxa" w:w="80"/>
+              <w:bottom w:type="dxa" w:w="80"/>
+              <w:right w:type="dxa" w:w="80"/>
+            </w:tcMar>
+            <w:vAlign w:val="top"/>
+          </w:tcPr>
+          <w:p>
+            <w:r>
+              <w:t/>
+            </w:r>
+          </w:p>
+        </w:tc>
+      </w:tr>
+      <w:tr>
+        <w:tblPrEx>
+          <w:shd w:val="clear" w:color="auto" w:fill="ced7e7"/>
+        </w:tblPrEx>
+        <w:trPr>
+          <w:trHeight w:val="420" w:hRule="atLeast"/>
+        </w:trPr>
+        <w:tc>
+          <w:tcPr>
+            <w:tcW w:type="dxa" w:w="3674"/>
+            <w:tcBorders>
+              <w:top w:val="single" w:color="000000" w:sz="8" w:space="0" w:shadow="0" w:frame="0"/>
+              <w:left w:val="single" w:color="000000" w:sz="8" w:space="0" w:shadow="0" w:frame="0"/>
+              <w:bottom w:val="single" w:color="000000" w:sz="8" w:space="0" w:shadow="0" w:frame="0"/>
+              <w:right w:val="single" w:color="000000" w:sz="8" w:space="0" w:shadow="0" w:frame="0"/>
+            </w:tcBorders>
+            <w:shd w:val="clear" w:color="auto" w:fill="auto"/>
+            <w:tcMar>
+              <w:top w:type="dxa" w:w="80"/>
+              <w:left w:type="dxa" w:w="80"/>
+              <w:bottom w:type="dxa" w:w="80"/>
+              <w:right w:type="dxa" w:w="80"/>
+            </w:tcMar>
+            <w:vAlign w:val="top"/>
+          </w:tcPr>
+          <w:p>
+            <w:r>
+              <w:t/>
+            </w:r>
+          </w:p>
+        </w:tc>
+        <w:tc>
+          <w:tcPr>
+            <w:tcW w:type="dxa" w:w="3674"/>
+            <w:tcBorders>
+              <w:top w:val="single" w:color="000000" w:sz="8" w:space="0" w:shadow="0" w:frame="0"/>
+              <w:left w:val="single" w:color="000000" w:sz="8" w:space="0" w:shadow="0" w:frame="0"/>
+              <w:bottom w:val="single" w:color="000000" w:sz="8" w:space="0" w:shadow="0" w:frame="0"/>
+              <w:right w:val="single" w:color="000000" w:sz="8" w:space="0" w:shadow="0" w:frame="0"/>
+            </w:tcBorders>
+            <w:shd w:val="clear" w:color="auto" w:fill="auto"/>
+            <w:tcMar>
+              <w:top w:type="dxa" w:w="80"/>
+              <w:left w:type="dxa" w:w="80"/>
+              <w:bottom w:type="dxa" w:w="80"/>
+              <w:right w:type="dxa" w:w="80"/>
+            </w:tcMar>
+            <w:vAlign w:val="top"/>
+          </w:tcPr>
+          <w:p>
+            <w:r>
+              <w:t/>
+            </w:r>
+          </w:p>
+        </w:tc>
+        <w:tc>
+          <w:tcPr>
+            <w:tcW w:type="dxa" w:w="3674"/>
+            <w:tcBorders>
+              <w:top w:val="single" w:color="000000" w:sz="8" w:space="0" w:shadow="0" w:frame="0"/>
+              <w:left w:val="single" w:color="000000" w:sz="8" w:space="0" w:shadow="0" w:frame="0"/>
+              <w:bottom w:val="single" w:color="000000" w:sz="8" w:space="0" w:shadow="0" w:frame="0"/>
+              <w:right w:val="single" w:color="000000" w:sz="8" w:space="0" w:shadow="0" w:frame="0"/>
+            </w:tcBorders>
+            <w:shd w:val="clear" w:color="auto" w:fill="auto"/>
+            <w:tcMar>
+              <w:top w:type="dxa" w:w="80"/>
+              <w:left w:type="dxa" w:w="80"/>
+              <w:bottom w:type="dxa" w:w="80"/>
+              <w:right w:type="dxa" w:w="80"/>
+            </w:tcMar>
+            <w:vAlign w:val="top"/>
+          </w:tcPr>
+          <w:p>
+            <w:r>
+              <w:t/>
+            </w:r>
+          </w:p>
+        </w:tc>
+      </w:tr>
+      <w:tr>
+        <w:tblPrEx>
+          <w:shd w:val="clear" w:color="auto" w:fill="ced7e7"/>
+        </w:tblPrEx>
+        <w:trPr>
+          <w:trHeight w:val="420" w:hRule="atLeast"/>
+        </w:trPr>
+        <w:tc>
+          <w:tcPr>
+            <w:tcW w:type="dxa" w:w="3674"/>
+            <w:tcBorders>
+              <w:top w:val="single" w:color="000000" w:sz="8" w:space="0" w:shadow="0" w:frame="0"/>
+              <w:left w:val="single" w:color="000000" w:sz="8" w:space="0" w:shadow="0" w:frame="0"/>
+              <w:bottom w:val="single" w:color="000000" w:sz="8" w:space="0" w:shadow="0" w:frame="0"/>
+              <w:right w:val="single" w:color="000000" w:sz="8" w:space="0" w:shadow="0" w:frame="0"/>
+            </w:tcBorders>
+            <w:shd w:val="clear" w:color="auto" w:fill="auto"/>
+            <w:tcMar>
+              <w:top w:type="dxa" w:w="80"/>
+              <w:left w:type="dxa" w:w="80"/>
+              <w:bottom w:type="dxa" w:w="80"/>
+              <w:right w:type="dxa" w:w="80"/>
+            </w:tcMar>
+            <w:vAlign w:val="top"/>
+          </w:tcPr>
+          <w:p>
+            <w:r>
+              <w:t/>
+            </w:r>
+          </w:p>
+        </w:tc>
+        <w:tc>
+          <w:tcPr>
+            <w:tcW w:type="dxa" w:w="3674"/>
+            <w:tcBorders>
+              <w:top w:val="single" w:color="000000" w:sz="8" w:space="0" w:shadow="0" w:frame="0"/>
+              <w:left w:val="single" w:color="000000" w:sz="8" w:space="0" w:shadow="0" w:frame="0"/>
+              <w:bottom w:val="single" w:color="000000" w:sz="8" w:space="0" w:shadow="0" w:frame="0"/>
+              <w:right w:val="single" w:color="000000" w:sz="8" w:space="0" w:shadow="0" w:frame="0"/>
+            </w:tcBorders>
+            <w:shd w:val="clear" w:color="auto" w:fill="auto"/>
+            <w:tcMar>
+              <w:top w:type="dxa" w:w="80"/>
+              <w:left w:type="dxa" w:w="80"/>
+              <w:bottom w:type="dxa" w:w="80"/>
+              <w:right w:type="dxa" w:w="80"/>
+            </w:tcMar>
+            <w:vAlign w:val="top"/>
+          </w:tcPr>
+          <w:p>
+            <w:r>
+              <w:t/>
+            </w:r>
+          </w:p>
+        </w:tc>
+        <w:tc>
+          <w:tcPr>
+            <w:tcW w:type="dxa" w:w="3674"/>
+            <w:tcBorders>
+              <w:top w:val="single" w:color="000000" w:sz="8" w:space="0" w:shadow="0" w:frame="0"/>
+              <w:left w:val="single" w:color="000000" w:sz="8" w:space="0" w:shadow="0" w:frame="0"/>
+              <w:bottom w:val="single" w:color="000000" w:sz="8" w:space="0" w:shadow="0" w:frame="0"/>
+              <w:right w:val="single" w:color="000000" w:sz="8" w:space="0" w:shadow="0" w:frame="0"/>
+            </w:tcBorders>
+            <w:shd w:val="clear" w:color="auto" w:fill="auto"/>
+            <w:tcMar>
+              <w:top w:type="dxa" w:w="80"/>
+              <w:left w:type="dxa" w:w="80"/>
+              <w:bottom w:type="dxa" w:w="80"/>
+              <w:right w:type="dxa" w:w="80"/>
+            </w:tcMar>
+            <w:vAlign w:val="top"/>
+          </w:tcPr>
+          <w:p>
+            <w:r>
+              <w:t/>
+            </w:r>
+          </w:p>
+        </w:tc>
+      </w:tr>
     </w:tbl>
     <w:p>
       <w:pPr>
@@ -24274,54 +24580,7 @@
             </w14:solidFill>
           </w14:textFill>
         </w:rPr>
-        <w:t xml:space="preserve">Section 4 </w:t>
-      </w:r>
-      <w:r>
-        <w:rPr>
-          <w:caps w:val="0"/>
-          <w:smallCaps w:val="0"/>
-          <w:strike w:val="0"/>
-          <w:dstrike w:val="0"/>
-          <w:outline w:val="0"/>
-          <w:color w:val="030303"/>
-          <w:sz w:val="27"/>
-          <w:szCs w:val="27"/>
-          <w:u w:val="none" w:color="030303"/>
-          <w:shd w:val="nil" w:color="auto" w:fill="auto"/>
-          <w:vertAlign w:val="baseline"/>
-          <w:rtl w:val="0"/>
-          <w14:textFill>
-            <w14:solidFill>
-              <w14:srgbClr w14:val="030303"/>
-            </w14:solidFill>
-          </w14:textFill>
-        </w:rPr>
-        <w:t xml:space="preserve">-  </w:t>
-      </w:r>
-      <w:r>
-        <w:rPr>
-          <w:b w:val="1"/>
-          <w:bCs w:val="1"/>
-          <w:caps w:val="0"/>
-          <w:smallCaps w:val="0"/>
-          <w:strike w:val="0"/>
-          <w:dstrike w:val="0"/>
-          <w:outline w:val="0"/>
-          <w:color w:val="030303"/>
-          <w:sz w:val="27"/>
-          <w:szCs w:val="27"/>
-          <w:u w:val="none" w:color="030303"/>
-          <w:shd w:val="nil" w:color="auto" w:fill="auto"/>
-          <w:vertAlign w:val="baseline"/>
-          <w:rtl w:val="0"/>
-          <w:lang w:val="en-US"/>
-          <w14:textFill>
-            <w14:solidFill>
-              <w14:srgbClr w14:val="030303"/>
-            </w14:solidFill>
-          </w14:textFill>
-        </w:rPr>
-        <w:t>High-Value and Titled Personal Property</w:t>
+        <w:t>Section 4 - High-Value and Titled Personal Property</w:t>
       </w:r>
     </w:p>
     <w:p>
@@ -24600,7 +24859,7 @@
           <w:shd w:val="clear" w:color="auto" w:fill="ced7e7"/>
         </w:tblPrEx>
         <w:trPr>
-          <w:trHeight w:val="250" w:hRule="atLeast"/>
+          <w:trHeight w:val="420" w:hRule="atLeast"/>
         </w:trPr>
         <w:tc>
           <w:tcPr>
@@ -24648,7 +24907,7 @@
           <w:shd w:val="clear" w:color="auto" w:fill="ced7e7"/>
         </w:tblPrEx>
         <w:trPr>
-          <w:trHeight w:val="250" w:hRule="atLeast"/>
+          <w:trHeight w:val="420" w:hRule="atLeast"/>
         </w:trPr>
         <w:tc>
           <w:tcPr>
@@ -24696,7 +24955,7 @@
           <w:shd w:val="clear" w:color="auto" w:fill="ced7e7"/>
         </w:tblPrEx>
         <w:trPr>
-          <w:trHeight w:val="250" w:hRule="atLeast"/>
+          <w:trHeight w:val="420" w:hRule="atLeast"/>
         </w:trPr>
         <w:tc>
           <w:tcPr>
@@ -24744,7 +25003,7 @@
           <w:shd w:val="clear" w:color="auto" w:fill="ced7e7"/>
         </w:tblPrEx>
         <w:trPr>
-          <w:trHeight w:val="250" w:hRule="atLeast"/>
+          <w:trHeight w:val="420" w:hRule="atLeast"/>
         </w:trPr>
         <w:tc>
           <w:tcPr>
@@ -24787,6 +25046,230 @@
           <w:p/>
         </w:tc>
       </w:tr>
+      <w:tr>
+        <w:tblPrEx>
+          <w:shd w:val="clear" w:color="auto" w:fill="ced7e7"/>
+        </w:tblPrEx>
+        <w:trPr>
+          <w:trHeight w:val="420" w:hRule="atLeast"/>
+        </w:trPr>
+        <w:tc>
+          <w:tcPr>
+            <w:tcW w:type="dxa" w:w="5511"/>
+            <w:tcBorders>
+              <w:top w:val="single" w:color="000000" w:sz="8" w:space="0" w:shadow="0" w:frame="0"/>
+              <w:left w:val="single" w:color="000000" w:sz="8" w:space="0" w:shadow="0" w:frame="0"/>
+              <w:bottom w:val="single" w:color="000000" w:sz="8" w:space="0" w:shadow="0" w:frame="0"/>
+              <w:right w:val="single" w:color="000000" w:sz="8" w:space="0" w:shadow="0" w:frame="0"/>
+            </w:tcBorders>
+            <w:shd w:val="clear" w:color="auto" w:fill="auto"/>
+            <w:tcMar>
+              <w:top w:type="dxa" w:w="80"/>
+              <w:left w:type="dxa" w:w="80"/>
+              <w:bottom w:type="dxa" w:w="80"/>
+              <w:right w:type="dxa" w:w="80"/>
+            </w:tcMar>
+            <w:vAlign w:val="top"/>
+          </w:tcPr>
+          <w:p>
+            <w:r>
+              <w:t/>
+            </w:r>
+          </w:p>
+        </w:tc>
+        <w:tc>
+          <w:tcPr>
+            <w:tcW w:type="dxa" w:w="5511"/>
+            <w:tcBorders>
+              <w:top w:val="single" w:color="000000" w:sz="8" w:space="0" w:shadow="0" w:frame="0"/>
+              <w:left w:val="single" w:color="000000" w:sz="8" w:space="0" w:shadow="0" w:frame="0"/>
+              <w:bottom w:val="single" w:color="000000" w:sz="8" w:space="0" w:shadow="0" w:frame="0"/>
+              <w:right w:val="single" w:color="000000" w:sz="8" w:space="0" w:shadow="0" w:frame="0"/>
+            </w:tcBorders>
+            <w:shd w:val="clear" w:color="auto" w:fill="auto"/>
+            <w:tcMar>
+              <w:top w:type="dxa" w:w="80"/>
+              <w:left w:type="dxa" w:w="80"/>
+              <w:bottom w:type="dxa" w:w="80"/>
+              <w:right w:type="dxa" w:w="80"/>
+            </w:tcMar>
+            <w:vAlign w:val="top"/>
+          </w:tcPr>
+          <w:p>
+            <w:r>
+              <w:t/>
+            </w:r>
+          </w:p>
+        </w:tc>
+      </w:tr>
+      <w:tr>
+        <w:tblPrEx>
+          <w:shd w:val="clear" w:color="auto" w:fill="ced7e7"/>
+        </w:tblPrEx>
+        <w:trPr>
+          <w:trHeight w:val="420" w:hRule="atLeast"/>
+        </w:trPr>
+        <w:tc>
+          <w:tcPr>
+            <w:tcW w:type="dxa" w:w="5511"/>
+            <w:tcBorders>
+              <w:top w:val="single" w:color="000000" w:sz="8" w:space="0" w:shadow="0" w:frame="0"/>
+              <w:left w:val="single" w:color="000000" w:sz="8" w:space="0" w:shadow="0" w:frame="0"/>
+              <w:bottom w:val="single" w:color="000000" w:sz="8" w:space="0" w:shadow="0" w:frame="0"/>
+              <w:right w:val="single" w:color="000000" w:sz="8" w:space="0" w:shadow="0" w:frame="0"/>
+            </w:tcBorders>
+            <w:shd w:val="clear" w:color="auto" w:fill="auto"/>
+            <w:tcMar>
+              <w:top w:type="dxa" w:w="80"/>
+              <w:left w:type="dxa" w:w="80"/>
+              <w:bottom w:type="dxa" w:w="80"/>
+              <w:right w:type="dxa" w:w="80"/>
+            </w:tcMar>
+            <w:vAlign w:val="top"/>
+          </w:tcPr>
+          <w:p>
+            <w:r>
+              <w:t/>
+            </w:r>
+          </w:p>
+        </w:tc>
+        <w:tc>
+          <w:tcPr>
+            <w:tcW w:type="dxa" w:w="5511"/>
+            <w:tcBorders>
+              <w:top w:val="single" w:color="000000" w:sz="8" w:space="0" w:shadow="0" w:frame="0"/>
+              <w:left w:val="single" w:color="000000" w:sz="8" w:space="0" w:shadow="0" w:frame="0"/>
+              <w:bottom w:val="single" w:color="000000" w:sz="8" w:space="0" w:shadow="0" w:frame="0"/>
+              <w:right w:val="single" w:color="000000" w:sz="8" w:space="0" w:shadow="0" w:frame="0"/>
+            </w:tcBorders>
+            <w:shd w:val="clear" w:color="auto" w:fill="auto"/>
+            <w:tcMar>
+              <w:top w:type="dxa" w:w="80"/>
+              <w:left w:type="dxa" w:w="80"/>
+              <w:bottom w:type="dxa" w:w="80"/>
+              <w:right w:type="dxa" w:w="80"/>
+            </w:tcMar>
+            <w:vAlign w:val="top"/>
+          </w:tcPr>
+          <w:p>
+            <w:r>
+              <w:t/>
+            </w:r>
+          </w:p>
+        </w:tc>
+      </w:tr>
+      <w:tr>
+        <w:tblPrEx>
+          <w:shd w:val="clear" w:color="auto" w:fill="ced7e7"/>
+        </w:tblPrEx>
+        <w:trPr>
+          <w:trHeight w:val="420" w:hRule="atLeast"/>
+        </w:trPr>
+        <w:tc>
+          <w:tcPr>
+            <w:tcW w:type="dxa" w:w="5511"/>
+            <w:tcBorders>
+              <w:top w:val="single" w:color="000000" w:sz="8" w:space="0" w:shadow="0" w:frame="0"/>
+              <w:left w:val="single" w:color="000000" w:sz="8" w:space="0" w:shadow="0" w:frame="0"/>
+              <w:bottom w:val="single" w:color="000000" w:sz="8" w:space="0" w:shadow="0" w:frame="0"/>
+              <w:right w:val="single" w:color="000000" w:sz="8" w:space="0" w:shadow="0" w:frame="0"/>
+            </w:tcBorders>
+            <w:shd w:val="clear" w:color="auto" w:fill="auto"/>
+            <w:tcMar>
+              <w:top w:type="dxa" w:w="80"/>
+              <w:left w:type="dxa" w:w="80"/>
+              <w:bottom w:type="dxa" w:w="80"/>
+              <w:right w:type="dxa" w:w="80"/>
+            </w:tcMar>
+            <w:vAlign w:val="top"/>
+          </w:tcPr>
+          <w:p>
+            <w:r>
+              <w:t/>
+            </w:r>
+          </w:p>
+        </w:tc>
+        <w:tc>
+          <w:tcPr>
+            <w:tcW w:type="dxa" w:w="5511"/>
+            <w:tcBorders>
+              <w:top w:val="single" w:color="000000" w:sz="8" w:space="0" w:shadow="0" w:frame="0"/>
+              <w:left w:val="single" w:color="000000" w:sz="8" w:space="0" w:shadow="0" w:frame="0"/>
+              <w:bottom w:val="single" w:color="000000" w:sz="8" w:space="0" w:shadow="0" w:frame="0"/>
+              <w:right w:val="single" w:color="000000" w:sz="8" w:space="0" w:shadow="0" w:frame="0"/>
+            </w:tcBorders>
+            <w:shd w:val="clear" w:color="auto" w:fill="auto"/>
+            <w:tcMar>
+              <w:top w:type="dxa" w:w="80"/>
+              <w:left w:type="dxa" w:w="80"/>
+              <w:bottom w:type="dxa" w:w="80"/>
+              <w:right w:type="dxa" w:w="80"/>
+            </w:tcMar>
+            <w:vAlign w:val="top"/>
+          </w:tcPr>
+          <w:p>
+            <w:r>
+              <w:t/>
+            </w:r>
+          </w:p>
+        </w:tc>
+      </w:tr>
+      <w:tr>
+        <w:tblPrEx>
+          <w:shd w:val="clear" w:color="auto" w:fill="ced7e7"/>
+        </w:tblPrEx>
+        <w:trPr>
+          <w:trHeight w:val="420" w:hRule="atLeast"/>
+        </w:trPr>
+        <w:tc>
+          <w:tcPr>
+            <w:tcW w:type="dxa" w:w="5511"/>
+            <w:tcBorders>
+              <w:top w:val="single" w:color="000000" w:sz="8" w:space="0" w:shadow="0" w:frame="0"/>
+              <w:left w:val="single" w:color="000000" w:sz="8" w:space="0" w:shadow="0" w:frame="0"/>
+              <w:bottom w:val="single" w:color="000000" w:sz="8" w:space="0" w:shadow="0" w:frame="0"/>
+              <w:right w:val="single" w:color="000000" w:sz="8" w:space="0" w:shadow="0" w:frame="0"/>
+            </w:tcBorders>
+            <w:shd w:val="clear" w:color="auto" w:fill="auto"/>
+            <w:tcMar>
+              <w:top w:type="dxa" w:w="80"/>
+              <w:left w:type="dxa" w:w="80"/>
+              <w:bottom w:type="dxa" w:w="80"/>
+              <w:right w:type="dxa" w:w="80"/>
+            </w:tcMar>
+            <w:vAlign w:val="top"/>
+          </w:tcPr>
+          <w:p>
+            <w:r>
+              <w:t/>
+            </w:r>
+          </w:p>
+        </w:tc>
+        <w:tc>
+          <w:tcPr>
+            <w:tcW w:type="dxa" w:w="5511"/>
+            <w:tcBorders>
+              <w:top w:val="single" w:color="000000" w:sz="8" w:space="0" w:shadow="0" w:frame="0"/>
+              <w:left w:val="single" w:color="000000" w:sz="8" w:space="0" w:shadow="0" w:frame="0"/>
+              <w:bottom w:val="single" w:color="000000" w:sz="8" w:space="0" w:shadow="0" w:frame="0"/>
+              <w:right w:val="single" w:color="000000" w:sz="8" w:space="0" w:shadow="0" w:frame="0"/>
+            </w:tcBorders>
+            <w:shd w:val="clear" w:color="auto" w:fill="auto"/>
+            <w:tcMar>
+              <w:top w:type="dxa" w:w="80"/>
+              <w:left w:type="dxa" w:w="80"/>
+              <w:bottom w:type="dxa" w:w="80"/>
+              <w:right w:type="dxa" w:w="80"/>
+            </w:tcMar>
+            <w:vAlign w:val="top"/>
+          </w:tcPr>
+          <w:p>
+            <w:r>
+              <w:t/>
+            </w:r>
+          </w:p>
+        </w:tc>
+      </w:tr>
     </w:tbl>
     <w:p>
       <w:pPr>
@@ -24893,7 +25376,7 @@
     </w:p>
     <w:p>
       <w:pPr>
-        <w:pStyle w:val="Heading"/>
+        <w:pStyle w:val="Heading 2"/>
         <w:ind w:firstLine="362"/>
       </w:pPr>
       <w:r>
@@ -24909,36 +25392,7 @@
             </w14:solidFill>
           </w14:textFill>
         </w:rPr>
-        <w:t>SCHEDULE</w:t>
-      </w:r>
-      <w:r>
-        <w:rPr>
-          <w:outline w:val="0"/>
-          <w:color w:val="030303"/>
-          <w:u w:color="030303"/>
-          <w:rtl w:val="0"/>
-          <w:lang w:val="en-US"/>
-          <w14:textFill>
-            <w14:solidFill>
-              <w14:srgbClr w14:val="030303"/>
-            </w14:solidFill>
-          </w14:textFill>
-        </w:rPr>
-        <w:t xml:space="preserve"> </w:t>
-      </w:r>
-      <w:r>
-        <w:rPr>
-          <w:outline w:val="0"/>
-          <w:color w:val="030303"/>
-          <w:u w:color="030303"/>
-          <w:rtl w:val="0"/>
-          <w14:textFill>
-            <w14:solidFill>
-              <w14:srgbClr w14:val="030303"/>
-            </w14:solidFill>
-          </w14:textFill>
-        </w:rPr>
-        <w:t>B</w:t>
+        <w:t>SCHEDULE B</w:t>
       </w:r>
     </w:p>
     <w:p>

</xml_diff>

<commit_message>
added funeral to pour over will
</commit_message>
<xml_diff>
--- a/static/templates/joint_template.docx
+++ b/static/templates/joint_template.docx
@@ -7061,7 +7061,7 @@
             </w14:solidFill>
           </w14:textFill>
         </w:rPr>
-        <w:t xml:space="preserve">Successor Trustees: </w:t>
+        <w:t xml:space="preserve">Successor Trustees of Husband: </w:t>
       </w:r>
       <w:r>
         <w:rPr>
@@ -7084,7 +7084,7 @@
             </w14:solidFill>
           </w14:textFill>
         </w:rPr>
-        <w:t>If no Grantor is serving as Trustee due to death, incapacity, resignation, or removal, the following individuals shall serve as successor Trustee in the order listed:</w:t>
+        <w:t>With respect to the trust property of {husbandFullName}, if no Grantor is serving as Trustee due to death, incapacity, resignation, or removal, the following individuals shall serve as successor Trustee in the order listed:</w:t>
       </w:r>
     </w:p>
     <w:p>
@@ -7121,7 +7121,7 @@
             </w14:solidFill>
           </w14:textFill>
         </w:rPr>
-        <w:t>{#trustees}</w:t>
+        <w:t>{#husbandTrustees}</w:t>
       </w:r>
     </w:p>
     <w:p>
@@ -7191,7 +7191,188 @@
             </w14:solidFill>
           </w14:textFill>
         </w:rPr>
-        <w:t>{/trustees}</w:t>
+        <w:t>{/husbandTrustees}</w:t>
+      </w:r>
+    </w:p>
+    <w:p>
+      <w:pPr>
+        <w:pStyle w:val="Body"/>
+        <w:numPr>
+          <w:ilvl w:val="0"/>
+          <w:numId w:val="9"/>
+        </w:numPr>
+        <w:bidi w:val="0"/>
+        <w:spacing w:before="78" w:line="312" w:lineRule="auto"/>
+        <w:ind w:right="805"/>
+        <w:jc w:val="left"/>
+        <w:rPr>
+          <w:outline w:val="0"/>
+          <w:color w:val="030303"/>
+          <w:sz w:val="26"/>
+          <w:szCs w:val="26"/>
+          <w:rtl w:val="0"/>
+          <w:lang w:val="en-US"/>
+          <w14:textFill>
+            <w14:solidFill>
+              <w14:srgbClr w14:val="030303"/>
+            </w14:solidFill>
+          </w14:textFill>
+        </w:rPr>
+      </w:pPr>
+      <w:r>
+        <w:rPr>
+          <w:b w:val="1"/>
+          <w:bCs w:val="1"/>
+          <w:caps w:val="0"/>
+          <w:smallCaps w:val="0"/>
+          <w:strike w:val="0"/>
+          <w:dstrike w:val="0"/>
+          <w:outline w:val="0"/>
+          <w:color w:val="030303"/>
+          <w:sz w:val="26"/>
+          <w:szCs w:val="26"/>
+          <w:u w:val="none" w:color="030303"/>
+          <w:shd w:val="nil" w:color="auto" w:fill="auto"/>
+          <w:vertAlign w:val="baseline"/>
+          <w:rtl w:val="0"/>
+          <w:lang w:val="en-US"/>
+          <w14:textFill>
+            <w14:solidFill>
+              <w14:srgbClr w14:val="030303"/>
+            </w14:solidFill>
+          </w14:textFill>
+        </w:rPr>
+        <w:t xml:space="preserve">Successor Trustees of Wife: </w:t>
+      </w:r>
+      <w:r>
+        <w:rPr>
+          <w:caps w:val="0"/>
+          <w:smallCaps w:val="0"/>
+          <w:strike w:val="0"/>
+          <w:dstrike w:val="0"/>
+          <w:outline w:val="0"/>
+          <w:color w:val="030303"/>
+          <w:sz w:val="26"/>
+          <w:szCs w:val="26"/>
+          <w:u w:val="none" w:color="030303"/>
+          <w:shd w:val="nil" w:color="auto" w:fill="auto"/>
+          <w:vertAlign w:val="baseline"/>
+          <w:rtl w:val="0"/>
+          <w:lang w:val="en-US"/>
+          <w14:textFill>
+            <w14:solidFill>
+              <w14:srgbClr w14:val="030303"/>
+            </w14:solidFill>
+          </w14:textFill>
+        </w:rPr>
+        <w:t>With respect to the trust property of {wifeFullName}, if no Grantor is serving as Trustee due to death, incapacity, resignation, or removal, the following individuals shall serve as successor Trustee in the order listed:</w:t>
+      </w:r>
+    </w:p>
+    <w:p>
+      <w:pPr>
+        <w:pStyle w:val="Body"/>
+        <w:tabs>
+          <w:tab w:val="left" w:pos="1564"/>
+        </w:tabs>
+        <w:spacing w:before="142"/>
+        <w:rPr>
+          <w:outline w:val="0"/>
+          <w:color w:val="030303"/>
+          <w:sz w:val="27"/>
+          <w:szCs w:val="27"/>
+          <w:u w:color="030303"/>
+          <w14:textFill>
+            <w14:solidFill>
+              <w14:srgbClr w14:val="030303"/>
+            </w14:solidFill>
+          </w14:textFill>
+        </w:rPr>
+      </w:pPr>
+      <w:r>
+        <w:rPr>
+          <w:outline w:val="0"/>
+          <w:color w:val="030303"/>
+          <w:sz w:val="27"/>
+          <w:szCs w:val="27"/>
+          <w:u w:color="030303"/>
+          <w:rtl w:val="0"/>
+          <w14:textFill>
+            <w14:solidFill>
+              <w14:srgbClr w14:val="030303"/>
+            </w14:solidFill>
+          </w14:textFill>
+        </w:rPr>
+        <w:t>{#wifeTrustees}</w:t>
+      </w:r>
+    </w:p>
+    <w:p>
+      <w:pPr>
+        <w:pStyle w:val="Body"/>
+        <w:numPr>
+          <w:ilvl w:val="1"/>
+          <w:numId w:val="36"/>
+        </w:numPr>
+        <w:spacing w:before="142"/>
+        <w:rPr>
+          <w:sz w:val="27"/>
+          <w:szCs w:val="27"/>
+          <w:lang w:val="en-US"/>
+        </w:rPr>
+      </w:pPr>
+      <w:r>
+        <w:rPr>
+          <w:outline w:val="0"/>
+          <w:color w:val="030303"/>
+          <w:sz w:val="27"/>
+          <w:szCs w:val="27"/>
+          <w:u w:color="030303"/>
+          <w:rtl w:val="0"/>
+          <w:lang w:val="en-US"/>
+          <w14:textFill>
+            <w14:solidFill>
+              <w14:srgbClr w14:val="030303"/>
+            </w14:solidFill>
+          </w14:textFill>
+        </w:rPr>
+        <w:t>{.}</w:t>
+        <w:tab/>
+      </w:r>
+    </w:p>
+    <w:p>
+      <w:pPr>
+        <w:pStyle w:val="Body"/>
+        <w:tabs>
+          <w:tab w:val="left" w:pos="1564"/>
+        </w:tabs>
+        <w:spacing w:before="142"/>
+        <w:rPr>
+          <w:outline w:val="0"/>
+          <w:color w:val="030303"/>
+          <w:sz w:val="27"/>
+          <w:szCs w:val="27"/>
+          <w:u w:color="030303"/>
+          <w14:textFill>
+            <w14:solidFill>
+              <w14:srgbClr w14:val="030303"/>
+            </w14:solidFill>
+          </w14:textFill>
+        </w:rPr>
+      </w:pPr>
+      <w:r>
+        <w:rPr>
+          <w:outline w:val="0"/>
+          <w:color w:val="030303"/>
+          <w:sz w:val="27"/>
+          <w:szCs w:val="27"/>
+          <w:u w:color="030303"/>
+          <w:rtl w:val="0"/>
+          <w14:textFill>
+            <w14:solidFill>
+              <w14:srgbClr w14:val="030303"/>
+            </w14:solidFill>
+          </w14:textFill>
+        </w:rPr>
+        <w:t>{/wifeTrustees}</w:t>
       </w:r>
     </w:p>
     <w:p>
@@ -7239,7 +7420,7 @@
             </w14:solidFill>
           </w14:textFill>
         </w:rPr>
-        <w:t>Only one successor Trustee shall serve at a time, and each successor shall serve individually.</w:t>
+        <w:t>Only one successor Trustee shall serve at a time with respect to each Grantor's trust property, and each successor shall serve individually.</w:t>
       </w:r>
     </w:p>
     <w:p>
@@ -21125,2162 +21306,6 @@
     <w:p>
       <w:pPr>
         <w:pStyle w:val="Body"/>
-        <w:tabs>
-          <w:tab w:val="left" w:pos="1739"/>
-        </w:tabs>
-        <w:ind w:left="361" w:firstLine="0"/>
-        <w:rPr>
-          <w:b w:val="1"/>
-          <w:bCs w:val="1"/>
-          <w:caps w:val="0"/>
-          <w:smallCaps w:val="0"/>
-          <w:strike w:val="0"/>
-          <w:dstrike w:val="0"/>
-          <w:outline w:val="0"/>
-          <w:color w:val="000000"/>
-          <w:sz w:val="27"/>
-          <w:szCs w:val="27"/>
-          <w:u w:val="none" w:color="000000"/>
-          <w:shd w:val="nil" w:color="auto" w:fill="auto"/>
-          <w:vertAlign w:val="baseline"/>
-          <w14:textFill>
-            <w14:solidFill>
-              <w14:srgbClr w14:val="000000"/>
-            </w14:solidFill>
-          </w14:textFill>
-        </w:rPr>
-      </w:pPr>
-      <w:r>
-        <w:rPr>
-          <w:b w:val="1"/>
-          <w:bCs w:val="1"/>
-          <w:caps w:val="0"/>
-          <w:smallCaps w:val="0"/>
-          <w:strike w:val="0"/>
-          <w:dstrike w:val="0"/>
-          <w:outline w:val="0"/>
-          <w:color w:val="030303"/>
-          <w:sz w:val="27"/>
-          <w:szCs w:val="27"/>
-          <w:u w:val="none" w:color="030303"/>
-          <w:shd w:val="nil" w:color="auto" w:fill="auto"/>
-          <w:vertAlign w:val="baseline"/>
-          <w:rtl w:val="0"/>
-          <w:lang w:val="en-US"/>
-          <w14:textFill>
-            <w14:solidFill>
-              <w14:srgbClr w14:val="030303"/>
-            </w14:solidFill>
-          </w14:textFill>
-        </w:rPr>
-        <w:t>Section 1 - Husband's Separate Property</w:t>
-      </w:r>
-    </w:p>
-    <w:p>
-      <w:pPr>
-        <w:pStyle w:val="Body"/>
-        <w:spacing w:before="288" w:line="314" w:lineRule="auto"/>
-        <w:ind w:left="369" w:hanging="18"/>
-        <w:rPr>
-          <w:rFonts w:ascii="Arial" w:cs="Arial" w:hAnsi="Arial" w:eastAsia="Arial"/>
-          <w:i w:val="1"/>
-          <w:iCs w:val="1"/>
-          <w:sz w:val="24"/>
-          <w:szCs w:val="24"/>
-        </w:rPr>
-      </w:pPr>
-      <w:r>
-        <w:rPr>
-          <w:rFonts w:ascii="Arial" w:hAnsi="Arial"/>
-          <w:i w:val="1"/>
-          <w:iCs w:val="1"/>
-          <w:outline w:val="0"/>
-          <w:color w:val="030303"/>
-          <w:sz w:val="24"/>
-          <w:szCs w:val="24"/>
-          <w:u w:color="030303"/>
-          <w:rtl w:val="0"/>
-          <w:lang w:val="en-US"/>
-          <w14:textFill>
-            <w14:solidFill>
-              <w14:srgbClr w14:val="030303"/>
-            </w14:solidFill>
-          </w14:textFill>
-        </w:rPr>
-        <w:t>This Section lists any property owned by {husbandFullName} before marriage, or received by {husbandFullName} during marriage as a gift or inheritance from a third party.</w:t>
-      </w:r>
-    </w:p>
-    <w:p>
-      <w:pPr>
-        <w:pStyle w:val="Body"/>
-        <w:tabs>
-          <w:tab w:val="left" w:pos="3407"/>
-          <w:tab w:val="left" w:pos="8253"/>
-        </w:tabs>
-        <w:spacing w:before="1"/>
-        <w:ind w:left="497" w:firstLine="0"/>
-        <w:rPr>
-          <w:b w:val="1"/>
-          <w:bCs w:val="1"/>
-          <w:outline w:val="0"/>
-          <w:color w:val="030303"/>
-          <w:sz w:val="23"/>
-          <w:szCs w:val="23"/>
-          <w:u w:color="030303"/>
-          <w14:textFill>
-            <w14:solidFill>
-              <w14:srgbClr w14:val="030303"/>
-            </w14:solidFill>
-          </w14:textFill>
-        </w:rPr>
-      </w:pPr>
-    </w:p>
-    <w:p>
-      <w:pPr>
-        <w:pStyle w:val="Body"/>
-        <w:tabs>
-          <w:tab w:val="left" w:pos="3407"/>
-          <w:tab w:val="left" w:pos="8253"/>
-        </w:tabs>
-        <w:spacing w:before="1"/>
-        <w:ind w:left="497" w:firstLine="0"/>
-        <w:rPr>
-          <w:b w:val="1"/>
-          <w:bCs w:val="1"/>
-          <w:outline w:val="0"/>
-          <w:color w:val="030303"/>
-          <w:sz w:val="23"/>
-          <w:szCs w:val="23"/>
-          <w:u w:color="030303"/>
-          <w14:textFill>
-            <w14:solidFill>
-              <w14:srgbClr w14:val="030303"/>
-            </w14:solidFill>
-          </w14:textFill>
-        </w:rPr>
-      </w:pPr>
-    </w:p>
-    <w:tbl>
-      <w:tblPr>
-        <w:tblW w:w="11022" w:type="dxa"/>
-        <w:jc w:val="left"/>
-        <w:tblInd w:w="605" w:type="dxa"/>
-        <w:tblBorders>
-          <w:top w:val="single" w:color="ffffff" w:sz="8" w:space="0" w:shadow="0" w:frame="0"/>
-          <w:left w:val="single" w:color="ffffff" w:sz="8" w:space="0" w:shadow="0" w:frame="0"/>
-          <w:bottom w:val="single" w:color="ffffff" w:sz="8" w:space="0" w:shadow="0" w:frame="0"/>
-          <w:right w:val="single" w:color="ffffff" w:sz="8" w:space="0" w:shadow="0" w:frame="0"/>
-          <w:insideH w:val="single" w:color="ffffff" w:sz="8" w:space="0" w:shadow="0" w:frame="0"/>
-          <w:insideV w:val="single" w:color="ffffff" w:sz="8" w:space="0" w:shadow="0" w:frame="0"/>
-        </w:tblBorders>
-        <w:shd w:val="clear" w:color="auto" w:fill="ced7e7"/>
-        <w:tblLayout w:type="fixed"/>
-      </w:tblPr>
-      <w:tblGrid>
-        <w:gridCol w:w="3674"/>
-        <w:gridCol w:w="3674"/>
-        <w:gridCol w:w="3674"/>
-      </w:tblGrid>
-      <w:tr>
-        <w:tblPrEx>
-          <w:shd w:val="clear" w:color="auto" w:fill="ced7e7"/>
-        </w:tblPrEx>
-        <w:trPr>
-          <w:trHeight w:val="310" w:hRule="atLeast"/>
-        </w:trPr>
-        <w:tc>
-          <w:tcPr>
-            <w:tcW w:type="dxa" w:w="3674"/>
-            <w:tcBorders>
-              <w:top w:val="single" w:color="000000" w:sz="8" w:space="0" w:shadow="0" w:frame="0"/>
-              <w:left w:val="single" w:color="000000" w:sz="8" w:space="0" w:shadow="0" w:frame="0"/>
-              <w:bottom w:val="single" w:color="000000" w:sz="8" w:space="0" w:shadow="0" w:frame="0"/>
-              <w:right w:val="single" w:color="000000" w:sz="8" w:space="0" w:shadow="0" w:frame="0"/>
-            </w:tcBorders>
-            <w:shd w:val="clear" w:color="auto" w:fill="auto"/>
-            <w:tcMar>
-              <w:top w:type="dxa" w:w="80"/>
-              <w:left w:type="dxa" w:w="577"/>
-              <w:bottom w:type="dxa" w:w="80"/>
-              <w:right w:type="dxa" w:w="80"/>
-            </w:tcMar>
-            <w:vAlign w:val="top"/>
-          </w:tcPr>
-          <w:p>
-            <w:pPr>
-              <w:pStyle w:val="Body"/>
-              <w:tabs>
-                <w:tab w:val="left" w:pos="5269"/>
-              </w:tabs>
-              <w:ind w:left="497" w:firstLine="0"/>
-            </w:pPr>
-            <w:r>
-              <w:rPr>
-                <w:b w:val="1"/>
-                <w:bCs w:val="1"/>
-                <w:outline w:val="0"/>
-                <w:color w:val="030303"/>
-                <w:sz w:val="24"/>
-                <w:szCs w:val="24"/>
-                <w:u w:color="030303"/>
-                <w:shd w:val="nil" w:color="auto" w:fill="auto"/>
-                <w:rtl w:val="0"/>
-                <w:lang w:val="en-US"/>
-                <w14:textFill>
-                  <w14:solidFill>
-                    <w14:srgbClr w14:val="030303"/>
-                  </w14:solidFill>
-                </w14:textFill>
-              </w:rPr>
-              <w:t>Asset</w:t>
-            </w:r>
-          </w:p>
-        </w:tc>
-        <w:tc>
-          <w:tcPr>
-            <w:tcW w:type="dxa" w:w="3674"/>
-            <w:tcBorders>
-              <w:top w:val="single" w:color="000000" w:sz="8" w:space="0" w:shadow="0" w:frame="0"/>
-              <w:left w:val="single" w:color="000000" w:sz="8" w:space="0" w:shadow="0" w:frame="0"/>
-              <w:bottom w:val="single" w:color="000000" w:sz="8" w:space="0" w:shadow="0" w:frame="0"/>
-              <w:right w:val="single" w:color="000000" w:sz="8" w:space="0" w:shadow="0" w:frame="0"/>
-            </w:tcBorders>
-            <w:shd w:val="clear" w:color="auto" w:fill="auto"/>
-            <w:tcMar>
-              <w:top w:type="dxa" w:w="80"/>
-              <w:left w:type="dxa" w:w="80"/>
-              <w:bottom w:type="dxa" w:w="80"/>
-              <w:right w:type="dxa" w:w="80"/>
-            </w:tcMar>
-            <w:vAlign w:val="top"/>
-          </w:tcPr>
-          <w:p>
-            <w:pPr>
-              <w:pStyle w:val="Body"/>
-            </w:pPr>
-            <w:r>
-              <w:rPr>
-                <w:b w:val="1"/>
-                <w:bCs w:val="1"/>
-                <w:outline w:val="0"/>
-                <w:color w:val="030303"/>
-                <w:sz w:val="23"/>
-                <w:szCs w:val="23"/>
-                <w:u w:color="030303"/>
-                <w:shd w:val="nil" w:color="auto" w:fill="auto"/>
-                <w:rtl w:val="0"/>
-                <w:lang w:val="en-US"/>
-                <w14:textFill>
-                  <w14:solidFill>
-                    <w14:srgbClr w14:val="030303"/>
-                  </w14:solidFill>
-                </w14:textFill>
-              </w:rPr>
-              <w:t>Approximate Value</w:t>
-            </w:r>
-          </w:p>
-        </w:tc>
-        <w:tc>
-          <w:tcPr>
-            <w:tcW w:type="dxa" w:w="3674"/>
-            <w:tcBorders>
-              <w:top w:val="single" w:color="000000" w:sz="8" w:space="0" w:shadow="0" w:frame="0"/>
-              <w:left w:val="single" w:color="000000" w:sz="8" w:space="0" w:shadow="0" w:frame="0"/>
-              <w:bottom w:val="single" w:color="000000" w:sz="8" w:space="0" w:shadow="0" w:frame="0"/>
-              <w:right w:val="single" w:color="000000" w:sz="8" w:space="0" w:shadow="0" w:frame="0"/>
-            </w:tcBorders>
-            <w:shd w:val="clear" w:color="auto" w:fill="auto"/>
-            <w:tcMar>
-              <w:top w:type="dxa" w:w="80"/>
-              <w:left w:type="dxa" w:w="80"/>
-              <w:bottom w:type="dxa" w:w="80"/>
-              <w:right w:type="dxa" w:w="80"/>
-            </w:tcMar>
-            <w:vAlign w:val="top"/>
-          </w:tcPr>
-          <w:p>
-            <w:pPr>
-              <w:pStyle w:val="Body"/>
-            </w:pPr>
-            <w:r>
-              <w:rPr>
-                <w:b w:val="1"/>
-                <w:bCs w:val="1"/>
-                <w:outline w:val="0"/>
-                <w:color w:val="030303"/>
-                <w:sz w:val="23"/>
-                <w:szCs w:val="23"/>
-                <w:u w:color="030303"/>
-                <w:shd w:val="nil" w:color="auto" w:fill="auto"/>
-                <w:rtl w:val="0"/>
-                <w:lang w:val="en-US"/>
-                <w14:textFill>
-                  <w14:solidFill>
-                    <w14:srgbClr w14:val="030303"/>
-                  </w14:solidFill>
-                </w14:textFill>
-              </w:rPr>
-              <w:t>Account ID</w:t>
-            </w:r>
-          </w:p>
-        </w:tc>
-      </w:tr>
-      <w:tr>
-        <w:tblPrEx>
-          <w:shd w:val="clear" w:color="auto" w:fill="ced7e7"/>
-        </w:tblPrEx>
-        <w:trPr>
-          <w:trHeight w:val="490" w:hRule="atLeast"/>
-        </w:trPr>
-        <w:tc>
-          <w:tcPr>
-            <w:tcW w:type="dxa" w:w="3674"/>
-            <w:tcBorders>
-              <w:top w:val="single" w:color="000000" w:sz="8" w:space="0" w:shadow="0" w:frame="0"/>
-              <w:left w:val="single" w:color="000000" w:sz="8" w:space="0" w:shadow="0" w:frame="0"/>
-              <w:bottom w:val="single" w:color="000000" w:sz="8" w:space="0" w:shadow="0" w:frame="0"/>
-              <w:right w:val="single" w:color="000000" w:sz="8" w:space="0" w:shadow="0" w:frame="0"/>
-            </w:tcBorders>
-            <w:shd w:val="clear" w:color="auto" w:fill="auto"/>
-            <w:tcMar>
-              <w:top w:type="dxa" w:w="80"/>
-              <w:left w:type="dxa" w:w="80"/>
-              <w:bottom w:type="dxa" w:w="80"/>
-              <w:right w:type="dxa" w:w="80"/>
-            </w:tcMar>
-            <w:vAlign w:val="top"/>
-          </w:tcPr>
-          <w:p>
-            <w:pPr>
-              <w:pStyle w:val="Body"/>
-            </w:pPr>
-            <w:r>
-              <w:rPr>
-                <w:outline w:val="0"/>
-                <w:color w:val="030303"/>
-                <w:sz w:val="23"/>
-                <w:szCs w:val="23"/>
-                <w:u w:color="030303"/>
-                <w:shd w:val="nil" w:color="auto" w:fill="auto"/>
-                <w:rtl w:val="0"/>
-                <w:lang w:val="en-US"/>
-                <w14:textFill>
-                  <w14:solidFill>
-                    <w14:srgbClr w14:val="030303"/>
-                  </w14:solidFill>
-                </w14:textFill>
-              </w:rPr>
-              <w:t>{#husbandSeparateProperty}{assetName}</w:t>
-            </w:r>
-          </w:p>
-        </w:tc>
-        <w:tc>
-          <w:tcPr>
-            <w:tcW w:type="dxa" w:w="3674"/>
-            <w:tcBorders>
-              <w:top w:val="single" w:color="000000" w:sz="8" w:space="0" w:shadow="0" w:frame="0"/>
-              <w:left w:val="single" w:color="000000" w:sz="8" w:space="0" w:shadow="0" w:frame="0"/>
-              <w:bottom w:val="single" w:color="000000" w:sz="8" w:space="0" w:shadow="0" w:frame="0"/>
-              <w:right w:val="single" w:color="000000" w:sz="8" w:space="0" w:shadow="0" w:frame="0"/>
-            </w:tcBorders>
-            <w:shd w:val="clear" w:color="auto" w:fill="auto"/>
-            <w:tcMar>
-              <w:top w:type="dxa" w:w="80"/>
-              <w:left w:type="dxa" w:w="80"/>
-              <w:bottom w:type="dxa" w:w="80"/>
-              <w:right w:type="dxa" w:w="80"/>
-            </w:tcMar>
-            <w:vAlign w:val="top"/>
-          </w:tcPr>
-          <w:p>
-            <w:pPr>
-              <w:pStyle w:val="Body"/>
-            </w:pPr>
-            <w:r>
-              <w:rPr>
-                <w:outline w:val="0"/>
-                <w:color w:val="030303"/>
-                <w:sz w:val="23"/>
-                <w:szCs w:val="23"/>
-                <w:u w:color="030303"/>
-                <w:shd w:val="nil" w:color="auto" w:fill="auto"/>
-                <w:rtl w:val="0"/>
-                <w:lang w:val="en-US"/>
-                <w14:textFill>
-                  <w14:solidFill>
-                    <w14:srgbClr w14:val="030303"/>
-                  </w14:solidFill>
-                </w14:textFill>
-              </w:rPr>
-              <w:t>{approximateValue}</w:t>
-            </w:r>
-          </w:p>
-        </w:tc>
-        <w:tc>
-          <w:tcPr>
-            <w:tcW w:type="dxa" w:w="3674"/>
-            <w:tcBorders>
-              <w:top w:val="single" w:color="000000" w:sz="8" w:space="0" w:shadow="0" w:frame="0"/>
-              <w:left w:val="single" w:color="000000" w:sz="8" w:space="0" w:shadow="0" w:frame="0"/>
-              <w:bottom w:val="single" w:color="000000" w:sz="8" w:space="0" w:shadow="0" w:frame="0"/>
-              <w:right w:val="single" w:color="000000" w:sz="8" w:space="0" w:shadow="0" w:frame="0"/>
-            </w:tcBorders>
-            <w:shd w:val="clear" w:color="auto" w:fill="auto"/>
-            <w:tcMar>
-              <w:top w:type="dxa" w:w="80"/>
-              <w:left w:type="dxa" w:w="80"/>
-              <w:bottom w:type="dxa" w:w="80"/>
-              <w:right w:type="dxa" w:w="80"/>
-            </w:tcMar>
-            <w:vAlign w:val="top"/>
-          </w:tcPr>
-          <w:p>
-            <w:pPr>
-              <w:pStyle w:val="Body"/>
-            </w:pPr>
-            <w:r>
-              <w:rPr>
-                <w:outline w:val="0"/>
-                <w:color w:val="030303"/>
-                <w:sz w:val="23"/>
-                <w:szCs w:val="23"/>
-                <w:u w:color="030303"/>
-                <w:shd w:val="nil" w:color="auto" w:fill="auto"/>
-                <w:rtl w:val="0"/>
-                <w:lang w:val="en-US"/>
-                <w14:textFill>
-                  <w14:solidFill>
-                    <w14:srgbClr w14:val="030303"/>
-                  </w14:solidFill>
-                </w14:textFill>
-              </w:rPr>
-              <w:t>{accountId}{/husbandSeparateProperty}</w:t>
-            </w:r>
-          </w:p>
-        </w:tc>
-      </w:tr>
-      <w:tr>
-        <w:tblPrEx>
-          <w:shd w:val="clear" w:color="auto" w:fill="ced7e7"/>
-        </w:tblPrEx>
-        <w:trPr>
-          <w:trHeight w:val="420" w:hRule="atLeast"/>
-        </w:trPr>
-        <w:tc>
-          <w:tcPr>
-            <w:tcW w:type="dxa" w:w="3674"/>
-            <w:tcBorders>
-              <w:top w:val="single" w:color="000000" w:sz="8" w:space="0" w:shadow="0" w:frame="0"/>
-              <w:left w:val="single" w:color="000000" w:sz="8" w:space="0" w:shadow="0" w:frame="0"/>
-              <w:bottom w:val="single" w:color="000000" w:sz="8" w:space="0" w:shadow="0" w:frame="0"/>
-              <w:right w:val="single" w:color="000000" w:sz="8" w:space="0" w:shadow="0" w:frame="0"/>
-            </w:tcBorders>
-            <w:shd w:val="clear" w:color="auto" w:fill="auto"/>
-            <w:tcMar>
-              <w:top w:type="dxa" w:w="80"/>
-              <w:left w:type="dxa" w:w="80"/>
-              <w:bottom w:type="dxa" w:w="80"/>
-              <w:right w:type="dxa" w:w="80"/>
-            </w:tcMar>
-            <w:vAlign w:val="top"/>
-          </w:tcPr>
-          <w:p/>
-        </w:tc>
-        <w:tc>
-          <w:tcPr>
-            <w:tcW w:type="dxa" w:w="3674"/>
-            <w:tcBorders>
-              <w:top w:val="single" w:color="000000" w:sz="8" w:space="0" w:shadow="0" w:frame="0"/>
-              <w:left w:val="single" w:color="000000" w:sz="8" w:space="0" w:shadow="0" w:frame="0"/>
-              <w:bottom w:val="single" w:color="000000" w:sz="8" w:space="0" w:shadow="0" w:frame="0"/>
-              <w:right w:val="single" w:color="000000" w:sz="8" w:space="0" w:shadow="0" w:frame="0"/>
-            </w:tcBorders>
-            <w:shd w:val="clear" w:color="auto" w:fill="auto"/>
-            <w:tcMar>
-              <w:top w:type="dxa" w:w="80"/>
-              <w:left w:type="dxa" w:w="80"/>
-              <w:bottom w:type="dxa" w:w="80"/>
-              <w:right w:type="dxa" w:w="80"/>
-            </w:tcMar>
-            <w:vAlign w:val="top"/>
-          </w:tcPr>
-          <w:p/>
-        </w:tc>
-        <w:tc>
-          <w:tcPr>
-            <w:tcW w:type="dxa" w:w="3674"/>
-            <w:tcBorders>
-              <w:top w:val="single" w:color="000000" w:sz="8" w:space="0" w:shadow="0" w:frame="0"/>
-              <w:left w:val="single" w:color="000000" w:sz="8" w:space="0" w:shadow="0" w:frame="0"/>
-              <w:bottom w:val="single" w:color="000000" w:sz="8" w:space="0" w:shadow="0" w:frame="0"/>
-              <w:right w:val="single" w:color="000000" w:sz="8" w:space="0" w:shadow="0" w:frame="0"/>
-            </w:tcBorders>
-            <w:shd w:val="clear" w:color="auto" w:fill="auto"/>
-            <w:tcMar>
-              <w:top w:type="dxa" w:w="80"/>
-              <w:left w:type="dxa" w:w="80"/>
-              <w:bottom w:type="dxa" w:w="80"/>
-              <w:right w:type="dxa" w:w="80"/>
-            </w:tcMar>
-            <w:vAlign w:val="top"/>
-          </w:tcPr>
-          <w:p/>
-        </w:tc>
-      </w:tr>
-      <w:tr>
-        <w:tblPrEx>
-          <w:shd w:val="clear" w:color="auto" w:fill="ced7e7"/>
-        </w:tblPrEx>
-        <w:trPr>
-          <w:trHeight w:val="420" w:hRule="atLeast"/>
-        </w:trPr>
-        <w:tc>
-          <w:tcPr>
-            <w:tcW w:type="dxa" w:w="3674"/>
-            <w:tcBorders>
-              <w:top w:val="single" w:color="000000" w:sz="8" w:space="0" w:shadow="0" w:frame="0"/>
-              <w:left w:val="single" w:color="000000" w:sz="8" w:space="0" w:shadow="0" w:frame="0"/>
-              <w:bottom w:val="single" w:color="000000" w:sz="8" w:space="0" w:shadow="0" w:frame="0"/>
-              <w:right w:val="single" w:color="000000" w:sz="8" w:space="0" w:shadow="0" w:frame="0"/>
-            </w:tcBorders>
-            <w:shd w:val="clear" w:color="auto" w:fill="auto"/>
-            <w:tcMar>
-              <w:top w:type="dxa" w:w="80"/>
-              <w:left w:type="dxa" w:w="80"/>
-              <w:bottom w:type="dxa" w:w="80"/>
-              <w:right w:type="dxa" w:w="80"/>
-            </w:tcMar>
-            <w:vAlign w:val="top"/>
-          </w:tcPr>
-          <w:p/>
-        </w:tc>
-        <w:tc>
-          <w:tcPr>
-            <w:tcW w:type="dxa" w:w="3674"/>
-            <w:tcBorders>
-              <w:top w:val="single" w:color="000000" w:sz="8" w:space="0" w:shadow="0" w:frame="0"/>
-              <w:left w:val="single" w:color="000000" w:sz="8" w:space="0" w:shadow="0" w:frame="0"/>
-              <w:bottom w:val="single" w:color="000000" w:sz="8" w:space="0" w:shadow="0" w:frame="0"/>
-              <w:right w:val="single" w:color="000000" w:sz="8" w:space="0" w:shadow="0" w:frame="0"/>
-            </w:tcBorders>
-            <w:shd w:val="clear" w:color="auto" w:fill="auto"/>
-            <w:tcMar>
-              <w:top w:type="dxa" w:w="80"/>
-              <w:left w:type="dxa" w:w="80"/>
-              <w:bottom w:type="dxa" w:w="80"/>
-              <w:right w:type="dxa" w:w="80"/>
-            </w:tcMar>
-            <w:vAlign w:val="top"/>
-          </w:tcPr>
-          <w:p/>
-        </w:tc>
-        <w:tc>
-          <w:tcPr>
-            <w:tcW w:type="dxa" w:w="3674"/>
-            <w:tcBorders>
-              <w:top w:val="single" w:color="000000" w:sz="8" w:space="0" w:shadow="0" w:frame="0"/>
-              <w:left w:val="single" w:color="000000" w:sz="8" w:space="0" w:shadow="0" w:frame="0"/>
-              <w:bottom w:val="single" w:color="000000" w:sz="8" w:space="0" w:shadow="0" w:frame="0"/>
-              <w:right w:val="single" w:color="000000" w:sz="8" w:space="0" w:shadow="0" w:frame="0"/>
-            </w:tcBorders>
-            <w:shd w:val="clear" w:color="auto" w:fill="auto"/>
-            <w:tcMar>
-              <w:top w:type="dxa" w:w="80"/>
-              <w:left w:type="dxa" w:w="80"/>
-              <w:bottom w:type="dxa" w:w="80"/>
-              <w:right w:type="dxa" w:w="80"/>
-            </w:tcMar>
-            <w:vAlign w:val="top"/>
-          </w:tcPr>
-          <w:p/>
-        </w:tc>
-      </w:tr>
-      <w:tr>
-        <w:tblPrEx>
-          <w:shd w:val="clear" w:color="auto" w:fill="ced7e7"/>
-        </w:tblPrEx>
-        <w:trPr>
-          <w:trHeight w:val="420" w:hRule="atLeast"/>
-        </w:trPr>
-        <w:tc>
-          <w:tcPr>
-            <w:tcW w:type="dxa" w:w="3674"/>
-            <w:tcBorders>
-              <w:top w:val="single" w:color="000000" w:sz="8" w:space="0" w:shadow="0" w:frame="0"/>
-              <w:left w:val="single" w:color="000000" w:sz="8" w:space="0" w:shadow="0" w:frame="0"/>
-              <w:bottom w:val="single" w:color="000000" w:sz="8" w:space="0" w:shadow="0" w:frame="0"/>
-              <w:right w:val="single" w:color="000000" w:sz="8" w:space="0" w:shadow="0" w:frame="0"/>
-            </w:tcBorders>
-            <w:shd w:val="clear" w:color="auto" w:fill="auto"/>
-            <w:tcMar>
-              <w:top w:type="dxa" w:w="80"/>
-              <w:left w:type="dxa" w:w="80"/>
-              <w:bottom w:type="dxa" w:w="80"/>
-              <w:right w:type="dxa" w:w="80"/>
-            </w:tcMar>
-            <w:vAlign w:val="top"/>
-          </w:tcPr>
-          <w:p/>
-        </w:tc>
-        <w:tc>
-          <w:tcPr>
-            <w:tcW w:type="dxa" w:w="3674"/>
-            <w:tcBorders>
-              <w:top w:val="single" w:color="000000" w:sz="8" w:space="0" w:shadow="0" w:frame="0"/>
-              <w:left w:val="single" w:color="000000" w:sz="8" w:space="0" w:shadow="0" w:frame="0"/>
-              <w:bottom w:val="single" w:color="000000" w:sz="8" w:space="0" w:shadow="0" w:frame="0"/>
-              <w:right w:val="single" w:color="000000" w:sz="8" w:space="0" w:shadow="0" w:frame="0"/>
-            </w:tcBorders>
-            <w:shd w:val="clear" w:color="auto" w:fill="auto"/>
-            <w:tcMar>
-              <w:top w:type="dxa" w:w="80"/>
-              <w:left w:type="dxa" w:w="80"/>
-              <w:bottom w:type="dxa" w:w="80"/>
-              <w:right w:type="dxa" w:w="80"/>
-            </w:tcMar>
-            <w:vAlign w:val="top"/>
-          </w:tcPr>
-          <w:p/>
-        </w:tc>
-        <w:tc>
-          <w:tcPr>
-            <w:tcW w:type="dxa" w:w="3674"/>
-            <w:tcBorders>
-              <w:top w:val="single" w:color="000000" w:sz="8" w:space="0" w:shadow="0" w:frame="0"/>
-              <w:left w:val="single" w:color="000000" w:sz="8" w:space="0" w:shadow="0" w:frame="0"/>
-              <w:bottom w:val="single" w:color="000000" w:sz="8" w:space="0" w:shadow="0" w:frame="0"/>
-              <w:right w:val="single" w:color="000000" w:sz="8" w:space="0" w:shadow="0" w:frame="0"/>
-            </w:tcBorders>
-            <w:shd w:val="clear" w:color="auto" w:fill="auto"/>
-            <w:tcMar>
-              <w:top w:type="dxa" w:w="80"/>
-              <w:left w:type="dxa" w:w="80"/>
-              <w:bottom w:type="dxa" w:w="80"/>
-              <w:right w:type="dxa" w:w="80"/>
-            </w:tcMar>
-            <w:vAlign w:val="top"/>
-          </w:tcPr>
-          <w:p/>
-        </w:tc>
-      </w:tr>
-      <w:tr>
-        <w:tblPrEx>
-          <w:shd w:val="clear" w:color="auto" w:fill="ced7e7"/>
-        </w:tblPrEx>
-        <w:trPr>
-          <w:trHeight w:val="420" w:hRule="atLeast"/>
-        </w:trPr>
-        <w:tc>
-          <w:tcPr>
-            <w:tcW w:type="dxa" w:w="3674"/>
-            <w:tcBorders>
-              <w:top w:val="single" w:color="000000" w:sz="8" w:space="0" w:shadow="0" w:frame="0"/>
-              <w:left w:val="single" w:color="000000" w:sz="8" w:space="0" w:shadow="0" w:frame="0"/>
-              <w:bottom w:val="single" w:color="000000" w:sz="8" w:space="0" w:shadow="0" w:frame="0"/>
-              <w:right w:val="single" w:color="000000" w:sz="8" w:space="0" w:shadow="0" w:frame="0"/>
-            </w:tcBorders>
-            <w:shd w:val="clear" w:color="auto" w:fill="auto"/>
-            <w:tcMar>
-              <w:top w:type="dxa" w:w="80"/>
-              <w:left w:type="dxa" w:w="80"/>
-              <w:bottom w:type="dxa" w:w="80"/>
-              <w:right w:type="dxa" w:w="80"/>
-            </w:tcMar>
-            <w:vAlign w:val="top"/>
-          </w:tcPr>
-          <w:p/>
-        </w:tc>
-        <w:tc>
-          <w:tcPr>
-            <w:tcW w:type="dxa" w:w="3674"/>
-            <w:tcBorders>
-              <w:top w:val="single" w:color="000000" w:sz="8" w:space="0" w:shadow="0" w:frame="0"/>
-              <w:left w:val="single" w:color="000000" w:sz="8" w:space="0" w:shadow="0" w:frame="0"/>
-              <w:bottom w:val="single" w:color="000000" w:sz="8" w:space="0" w:shadow="0" w:frame="0"/>
-              <w:right w:val="single" w:color="000000" w:sz="8" w:space="0" w:shadow="0" w:frame="0"/>
-            </w:tcBorders>
-            <w:shd w:val="clear" w:color="auto" w:fill="auto"/>
-            <w:tcMar>
-              <w:top w:type="dxa" w:w="80"/>
-              <w:left w:type="dxa" w:w="80"/>
-              <w:bottom w:type="dxa" w:w="80"/>
-              <w:right w:type="dxa" w:w="80"/>
-            </w:tcMar>
-            <w:vAlign w:val="top"/>
-          </w:tcPr>
-          <w:p/>
-        </w:tc>
-        <w:tc>
-          <w:tcPr>
-            <w:tcW w:type="dxa" w:w="3674"/>
-            <w:tcBorders>
-              <w:top w:val="single" w:color="000000" w:sz="8" w:space="0" w:shadow="0" w:frame="0"/>
-              <w:left w:val="single" w:color="000000" w:sz="8" w:space="0" w:shadow="0" w:frame="0"/>
-              <w:bottom w:val="single" w:color="000000" w:sz="8" w:space="0" w:shadow="0" w:frame="0"/>
-              <w:right w:val="single" w:color="000000" w:sz="8" w:space="0" w:shadow="0" w:frame="0"/>
-            </w:tcBorders>
-            <w:shd w:val="clear" w:color="auto" w:fill="auto"/>
-            <w:tcMar>
-              <w:top w:type="dxa" w:w="80"/>
-              <w:left w:type="dxa" w:w="80"/>
-              <w:bottom w:type="dxa" w:w="80"/>
-              <w:right w:type="dxa" w:w="80"/>
-            </w:tcMar>
-            <w:vAlign w:val="top"/>
-          </w:tcPr>
-          <w:p/>
-        </w:tc>
-      </w:tr>
-      <w:tr>
-        <w:tblPrEx>
-          <w:shd w:val="clear" w:color="auto" w:fill="ced7e7"/>
-        </w:tblPrEx>
-        <w:trPr>
-          <w:trHeight w:val="420" w:hRule="atLeast"/>
-        </w:trPr>
-        <w:tc>
-          <w:tcPr>
-            <w:tcW w:type="dxa" w:w="3674"/>
-            <w:tcBorders>
-              <w:top w:val="single" w:color="000000" w:sz="8" w:space="0" w:shadow="0" w:frame="0"/>
-              <w:left w:val="single" w:color="000000" w:sz="8" w:space="0" w:shadow="0" w:frame="0"/>
-              <w:bottom w:val="single" w:color="000000" w:sz="8" w:space="0" w:shadow="0" w:frame="0"/>
-              <w:right w:val="single" w:color="000000" w:sz="8" w:space="0" w:shadow="0" w:frame="0"/>
-            </w:tcBorders>
-            <w:shd w:val="clear" w:color="auto" w:fill="auto"/>
-            <w:tcMar>
-              <w:top w:type="dxa" w:w="80"/>
-              <w:left w:type="dxa" w:w="80"/>
-              <w:bottom w:type="dxa" w:w="80"/>
-              <w:right w:type="dxa" w:w="80"/>
-            </w:tcMar>
-            <w:vAlign w:val="top"/>
-          </w:tcPr>
-          <w:p>
-            <w:r>
-              <w:t/>
-            </w:r>
-          </w:p>
-        </w:tc>
-        <w:tc>
-          <w:tcPr>
-            <w:tcW w:type="dxa" w:w="3674"/>
-            <w:tcBorders>
-              <w:top w:val="single" w:color="000000" w:sz="8" w:space="0" w:shadow="0" w:frame="0"/>
-              <w:left w:val="single" w:color="000000" w:sz="8" w:space="0" w:shadow="0" w:frame="0"/>
-              <w:bottom w:val="single" w:color="000000" w:sz="8" w:space="0" w:shadow="0" w:frame="0"/>
-              <w:right w:val="single" w:color="000000" w:sz="8" w:space="0" w:shadow="0" w:frame="0"/>
-            </w:tcBorders>
-            <w:shd w:val="clear" w:color="auto" w:fill="auto"/>
-            <w:tcMar>
-              <w:top w:type="dxa" w:w="80"/>
-              <w:left w:type="dxa" w:w="80"/>
-              <w:bottom w:type="dxa" w:w="80"/>
-              <w:right w:type="dxa" w:w="80"/>
-            </w:tcMar>
-            <w:vAlign w:val="top"/>
-          </w:tcPr>
-          <w:p>
-            <w:r>
-              <w:t/>
-            </w:r>
-          </w:p>
-        </w:tc>
-        <w:tc>
-          <w:tcPr>
-            <w:tcW w:type="dxa" w:w="3674"/>
-            <w:tcBorders>
-              <w:top w:val="single" w:color="000000" w:sz="8" w:space="0" w:shadow="0" w:frame="0"/>
-              <w:left w:val="single" w:color="000000" w:sz="8" w:space="0" w:shadow="0" w:frame="0"/>
-              <w:bottom w:val="single" w:color="000000" w:sz="8" w:space="0" w:shadow="0" w:frame="0"/>
-              <w:right w:val="single" w:color="000000" w:sz="8" w:space="0" w:shadow="0" w:frame="0"/>
-            </w:tcBorders>
-            <w:shd w:val="clear" w:color="auto" w:fill="auto"/>
-            <w:tcMar>
-              <w:top w:type="dxa" w:w="80"/>
-              <w:left w:type="dxa" w:w="80"/>
-              <w:bottom w:type="dxa" w:w="80"/>
-              <w:right w:type="dxa" w:w="80"/>
-            </w:tcMar>
-            <w:vAlign w:val="top"/>
-          </w:tcPr>
-          <w:p>
-            <w:r>
-              <w:t/>
-            </w:r>
-          </w:p>
-        </w:tc>
-      </w:tr>
-      <w:tr>
-        <w:tblPrEx>
-          <w:shd w:val="clear" w:color="auto" w:fill="ced7e7"/>
-        </w:tblPrEx>
-        <w:trPr>
-          <w:trHeight w:val="420" w:hRule="atLeast"/>
-        </w:trPr>
-        <w:tc>
-          <w:tcPr>
-            <w:tcW w:type="dxa" w:w="3674"/>
-            <w:tcBorders>
-              <w:top w:val="single" w:color="000000" w:sz="8" w:space="0" w:shadow="0" w:frame="0"/>
-              <w:left w:val="single" w:color="000000" w:sz="8" w:space="0" w:shadow="0" w:frame="0"/>
-              <w:bottom w:val="single" w:color="000000" w:sz="8" w:space="0" w:shadow="0" w:frame="0"/>
-              <w:right w:val="single" w:color="000000" w:sz="8" w:space="0" w:shadow="0" w:frame="0"/>
-            </w:tcBorders>
-            <w:shd w:val="clear" w:color="auto" w:fill="auto"/>
-            <w:tcMar>
-              <w:top w:type="dxa" w:w="80"/>
-              <w:left w:type="dxa" w:w="80"/>
-              <w:bottom w:type="dxa" w:w="80"/>
-              <w:right w:type="dxa" w:w="80"/>
-            </w:tcMar>
-            <w:vAlign w:val="top"/>
-          </w:tcPr>
-          <w:p>
-            <w:r>
-              <w:t/>
-            </w:r>
-          </w:p>
-        </w:tc>
-        <w:tc>
-          <w:tcPr>
-            <w:tcW w:type="dxa" w:w="3674"/>
-            <w:tcBorders>
-              <w:top w:val="single" w:color="000000" w:sz="8" w:space="0" w:shadow="0" w:frame="0"/>
-              <w:left w:val="single" w:color="000000" w:sz="8" w:space="0" w:shadow="0" w:frame="0"/>
-              <w:bottom w:val="single" w:color="000000" w:sz="8" w:space="0" w:shadow="0" w:frame="0"/>
-              <w:right w:val="single" w:color="000000" w:sz="8" w:space="0" w:shadow="0" w:frame="0"/>
-            </w:tcBorders>
-            <w:shd w:val="clear" w:color="auto" w:fill="auto"/>
-            <w:tcMar>
-              <w:top w:type="dxa" w:w="80"/>
-              <w:left w:type="dxa" w:w="80"/>
-              <w:bottom w:type="dxa" w:w="80"/>
-              <w:right w:type="dxa" w:w="80"/>
-            </w:tcMar>
-            <w:vAlign w:val="top"/>
-          </w:tcPr>
-          <w:p>
-            <w:r>
-              <w:t/>
-            </w:r>
-          </w:p>
-        </w:tc>
-        <w:tc>
-          <w:tcPr>
-            <w:tcW w:type="dxa" w:w="3674"/>
-            <w:tcBorders>
-              <w:top w:val="single" w:color="000000" w:sz="8" w:space="0" w:shadow="0" w:frame="0"/>
-              <w:left w:val="single" w:color="000000" w:sz="8" w:space="0" w:shadow="0" w:frame="0"/>
-              <w:bottom w:val="single" w:color="000000" w:sz="8" w:space="0" w:shadow="0" w:frame="0"/>
-              <w:right w:val="single" w:color="000000" w:sz="8" w:space="0" w:shadow="0" w:frame="0"/>
-            </w:tcBorders>
-            <w:shd w:val="clear" w:color="auto" w:fill="auto"/>
-            <w:tcMar>
-              <w:top w:type="dxa" w:w="80"/>
-              <w:left w:type="dxa" w:w="80"/>
-              <w:bottom w:type="dxa" w:w="80"/>
-              <w:right w:type="dxa" w:w="80"/>
-            </w:tcMar>
-            <w:vAlign w:val="top"/>
-          </w:tcPr>
-          <w:p>
-            <w:r>
-              <w:t/>
-            </w:r>
-          </w:p>
-        </w:tc>
-      </w:tr>
-      <w:tr>
-        <w:tblPrEx>
-          <w:shd w:val="clear" w:color="auto" w:fill="ced7e7"/>
-        </w:tblPrEx>
-        <w:trPr>
-          <w:trHeight w:val="420" w:hRule="atLeast"/>
-        </w:trPr>
-        <w:tc>
-          <w:tcPr>
-            <w:tcW w:type="dxa" w:w="3674"/>
-            <w:tcBorders>
-              <w:top w:val="single" w:color="000000" w:sz="8" w:space="0" w:shadow="0" w:frame="0"/>
-              <w:left w:val="single" w:color="000000" w:sz="8" w:space="0" w:shadow="0" w:frame="0"/>
-              <w:bottom w:val="single" w:color="000000" w:sz="8" w:space="0" w:shadow="0" w:frame="0"/>
-              <w:right w:val="single" w:color="000000" w:sz="8" w:space="0" w:shadow="0" w:frame="0"/>
-            </w:tcBorders>
-            <w:shd w:val="clear" w:color="auto" w:fill="auto"/>
-            <w:tcMar>
-              <w:top w:type="dxa" w:w="80"/>
-              <w:left w:type="dxa" w:w="80"/>
-              <w:bottom w:type="dxa" w:w="80"/>
-              <w:right w:type="dxa" w:w="80"/>
-            </w:tcMar>
-            <w:vAlign w:val="top"/>
-          </w:tcPr>
-          <w:p>
-            <w:r>
-              <w:t/>
-            </w:r>
-          </w:p>
-        </w:tc>
-        <w:tc>
-          <w:tcPr>
-            <w:tcW w:type="dxa" w:w="3674"/>
-            <w:tcBorders>
-              <w:top w:val="single" w:color="000000" w:sz="8" w:space="0" w:shadow="0" w:frame="0"/>
-              <w:left w:val="single" w:color="000000" w:sz="8" w:space="0" w:shadow="0" w:frame="0"/>
-              <w:bottom w:val="single" w:color="000000" w:sz="8" w:space="0" w:shadow="0" w:frame="0"/>
-              <w:right w:val="single" w:color="000000" w:sz="8" w:space="0" w:shadow="0" w:frame="0"/>
-            </w:tcBorders>
-            <w:shd w:val="clear" w:color="auto" w:fill="auto"/>
-            <w:tcMar>
-              <w:top w:type="dxa" w:w="80"/>
-              <w:left w:type="dxa" w:w="80"/>
-              <w:bottom w:type="dxa" w:w="80"/>
-              <w:right w:type="dxa" w:w="80"/>
-            </w:tcMar>
-            <w:vAlign w:val="top"/>
-          </w:tcPr>
-          <w:p>
-            <w:r>
-              <w:t/>
-            </w:r>
-          </w:p>
-        </w:tc>
-        <w:tc>
-          <w:tcPr>
-            <w:tcW w:type="dxa" w:w="3674"/>
-            <w:tcBorders>
-              <w:top w:val="single" w:color="000000" w:sz="8" w:space="0" w:shadow="0" w:frame="0"/>
-              <w:left w:val="single" w:color="000000" w:sz="8" w:space="0" w:shadow="0" w:frame="0"/>
-              <w:bottom w:val="single" w:color="000000" w:sz="8" w:space="0" w:shadow="0" w:frame="0"/>
-              <w:right w:val="single" w:color="000000" w:sz="8" w:space="0" w:shadow="0" w:frame="0"/>
-            </w:tcBorders>
-            <w:shd w:val="clear" w:color="auto" w:fill="auto"/>
-            <w:tcMar>
-              <w:top w:type="dxa" w:w="80"/>
-              <w:left w:type="dxa" w:w="80"/>
-              <w:bottom w:type="dxa" w:w="80"/>
-              <w:right w:type="dxa" w:w="80"/>
-            </w:tcMar>
-            <w:vAlign w:val="top"/>
-          </w:tcPr>
-          <w:p>
-            <w:r>
-              <w:t/>
-            </w:r>
-          </w:p>
-        </w:tc>
-      </w:tr>
-      <w:tr>
-        <w:tblPrEx>
-          <w:shd w:val="clear" w:color="auto" w:fill="ced7e7"/>
-        </w:tblPrEx>
-        <w:trPr>
-          <w:trHeight w:val="420" w:hRule="atLeast"/>
-        </w:trPr>
-        <w:tc>
-          <w:tcPr>
-            <w:tcW w:type="dxa" w:w="3674"/>
-            <w:tcBorders>
-              <w:top w:val="single" w:color="000000" w:sz="8" w:space="0" w:shadow="0" w:frame="0"/>
-              <w:left w:val="single" w:color="000000" w:sz="8" w:space="0" w:shadow="0" w:frame="0"/>
-              <w:bottom w:val="single" w:color="000000" w:sz="8" w:space="0" w:shadow="0" w:frame="0"/>
-              <w:right w:val="single" w:color="000000" w:sz="8" w:space="0" w:shadow="0" w:frame="0"/>
-            </w:tcBorders>
-            <w:shd w:val="clear" w:color="auto" w:fill="auto"/>
-            <w:tcMar>
-              <w:top w:type="dxa" w:w="80"/>
-              <w:left w:type="dxa" w:w="80"/>
-              <w:bottom w:type="dxa" w:w="80"/>
-              <w:right w:type="dxa" w:w="80"/>
-            </w:tcMar>
-            <w:vAlign w:val="top"/>
-          </w:tcPr>
-          <w:p>
-            <w:r>
-              <w:t/>
-            </w:r>
-          </w:p>
-        </w:tc>
-        <w:tc>
-          <w:tcPr>
-            <w:tcW w:type="dxa" w:w="3674"/>
-            <w:tcBorders>
-              <w:top w:val="single" w:color="000000" w:sz="8" w:space="0" w:shadow="0" w:frame="0"/>
-              <w:left w:val="single" w:color="000000" w:sz="8" w:space="0" w:shadow="0" w:frame="0"/>
-              <w:bottom w:val="single" w:color="000000" w:sz="8" w:space="0" w:shadow="0" w:frame="0"/>
-              <w:right w:val="single" w:color="000000" w:sz="8" w:space="0" w:shadow="0" w:frame="0"/>
-            </w:tcBorders>
-            <w:shd w:val="clear" w:color="auto" w:fill="auto"/>
-            <w:tcMar>
-              <w:top w:type="dxa" w:w="80"/>
-              <w:left w:type="dxa" w:w="80"/>
-              <w:bottom w:type="dxa" w:w="80"/>
-              <w:right w:type="dxa" w:w="80"/>
-            </w:tcMar>
-            <w:vAlign w:val="top"/>
-          </w:tcPr>
-          <w:p>
-            <w:r>
-              <w:t/>
-            </w:r>
-          </w:p>
-        </w:tc>
-        <w:tc>
-          <w:tcPr>
-            <w:tcW w:type="dxa" w:w="3674"/>
-            <w:tcBorders>
-              <w:top w:val="single" w:color="000000" w:sz="8" w:space="0" w:shadow="0" w:frame="0"/>
-              <w:left w:val="single" w:color="000000" w:sz="8" w:space="0" w:shadow="0" w:frame="0"/>
-              <w:bottom w:val="single" w:color="000000" w:sz="8" w:space="0" w:shadow="0" w:frame="0"/>
-              <w:right w:val="single" w:color="000000" w:sz="8" w:space="0" w:shadow="0" w:frame="0"/>
-            </w:tcBorders>
-            <w:shd w:val="clear" w:color="auto" w:fill="auto"/>
-            <w:tcMar>
-              <w:top w:type="dxa" w:w="80"/>
-              <w:left w:type="dxa" w:w="80"/>
-              <w:bottom w:type="dxa" w:w="80"/>
-              <w:right w:type="dxa" w:w="80"/>
-            </w:tcMar>
-            <w:vAlign w:val="top"/>
-          </w:tcPr>
-          <w:p>
-            <w:r>
-              <w:t/>
-            </w:r>
-          </w:p>
-        </w:tc>
-      </w:tr>
-    </w:tbl>
-    <w:p>
-      <w:pPr>
-        <w:pStyle w:val="Body"/>
-        <w:tabs>
-          <w:tab w:val="left" w:pos="3407"/>
-          <w:tab w:val="left" w:pos="8253"/>
-        </w:tabs>
-        <w:spacing w:before="1"/>
-        <w:ind w:left="497" w:hanging="497"/>
-        <w:rPr>
-          <w:b w:val="1"/>
-          <w:bCs w:val="1"/>
-          <w:outline w:val="0"/>
-          <w:color w:val="030303"/>
-          <w:sz w:val="23"/>
-          <w:szCs w:val="23"/>
-          <w:u w:color="030303"/>
-          <w14:textFill>
-            <w14:solidFill>
-              <w14:srgbClr w14:val="030303"/>
-            </w14:solidFill>
-          </w14:textFill>
-        </w:rPr>
-      </w:pPr>
-    </w:p>
-    <w:p>
-      <w:pPr>
-        <w:pStyle w:val="Body"/>
-        <w:tabs>
-          <w:tab w:val="left" w:pos="3407"/>
-          <w:tab w:val="left" w:pos="8253"/>
-        </w:tabs>
-        <w:spacing w:before="1"/>
-        <w:ind w:left="497" w:firstLine="0"/>
-        <w:rPr>
-          <w:b w:val="1"/>
-          <w:bCs w:val="1"/>
-          <w:outline w:val="0"/>
-          <w:color w:val="030303"/>
-          <w:sz w:val="23"/>
-          <w:szCs w:val="23"/>
-          <w:u w:color="030303"/>
-          <w14:textFill>
-            <w14:solidFill>
-              <w14:srgbClr w14:val="030303"/>
-            </w14:solidFill>
-          </w14:textFill>
-        </w:rPr>
-      </w:pPr>
-    </w:p>
-    <w:p>
-      <w:pPr>
-        <w:pStyle w:val="Body"/>
-        <w:ind w:left="361" w:firstLine="0"/>
-        <w:rPr>
-          <w:b w:val="1"/>
-          <w:bCs w:val="1"/>
-          <w:caps w:val="0"/>
-          <w:smallCaps w:val="0"/>
-          <w:strike w:val="0"/>
-          <w:dstrike w:val="0"/>
-          <w:outline w:val="0"/>
-          <w:color w:val="000000"/>
-          <w:sz w:val="27"/>
-          <w:szCs w:val="27"/>
-          <w:u w:val="none" w:color="000000"/>
-          <w:shd w:val="nil" w:color="auto" w:fill="auto"/>
-          <w:vertAlign w:val="baseline"/>
-          <w14:textFill>
-            <w14:solidFill>
-              <w14:srgbClr w14:val="000000"/>
-            </w14:solidFill>
-          </w14:textFill>
-        </w:rPr>
-      </w:pPr>
-      <w:r>
-        <w:rPr>
-          <w:b w:val="1"/>
-          <w:bCs w:val="1"/>
-          <w:caps w:val="0"/>
-          <w:smallCaps w:val="0"/>
-          <w:strike w:val="0"/>
-          <w:dstrike w:val="0"/>
-          <w:outline w:val="0"/>
-          <w:color w:val="030303"/>
-          <w:sz w:val="27"/>
-          <w:szCs w:val="27"/>
-          <w:u w:val="none" w:color="030303"/>
-          <w:shd w:val="nil" w:color="auto" w:fill="auto"/>
-          <w:vertAlign w:val="baseline"/>
-          <w:rtl w:val="0"/>
-          <w:lang w:val="fr-FR"/>
-          <w14:textFill>
-            <w14:solidFill>
-              <w14:srgbClr w14:val="030303"/>
-            </w14:solidFill>
-          </w14:textFill>
-        </w:rPr>
-        <w:t>Section 2 - Wife's Separate Property</w:t>
-      </w:r>
-    </w:p>
-    <w:p>
-      <w:pPr>
-        <w:pStyle w:val="Body"/>
-        <w:spacing w:before="288" w:line="314" w:lineRule="auto"/>
-        <w:ind w:left="350" w:hanging="1"/>
-        <w:rPr>
-          <w:rFonts w:ascii="Arial" w:cs="Arial" w:hAnsi="Arial" w:eastAsia="Arial"/>
-          <w:i w:val="1"/>
-          <w:iCs w:val="1"/>
-          <w:sz w:val="24"/>
-          <w:szCs w:val="24"/>
-        </w:rPr>
-      </w:pPr>
-      <w:r>
-        <w:rPr>
-          <w:rFonts w:ascii="Arial" w:hAnsi="Arial"/>
-          <w:i w:val="1"/>
-          <w:iCs w:val="1"/>
-          <w:outline w:val="0"/>
-          <w:color w:val="030303"/>
-          <w:sz w:val="24"/>
-          <w:szCs w:val="24"/>
-          <w:u w:color="030303"/>
-          <w:rtl w:val="0"/>
-          <w:lang w:val="en-US"/>
-          <w14:textFill>
-            <w14:solidFill>
-              <w14:srgbClr w14:val="030303"/>
-            </w14:solidFill>
-          </w14:textFill>
-        </w:rPr>
-        <w:t>This Section lists any property owned by {wifeFullName} before marriage, or received by {wifeFullName} during marriage as a gift or inheritance from a third party.</w:t>
-      </w:r>
-    </w:p>
-    <w:p>
-      <w:pPr>
-        <w:pStyle w:val="Body"/>
-        <w:tabs>
-          <w:tab w:val="left" w:pos="3407"/>
-          <w:tab w:val="left" w:pos="8253"/>
-        </w:tabs>
-        <w:spacing w:before="1"/>
-        <w:ind w:left="497" w:firstLine="0"/>
-        <w:rPr>
-          <w:b w:val="1"/>
-          <w:bCs w:val="1"/>
-          <w:outline w:val="0"/>
-          <w:color w:val="030303"/>
-          <w:sz w:val="23"/>
-          <w:szCs w:val="23"/>
-          <w:u w:color="030303"/>
-          <w14:textFill>
-            <w14:solidFill>
-              <w14:srgbClr w14:val="030303"/>
-            </w14:solidFill>
-          </w14:textFill>
-        </w:rPr>
-      </w:pPr>
-    </w:p>
-    <w:tbl>
-      <w:tblPr>
-        <w:tblW w:w="11022" w:type="dxa"/>
-        <w:jc w:val="left"/>
-        <w:tblInd w:w="605" w:type="dxa"/>
-        <w:tblBorders>
-          <w:top w:val="single" w:color="ffffff" w:sz="8" w:space="0" w:shadow="0" w:frame="0"/>
-          <w:left w:val="single" w:color="ffffff" w:sz="8" w:space="0" w:shadow="0" w:frame="0"/>
-          <w:bottom w:val="single" w:color="ffffff" w:sz="8" w:space="0" w:shadow="0" w:frame="0"/>
-          <w:right w:val="single" w:color="ffffff" w:sz="8" w:space="0" w:shadow="0" w:frame="0"/>
-          <w:insideH w:val="single" w:color="ffffff" w:sz="8" w:space="0" w:shadow="0" w:frame="0"/>
-          <w:insideV w:val="single" w:color="ffffff" w:sz="8" w:space="0" w:shadow="0" w:frame="0"/>
-        </w:tblBorders>
-        <w:shd w:val="clear" w:color="auto" w:fill="ced7e7"/>
-        <w:tblLayout w:type="fixed"/>
-      </w:tblPr>
-      <w:tblGrid>
-        <w:gridCol w:w="3674"/>
-        <w:gridCol w:w="3674"/>
-        <w:gridCol w:w="3674"/>
-      </w:tblGrid>
-      <w:tr>
-        <w:tblPrEx>
-          <w:shd w:val="clear" w:color="auto" w:fill="ced7e7"/>
-        </w:tblPrEx>
-        <w:trPr>
-          <w:trHeight w:val="310" w:hRule="atLeast"/>
-        </w:trPr>
-        <w:tc>
-          <w:tcPr>
-            <w:tcW w:type="dxa" w:w="3674"/>
-            <w:tcBorders>
-              <w:top w:val="single" w:color="000000" w:sz="8" w:space="0" w:shadow="0" w:frame="0"/>
-              <w:left w:val="single" w:color="000000" w:sz="8" w:space="0" w:shadow="0" w:frame="0"/>
-              <w:bottom w:val="single" w:color="000000" w:sz="8" w:space="0" w:shadow="0" w:frame="0"/>
-              <w:right w:val="single" w:color="000000" w:sz="8" w:space="0" w:shadow="0" w:frame="0"/>
-            </w:tcBorders>
-            <w:shd w:val="clear" w:color="auto" w:fill="auto"/>
-            <w:tcMar>
-              <w:top w:type="dxa" w:w="80"/>
-              <w:left w:type="dxa" w:w="577"/>
-              <w:bottom w:type="dxa" w:w="80"/>
-              <w:right w:type="dxa" w:w="80"/>
-            </w:tcMar>
-            <w:vAlign w:val="top"/>
-          </w:tcPr>
-          <w:p>
-            <w:pPr>
-              <w:pStyle w:val="Body"/>
-              <w:tabs>
-                <w:tab w:val="left" w:pos="5269"/>
-              </w:tabs>
-              <w:ind w:left="497" w:firstLine="0"/>
-            </w:pPr>
-            <w:r>
-              <w:rPr>
-                <w:b w:val="1"/>
-                <w:bCs w:val="1"/>
-                <w:outline w:val="0"/>
-                <w:color w:val="030303"/>
-                <w:sz w:val="24"/>
-                <w:szCs w:val="24"/>
-                <w:u w:color="030303"/>
-                <w:shd w:val="nil" w:color="auto" w:fill="auto"/>
-                <w:rtl w:val="0"/>
-                <w:lang w:val="en-US"/>
-                <w14:textFill>
-                  <w14:solidFill>
-                    <w14:srgbClr w14:val="030303"/>
-                  </w14:solidFill>
-                </w14:textFill>
-              </w:rPr>
-              <w:t>Asset</w:t>
-            </w:r>
-          </w:p>
-        </w:tc>
-        <w:tc>
-          <w:tcPr>
-            <w:tcW w:type="dxa" w:w="3674"/>
-            <w:tcBorders>
-              <w:top w:val="single" w:color="000000" w:sz="8" w:space="0" w:shadow="0" w:frame="0"/>
-              <w:left w:val="single" w:color="000000" w:sz="8" w:space="0" w:shadow="0" w:frame="0"/>
-              <w:bottom w:val="single" w:color="000000" w:sz="8" w:space="0" w:shadow="0" w:frame="0"/>
-              <w:right w:val="single" w:color="000000" w:sz="8" w:space="0" w:shadow="0" w:frame="0"/>
-            </w:tcBorders>
-            <w:shd w:val="clear" w:color="auto" w:fill="auto"/>
-            <w:tcMar>
-              <w:top w:type="dxa" w:w="80"/>
-              <w:left w:type="dxa" w:w="80"/>
-              <w:bottom w:type="dxa" w:w="80"/>
-              <w:right w:type="dxa" w:w="80"/>
-            </w:tcMar>
-            <w:vAlign w:val="top"/>
-          </w:tcPr>
-          <w:p>
-            <w:pPr>
-              <w:pStyle w:val="Body"/>
-            </w:pPr>
-            <w:r>
-              <w:rPr>
-                <w:b w:val="1"/>
-                <w:bCs w:val="1"/>
-                <w:outline w:val="0"/>
-                <w:color w:val="030303"/>
-                <w:sz w:val="23"/>
-                <w:szCs w:val="23"/>
-                <w:u w:color="030303"/>
-                <w:shd w:val="nil" w:color="auto" w:fill="auto"/>
-                <w:rtl w:val="0"/>
-                <w:lang w:val="en-US"/>
-                <w14:textFill>
-                  <w14:solidFill>
-                    <w14:srgbClr w14:val="030303"/>
-                  </w14:solidFill>
-                </w14:textFill>
-              </w:rPr>
-              <w:t>Approximate Value</w:t>
-            </w:r>
-          </w:p>
-        </w:tc>
-        <w:tc>
-          <w:tcPr>
-            <w:tcW w:type="dxa" w:w="3674"/>
-            <w:tcBorders>
-              <w:top w:val="single" w:color="000000" w:sz="8" w:space="0" w:shadow="0" w:frame="0"/>
-              <w:left w:val="single" w:color="000000" w:sz="8" w:space="0" w:shadow="0" w:frame="0"/>
-              <w:bottom w:val="single" w:color="000000" w:sz="8" w:space="0" w:shadow="0" w:frame="0"/>
-              <w:right w:val="single" w:color="000000" w:sz="8" w:space="0" w:shadow="0" w:frame="0"/>
-            </w:tcBorders>
-            <w:shd w:val="clear" w:color="auto" w:fill="auto"/>
-            <w:tcMar>
-              <w:top w:type="dxa" w:w="80"/>
-              <w:left w:type="dxa" w:w="80"/>
-              <w:bottom w:type="dxa" w:w="80"/>
-              <w:right w:type="dxa" w:w="80"/>
-            </w:tcMar>
-            <w:vAlign w:val="top"/>
-          </w:tcPr>
-          <w:p>
-            <w:pPr>
-              <w:pStyle w:val="Body"/>
-            </w:pPr>
-            <w:r>
-              <w:rPr>
-                <w:b w:val="1"/>
-                <w:bCs w:val="1"/>
-                <w:outline w:val="0"/>
-                <w:color w:val="030303"/>
-                <w:sz w:val="23"/>
-                <w:szCs w:val="23"/>
-                <w:u w:color="030303"/>
-                <w:shd w:val="nil" w:color="auto" w:fill="auto"/>
-                <w:rtl w:val="0"/>
-                <w:lang w:val="en-US"/>
-                <w14:textFill>
-                  <w14:solidFill>
-                    <w14:srgbClr w14:val="030303"/>
-                  </w14:solidFill>
-                </w14:textFill>
-              </w:rPr>
-              <w:t>Account ID</w:t>
-            </w:r>
-          </w:p>
-        </w:tc>
-      </w:tr>
-      <w:tr>
-        <w:tblPrEx>
-          <w:shd w:val="clear" w:color="auto" w:fill="ced7e7"/>
-        </w:tblPrEx>
-        <w:trPr>
-          <w:trHeight w:val="490" w:hRule="atLeast"/>
-        </w:trPr>
-        <w:tc>
-          <w:tcPr>
-            <w:tcW w:type="dxa" w:w="3674"/>
-            <w:tcBorders>
-              <w:top w:val="single" w:color="000000" w:sz="8" w:space="0" w:shadow="0" w:frame="0"/>
-              <w:left w:val="single" w:color="000000" w:sz="8" w:space="0" w:shadow="0" w:frame="0"/>
-              <w:bottom w:val="single" w:color="000000" w:sz="8" w:space="0" w:shadow="0" w:frame="0"/>
-              <w:right w:val="single" w:color="000000" w:sz="8" w:space="0" w:shadow="0" w:frame="0"/>
-            </w:tcBorders>
-            <w:shd w:val="clear" w:color="auto" w:fill="auto"/>
-            <w:tcMar>
-              <w:top w:type="dxa" w:w="80"/>
-              <w:left w:type="dxa" w:w="80"/>
-              <w:bottom w:type="dxa" w:w="80"/>
-              <w:right w:type="dxa" w:w="80"/>
-            </w:tcMar>
-            <w:vAlign w:val="top"/>
-          </w:tcPr>
-          <w:p>
-            <w:pPr>
-              <w:pStyle w:val="Body"/>
-            </w:pPr>
-            <w:r>
-              <w:rPr>
-                <w:outline w:val="0"/>
-                <w:color w:val="030303"/>
-                <w:sz w:val="23"/>
-                <w:szCs w:val="23"/>
-                <w:u w:color="030303"/>
-                <w:shd w:val="nil" w:color="auto" w:fill="auto"/>
-                <w:rtl w:val="0"/>
-                <w:lang w:val="en-US"/>
-                <w14:textFill>
-                  <w14:solidFill>
-                    <w14:srgbClr w14:val="030303"/>
-                  </w14:solidFill>
-                </w14:textFill>
-              </w:rPr>
-              <w:t>{#wifeSeparateProperty}{assetName}</w:t>
-            </w:r>
-          </w:p>
-        </w:tc>
-        <w:tc>
-          <w:tcPr>
-            <w:tcW w:type="dxa" w:w="3674"/>
-            <w:tcBorders>
-              <w:top w:val="single" w:color="000000" w:sz="8" w:space="0" w:shadow="0" w:frame="0"/>
-              <w:left w:val="single" w:color="000000" w:sz="8" w:space="0" w:shadow="0" w:frame="0"/>
-              <w:bottom w:val="single" w:color="000000" w:sz="8" w:space="0" w:shadow="0" w:frame="0"/>
-              <w:right w:val="single" w:color="000000" w:sz="8" w:space="0" w:shadow="0" w:frame="0"/>
-            </w:tcBorders>
-            <w:shd w:val="clear" w:color="auto" w:fill="auto"/>
-            <w:tcMar>
-              <w:top w:type="dxa" w:w="80"/>
-              <w:left w:type="dxa" w:w="80"/>
-              <w:bottom w:type="dxa" w:w="80"/>
-              <w:right w:type="dxa" w:w="80"/>
-            </w:tcMar>
-            <w:vAlign w:val="top"/>
-          </w:tcPr>
-          <w:p>
-            <w:pPr>
-              <w:pStyle w:val="Body"/>
-            </w:pPr>
-            <w:r>
-              <w:rPr>
-                <w:outline w:val="0"/>
-                <w:color w:val="030303"/>
-                <w:sz w:val="23"/>
-                <w:szCs w:val="23"/>
-                <w:u w:color="030303"/>
-                <w:shd w:val="nil" w:color="auto" w:fill="auto"/>
-                <w:rtl w:val="0"/>
-                <w:lang w:val="en-US"/>
-                <w14:textFill>
-                  <w14:solidFill>
-                    <w14:srgbClr w14:val="030303"/>
-                  </w14:solidFill>
-                </w14:textFill>
-              </w:rPr>
-              <w:t>{approximateValue}</w:t>
-            </w:r>
-          </w:p>
-        </w:tc>
-        <w:tc>
-          <w:tcPr>
-            <w:tcW w:type="dxa" w:w="3674"/>
-            <w:tcBorders>
-              <w:top w:val="single" w:color="000000" w:sz="8" w:space="0" w:shadow="0" w:frame="0"/>
-              <w:left w:val="single" w:color="000000" w:sz="8" w:space="0" w:shadow="0" w:frame="0"/>
-              <w:bottom w:val="single" w:color="000000" w:sz="8" w:space="0" w:shadow="0" w:frame="0"/>
-              <w:right w:val="single" w:color="000000" w:sz="8" w:space="0" w:shadow="0" w:frame="0"/>
-            </w:tcBorders>
-            <w:shd w:val="clear" w:color="auto" w:fill="auto"/>
-            <w:tcMar>
-              <w:top w:type="dxa" w:w="80"/>
-              <w:left w:type="dxa" w:w="80"/>
-              <w:bottom w:type="dxa" w:w="80"/>
-              <w:right w:type="dxa" w:w="80"/>
-            </w:tcMar>
-            <w:vAlign w:val="top"/>
-          </w:tcPr>
-          <w:p>
-            <w:pPr>
-              <w:pStyle w:val="Body"/>
-            </w:pPr>
-            <w:r>
-              <w:rPr>
-                <w:outline w:val="0"/>
-                <w:color w:val="030303"/>
-                <w:sz w:val="23"/>
-                <w:szCs w:val="23"/>
-                <w:u w:color="030303"/>
-                <w:shd w:val="nil" w:color="auto" w:fill="auto"/>
-                <w:rtl w:val="0"/>
-                <w:lang w:val="en-US"/>
-                <w14:textFill>
-                  <w14:solidFill>
-                    <w14:srgbClr w14:val="030303"/>
-                  </w14:solidFill>
-                </w14:textFill>
-              </w:rPr>
-              <w:t>{accountId}{/wifeSeparateProperty}</w:t>
-            </w:r>
-          </w:p>
-        </w:tc>
-      </w:tr>
-      <w:tr>
-        <w:tblPrEx>
-          <w:shd w:val="clear" w:color="auto" w:fill="ced7e7"/>
-        </w:tblPrEx>
-        <w:trPr>
-          <w:trHeight w:val="420" w:hRule="atLeast"/>
-        </w:trPr>
-        <w:tc>
-          <w:tcPr>
-            <w:tcW w:type="dxa" w:w="3674"/>
-            <w:tcBorders>
-              <w:top w:val="single" w:color="000000" w:sz="8" w:space="0" w:shadow="0" w:frame="0"/>
-              <w:left w:val="single" w:color="000000" w:sz="8" w:space="0" w:shadow="0" w:frame="0"/>
-              <w:bottom w:val="single" w:color="000000" w:sz="8" w:space="0" w:shadow="0" w:frame="0"/>
-              <w:right w:val="single" w:color="000000" w:sz="8" w:space="0" w:shadow="0" w:frame="0"/>
-            </w:tcBorders>
-            <w:shd w:val="clear" w:color="auto" w:fill="auto"/>
-            <w:tcMar>
-              <w:top w:type="dxa" w:w="80"/>
-              <w:left w:type="dxa" w:w="80"/>
-              <w:bottom w:type="dxa" w:w="80"/>
-              <w:right w:type="dxa" w:w="80"/>
-            </w:tcMar>
-            <w:vAlign w:val="top"/>
-          </w:tcPr>
-          <w:p/>
-        </w:tc>
-        <w:tc>
-          <w:tcPr>
-            <w:tcW w:type="dxa" w:w="3674"/>
-            <w:tcBorders>
-              <w:top w:val="single" w:color="000000" w:sz="8" w:space="0" w:shadow="0" w:frame="0"/>
-              <w:left w:val="single" w:color="000000" w:sz="8" w:space="0" w:shadow="0" w:frame="0"/>
-              <w:bottom w:val="single" w:color="000000" w:sz="8" w:space="0" w:shadow="0" w:frame="0"/>
-              <w:right w:val="single" w:color="000000" w:sz="8" w:space="0" w:shadow="0" w:frame="0"/>
-            </w:tcBorders>
-            <w:shd w:val="clear" w:color="auto" w:fill="auto"/>
-            <w:tcMar>
-              <w:top w:type="dxa" w:w="80"/>
-              <w:left w:type="dxa" w:w="80"/>
-              <w:bottom w:type="dxa" w:w="80"/>
-              <w:right w:type="dxa" w:w="80"/>
-            </w:tcMar>
-            <w:vAlign w:val="top"/>
-          </w:tcPr>
-          <w:p/>
-        </w:tc>
-        <w:tc>
-          <w:tcPr>
-            <w:tcW w:type="dxa" w:w="3674"/>
-            <w:tcBorders>
-              <w:top w:val="single" w:color="000000" w:sz="8" w:space="0" w:shadow="0" w:frame="0"/>
-              <w:left w:val="single" w:color="000000" w:sz="8" w:space="0" w:shadow="0" w:frame="0"/>
-              <w:bottom w:val="single" w:color="000000" w:sz="8" w:space="0" w:shadow="0" w:frame="0"/>
-              <w:right w:val="single" w:color="000000" w:sz="8" w:space="0" w:shadow="0" w:frame="0"/>
-            </w:tcBorders>
-            <w:shd w:val="clear" w:color="auto" w:fill="auto"/>
-            <w:tcMar>
-              <w:top w:type="dxa" w:w="80"/>
-              <w:left w:type="dxa" w:w="80"/>
-              <w:bottom w:type="dxa" w:w="80"/>
-              <w:right w:type="dxa" w:w="80"/>
-            </w:tcMar>
-            <w:vAlign w:val="top"/>
-          </w:tcPr>
-          <w:p/>
-        </w:tc>
-      </w:tr>
-      <w:tr>
-        <w:tblPrEx>
-          <w:shd w:val="clear" w:color="auto" w:fill="ced7e7"/>
-        </w:tblPrEx>
-        <w:trPr>
-          <w:trHeight w:val="420" w:hRule="atLeast"/>
-        </w:trPr>
-        <w:tc>
-          <w:tcPr>
-            <w:tcW w:type="dxa" w:w="3674"/>
-            <w:tcBorders>
-              <w:top w:val="single" w:color="000000" w:sz="8" w:space="0" w:shadow="0" w:frame="0"/>
-              <w:left w:val="single" w:color="000000" w:sz="8" w:space="0" w:shadow="0" w:frame="0"/>
-              <w:bottom w:val="single" w:color="000000" w:sz="8" w:space="0" w:shadow="0" w:frame="0"/>
-              <w:right w:val="single" w:color="000000" w:sz="8" w:space="0" w:shadow="0" w:frame="0"/>
-            </w:tcBorders>
-            <w:shd w:val="clear" w:color="auto" w:fill="auto"/>
-            <w:tcMar>
-              <w:top w:type="dxa" w:w="80"/>
-              <w:left w:type="dxa" w:w="80"/>
-              <w:bottom w:type="dxa" w:w="80"/>
-              <w:right w:type="dxa" w:w="80"/>
-            </w:tcMar>
-            <w:vAlign w:val="top"/>
-          </w:tcPr>
-          <w:p/>
-        </w:tc>
-        <w:tc>
-          <w:tcPr>
-            <w:tcW w:type="dxa" w:w="3674"/>
-            <w:tcBorders>
-              <w:top w:val="single" w:color="000000" w:sz="8" w:space="0" w:shadow="0" w:frame="0"/>
-              <w:left w:val="single" w:color="000000" w:sz="8" w:space="0" w:shadow="0" w:frame="0"/>
-              <w:bottom w:val="single" w:color="000000" w:sz="8" w:space="0" w:shadow="0" w:frame="0"/>
-              <w:right w:val="single" w:color="000000" w:sz="8" w:space="0" w:shadow="0" w:frame="0"/>
-            </w:tcBorders>
-            <w:shd w:val="clear" w:color="auto" w:fill="auto"/>
-            <w:tcMar>
-              <w:top w:type="dxa" w:w="80"/>
-              <w:left w:type="dxa" w:w="80"/>
-              <w:bottom w:type="dxa" w:w="80"/>
-              <w:right w:type="dxa" w:w="80"/>
-            </w:tcMar>
-            <w:vAlign w:val="top"/>
-          </w:tcPr>
-          <w:p/>
-        </w:tc>
-        <w:tc>
-          <w:tcPr>
-            <w:tcW w:type="dxa" w:w="3674"/>
-            <w:tcBorders>
-              <w:top w:val="single" w:color="000000" w:sz="8" w:space="0" w:shadow="0" w:frame="0"/>
-              <w:left w:val="single" w:color="000000" w:sz="8" w:space="0" w:shadow="0" w:frame="0"/>
-              <w:bottom w:val="single" w:color="000000" w:sz="8" w:space="0" w:shadow="0" w:frame="0"/>
-              <w:right w:val="single" w:color="000000" w:sz="8" w:space="0" w:shadow="0" w:frame="0"/>
-            </w:tcBorders>
-            <w:shd w:val="clear" w:color="auto" w:fill="auto"/>
-            <w:tcMar>
-              <w:top w:type="dxa" w:w="80"/>
-              <w:left w:type="dxa" w:w="80"/>
-              <w:bottom w:type="dxa" w:w="80"/>
-              <w:right w:type="dxa" w:w="80"/>
-            </w:tcMar>
-            <w:vAlign w:val="top"/>
-          </w:tcPr>
-          <w:p/>
-        </w:tc>
-      </w:tr>
-      <w:tr>
-        <w:tblPrEx>
-          <w:shd w:val="clear" w:color="auto" w:fill="ced7e7"/>
-        </w:tblPrEx>
-        <w:trPr>
-          <w:trHeight w:val="420" w:hRule="atLeast"/>
-        </w:trPr>
-        <w:tc>
-          <w:tcPr>
-            <w:tcW w:type="dxa" w:w="3674"/>
-            <w:tcBorders>
-              <w:top w:val="single" w:color="000000" w:sz="8" w:space="0" w:shadow="0" w:frame="0"/>
-              <w:left w:val="single" w:color="000000" w:sz="8" w:space="0" w:shadow="0" w:frame="0"/>
-              <w:bottom w:val="single" w:color="000000" w:sz="8" w:space="0" w:shadow="0" w:frame="0"/>
-              <w:right w:val="single" w:color="000000" w:sz="8" w:space="0" w:shadow="0" w:frame="0"/>
-            </w:tcBorders>
-            <w:shd w:val="clear" w:color="auto" w:fill="auto"/>
-            <w:tcMar>
-              <w:top w:type="dxa" w:w="80"/>
-              <w:left w:type="dxa" w:w="80"/>
-              <w:bottom w:type="dxa" w:w="80"/>
-              <w:right w:type="dxa" w:w="80"/>
-            </w:tcMar>
-            <w:vAlign w:val="top"/>
-          </w:tcPr>
-          <w:p/>
-        </w:tc>
-        <w:tc>
-          <w:tcPr>
-            <w:tcW w:type="dxa" w:w="3674"/>
-            <w:tcBorders>
-              <w:top w:val="single" w:color="000000" w:sz="8" w:space="0" w:shadow="0" w:frame="0"/>
-              <w:left w:val="single" w:color="000000" w:sz="8" w:space="0" w:shadow="0" w:frame="0"/>
-              <w:bottom w:val="single" w:color="000000" w:sz="8" w:space="0" w:shadow="0" w:frame="0"/>
-              <w:right w:val="single" w:color="000000" w:sz="8" w:space="0" w:shadow="0" w:frame="0"/>
-            </w:tcBorders>
-            <w:shd w:val="clear" w:color="auto" w:fill="auto"/>
-            <w:tcMar>
-              <w:top w:type="dxa" w:w="80"/>
-              <w:left w:type="dxa" w:w="80"/>
-              <w:bottom w:type="dxa" w:w="80"/>
-              <w:right w:type="dxa" w:w="80"/>
-            </w:tcMar>
-            <w:vAlign w:val="top"/>
-          </w:tcPr>
-          <w:p/>
-        </w:tc>
-        <w:tc>
-          <w:tcPr>
-            <w:tcW w:type="dxa" w:w="3674"/>
-            <w:tcBorders>
-              <w:top w:val="single" w:color="000000" w:sz="8" w:space="0" w:shadow="0" w:frame="0"/>
-              <w:left w:val="single" w:color="000000" w:sz="8" w:space="0" w:shadow="0" w:frame="0"/>
-              <w:bottom w:val="single" w:color="000000" w:sz="8" w:space="0" w:shadow="0" w:frame="0"/>
-              <w:right w:val="single" w:color="000000" w:sz="8" w:space="0" w:shadow="0" w:frame="0"/>
-            </w:tcBorders>
-            <w:shd w:val="clear" w:color="auto" w:fill="auto"/>
-            <w:tcMar>
-              <w:top w:type="dxa" w:w="80"/>
-              <w:left w:type="dxa" w:w="80"/>
-              <w:bottom w:type="dxa" w:w="80"/>
-              <w:right w:type="dxa" w:w="80"/>
-            </w:tcMar>
-            <w:vAlign w:val="top"/>
-          </w:tcPr>
-          <w:p/>
-        </w:tc>
-      </w:tr>
-      <w:tr>
-        <w:tblPrEx>
-          <w:shd w:val="clear" w:color="auto" w:fill="ced7e7"/>
-        </w:tblPrEx>
-        <w:trPr>
-          <w:trHeight w:val="420" w:hRule="atLeast"/>
-        </w:trPr>
-        <w:tc>
-          <w:tcPr>
-            <w:tcW w:type="dxa" w:w="3674"/>
-            <w:tcBorders>
-              <w:top w:val="single" w:color="000000" w:sz="8" w:space="0" w:shadow="0" w:frame="0"/>
-              <w:left w:val="single" w:color="000000" w:sz="8" w:space="0" w:shadow="0" w:frame="0"/>
-              <w:bottom w:val="single" w:color="000000" w:sz="8" w:space="0" w:shadow="0" w:frame="0"/>
-              <w:right w:val="single" w:color="000000" w:sz="8" w:space="0" w:shadow="0" w:frame="0"/>
-            </w:tcBorders>
-            <w:shd w:val="clear" w:color="auto" w:fill="auto"/>
-            <w:tcMar>
-              <w:top w:type="dxa" w:w="80"/>
-              <w:left w:type="dxa" w:w="80"/>
-              <w:bottom w:type="dxa" w:w="80"/>
-              <w:right w:type="dxa" w:w="80"/>
-            </w:tcMar>
-            <w:vAlign w:val="top"/>
-          </w:tcPr>
-          <w:p/>
-        </w:tc>
-        <w:tc>
-          <w:tcPr>
-            <w:tcW w:type="dxa" w:w="3674"/>
-            <w:tcBorders>
-              <w:top w:val="single" w:color="000000" w:sz="8" w:space="0" w:shadow="0" w:frame="0"/>
-              <w:left w:val="single" w:color="000000" w:sz="8" w:space="0" w:shadow="0" w:frame="0"/>
-              <w:bottom w:val="single" w:color="000000" w:sz="8" w:space="0" w:shadow="0" w:frame="0"/>
-              <w:right w:val="single" w:color="000000" w:sz="8" w:space="0" w:shadow="0" w:frame="0"/>
-            </w:tcBorders>
-            <w:shd w:val="clear" w:color="auto" w:fill="auto"/>
-            <w:tcMar>
-              <w:top w:type="dxa" w:w="80"/>
-              <w:left w:type="dxa" w:w="80"/>
-              <w:bottom w:type="dxa" w:w="80"/>
-              <w:right w:type="dxa" w:w="80"/>
-            </w:tcMar>
-            <w:vAlign w:val="top"/>
-          </w:tcPr>
-          <w:p/>
-        </w:tc>
-        <w:tc>
-          <w:tcPr>
-            <w:tcW w:type="dxa" w:w="3674"/>
-            <w:tcBorders>
-              <w:top w:val="single" w:color="000000" w:sz="8" w:space="0" w:shadow="0" w:frame="0"/>
-              <w:left w:val="single" w:color="000000" w:sz="8" w:space="0" w:shadow="0" w:frame="0"/>
-              <w:bottom w:val="single" w:color="000000" w:sz="8" w:space="0" w:shadow="0" w:frame="0"/>
-              <w:right w:val="single" w:color="000000" w:sz="8" w:space="0" w:shadow="0" w:frame="0"/>
-            </w:tcBorders>
-            <w:shd w:val="clear" w:color="auto" w:fill="auto"/>
-            <w:tcMar>
-              <w:top w:type="dxa" w:w="80"/>
-              <w:left w:type="dxa" w:w="80"/>
-              <w:bottom w:type="dxa" w:w="80"/>
-              <w:right w:type="dxa" w:w="80"/>
-            </w:tcMar>
-            <w:vAlign w:val="top"/>
-          </w:tcPr>
-          <w:p/>
-        </w:tc>
-      </w:tr>
-      <w:tr>
-        <w:tblPrEx>
-          <w:shd w:val="clear" w:color="auto" w:fill="ced7e7"/>
-        </w:tblPrEx>
-        <w:trPr>
-          <w:trHeight w:val="420" w:hRule="atLeast"/>
-        </w:trPr>
-        <w:tc>
-          <w:tcPr>
-            <w:tcW w:type="dxa" w:w="3674"/>
-            <w:tcBorders>
-              <w:top w:val="single" w:color="000000" w:sz="8" w:space="0" w:shadow="0" w:frame="0"/>
-              <w:left w:val="single" w:color="000000" w:sz="8" w:space="0" w:shadow="0" w:frame="0"/>
-              <w:bottom w:val="single" w:color="000000" w:sz="8" w:space="0" w:shadow="0" w:frame="0"/>
-              <w:right w:val="single" w:color="000000" w:sz="8" w:space="0" w:shadow="0" w:frame="0"/>
-            </w:tcBorders>
-            <w:shd w:val="clear" w:color="auto" w:fill="auto"/>
-            <w:tcMar>
-              <w:top w:type="dxa" w:w="80"/>
-              <w:left w:type="dxa" w:w="80"/>
-              <w:bottom w:type="dxa" w:w="80"/>
-              <w:right w:type="dxa" w:w="80"/>
-            </w:tcMar>
-            <w:vAlign w:val="top"/>
-          </w:tcPr>
-          <w:p>
-            <w:r>
-              <w:t/>
-            </w:r>
-          </w:p>
-        </w:tc>
-        <w:tc>
-          <w:tcPr>
-            <w:tcW w:type="dxa" w:w="3674"/>
-            <w:tcBorders>
-              <w:top w:val="single" w:color="000000" w:sz="8" w:space="0" w:shadow="0" w:frame="0"/>
-              <w:left w:val="single" w:color="000000" w:sz="8" w:space="0" w:shadow="0" w:frame="0"/>
-              <w:bottom w:val="single" w:color="000000" w:sz="8" w:space="0" w:shadow="0" w:frame="0"/>
-              <w:right w:val="single" w:color="000000" w:sz="8" w:space="0" w:shadow="0" w:frame="0"/>
-            </w:tcBorders>
-            <w:shd w:val="clear" w:color="auto" w:fill="auto"/>
-            <w:tcMar>
-              <w:top w:type="dxa" w:w="80"/>
-              <w:left w:type="dxa" w:w="80"/>
-              <w:bottom w:type="dxa" w:w="80"/>
-              <w:right w:type="dxa" w:w="80"/>
-            </w:tcMar>
-            <w:vAlign w:val="top"/>
-          </w:tcPr>
-          <w:p>
-            <w:r>
-              <w:t/>
-            </w:r>
-          </w:p>
-        </w:tc>
-        <w:tc>
-          <w:tcPr>
-            <w:tcW w:type="dxa" w:w="3674"/>
-            <w:tcBorders>
-              <w:top w:val="single" w:color="000000" w:sz="8" w:space="0" w:shadow="0" w:frame="0"/>
-              <w:left w:val="single" w:color="000000" w:sz="8" w:space="0" w:shadow="0" w:frame="0"/>
-              <w:bottom w:val="single" w:color="000000" w:sz="8" w:space="0" w:shadow="0" w:frame="0"/>
-              <w:right w:val="single" w:color="000000" w:sz="8" w:space="0" w:shadow="0" w:frame="0"/>
-            </w:tcBorders>
-            <w:shd w:val="clear" w:color="auto" w:fill="auto"/>
-            <w:tcMar>
-              <w:top w:type="dxa" w:w="80"/>
-              <w:left w:type="dxa" w:w="80"/>
-              <w:bottom w:type="dxa" w:w="80"/>
-              <w:right w:type="dxa" w:w="80"/>
-            </w:tcMar>
-            <w:vAlign w:val="top"/>
-          </w:tcPr>
-          <w:p>
-            <w:r>
-              <w:t/>
-            </w:r>
-          </w:p>
-        </w:tc>
-      </w:tr>
-      <w:tr>
-        <w:tblPrEx>
-          <w:shd w:val="clear" w:color="auto" w:fill="ced7e7"/>
-        </w:tblPrEx>
-        <w:trPr>
-          <w:trHeight w:val="420" w:hRule="atLeast"/>
-        </w:trPr>
-        <w:tc>
-          <w:tcPr>
-            <w:tcW w:type="dxa" w:w="3674"/>
-            <w:tcBorders>
-              <w:top w:val="single" w:color="000000" w:sz="8" w:space="0" w:shadow="0" w:frame="0"/>
-              <w:left w:val="single" w:color="000000" w:sz="8" w:space="0" w:shadow="0" w:frame="0"/>
-              <w:bottom w:val="single" w:color="000000" w:sz="8" w:space="0" w:shadow="0" w:frame="0"/>
-              <w:right w:val="single" w:color="000000" w:sz="8" w:space="0" w:shadow="0" w:frame="0"/>
-            </w:tcBorders>
-            <w:shd w:val="clear" w:color="auto" w:fill="auto"/>
-            <w:tcMar>
-              <w:top w:type="dxa" w:w="80"/>
-              <w:left w:type="dxa" w:w="80"/>
-              <w:bottom w:type="dxa" w:w="80"/>
-              <w:right w:type="dxa" w:w="80"/>
-            </w:tcMar>
-            <w:vAlign w:val="top"/>
-          </w:tcPr>
-          <w:p>
-            <w:r>
-              <w:t/>
-            </w:r>
-          </w:p>
-        </w:tc>
-        <w:tc>
-          <w:tcPr>
-            <w:tcW w:type="dxa" w:w="3674"/>
-            <w:tcBorders>
-              <w:top w:val="single" w:color="000000" w:sz="8" w:space="0" w:shadow="0" w:frame="0"/>
-              <w:left w:val="single" w:color="000000" w:sz="8" w:space="0" w:shadow="0" w:frame="0"/>
-              <w:bottom w:val="single" w:color="000000" w:sz="8" w:space="0" w:shadow="0" w:frame="0"/>
-              <w:right w:val="single" w:color="000000" w:sz="8" w:space="0" w:shadow="0" w:frame="0"/>
-            </w:tcBorders>
-            <w:shd w:val="clear" w:color="auto" w:fill="auto"/>
-            <w:tcMar>
-              <w:top w:type="dxa" w:w="80"/>
-              <w:left w:type="dxa" w:w="80"/>
-              <w:bottom w:type="dxa" w:w="80"/>
-              <w:right w:type="dxa" w:w="80"/>
-            </w:tcMar>
-            <w:vAlign w:val="top"/>
-          </w:tcPr>
-          <w:p>
-            <w:r>
-              <w:t/>
-            </w:r>
-          </w:p>
-        </w:tc>
-        <w:tc>
-          <w:tcPr>
-            <w:tcW w:type="dxa" w:w="3674"/>
-            <w:tcBorders>
-              <w:top w:val="single" w:color="000000" w:sz="8" w:space="0" w:shadow="0" w:frame="0"/>
-              <w:left w:val="single" w:color="000000" w:sz="8" w:space="0" w:shadow="0" w:frame="0"/>
-              <w:bottom w:val="single" w:color="000000" w:sz="8" w:space="0" w:shadow="0" w:frame="0"/>
-              <w:right w:val="single" w:color="000000" w:sz="8" w:space="0" w:shadow="0" w:frame="0"/>
-            </w:tcBorders>
-            <w:shd w:val="clear" w:color="auto" w:fill="auto"/>
-            <w:tcMar>
-              <w:top w:type="dxa" w:w="80"/>
-              <w:left w:type="dxa" w:w="80"/>
-              <w:bottom w:type="dxa" w:w="80"/>
-              <w:right w:type="dxa" w:w="80"/>
-            </w:tcMar>
-            <w:vAlign w:val="top"/>
-          </w:tcPr>
-          <w:p>
-            <w:r>
-              <w:t/>
-            </w:r>
-          </w:p>
-        </w:tc>
-      </w:tr>
-      <w:tr>
-        <w:tblPrEx>
-          <w:shd w:val="clear" w:color="auto" w:fill="ced7e7"/>
-        </w:tblPrEx>
-        <w:trPr>
-          <w:trHeight w:val="420" w:hRule="atLeast"/>
-        </w:trPr>
-        <w:tc>
-          <w:tcPr>
-            <w:tcW w:type="dxa" w:w="3674"/>
-            <w:tcBorders>
-              <w:top w:val="single" w:color="000000" w:sz="8" w:space="0" w:shadow="0" w:frame="0"/>
-              <w:left w:val="single" w:color="000000" w:sz="8" w:space="0" w:shadow="0" w:frame="0"/>
-              <w:bottom w:val="single" w:color="000000" w:sz="8" w:space="0" w:shadow="0" w:frame="0"/>
-              <w:right w:val="single" w:color="000000" w:sz="8" w:space="0" w:shadow="0" w:frame="0"/>
-            </w:tcBorders>
-            <w:shd w:val="clear" w:color="auto" w:fill="auto"/>
-            <w:tcMar>
-              <w:top w:type="dxa" w:w="80"/>
-              <w:left w:type="dxa" w:w="80"/>
-              <w:bottom w:type="dxa" w:w="80"/>
-              <w:right w:type="dxa" w:w="80"/>
-            </w:tcMar>
-            <w:vAlign w:val="top"/>
-          </w:tcPr>
-          <w:p>
-            <w:r>
-              <w:t/>
-            </w:r>
-          </w:p>
-        </w:tc>
-        <w:tc>
-          <w:tcPr>
-            <w:tcW w:type="dxa" w:w="3674"/>
-            <w:tcBorders>
-              <w:top w:val="single" w:color="000000" w:sz="8" w:space="0" w:shadow="0" w:frame="0"/>
-              <w:left w:val="single" w:color="000000" w:sz="8" w:space="0" w:shadow="0" w:frame="0"/>
-              <w:bottom w:val="single" w:color="000000" w:sz="8" w:space="0" w:shadow="0" w:frame="0"/>
-              <w:right w:val="single" w:color="000000" w:sz="8" w:space="0" w:shadow="0" w:frame="0"/>
-            </w:tcBorders>
-            <w:shd w:val="clear" w:color="auto" w:fill="auto"/>
-            <w:tcMar>
-              <w:top w:type="dxa" w:w="80"/>
-              <w:left w:type="dxa" w:w="80"/>
-              <w:bottom w:type="dxa" w:w="80"/>
-              <w:right w:type="dxa" w:w="80"/>
-            </w:tcMar>
-            <w:vAlign w:val="top"/>
-          </w:tcPr>
-          <w:p>
-            <w:r>
-              <w:t/>
-            </w:r>
-          </w:p>
-        </w:tc>
-        <w:tc>
-          <w:tcPr>
-            <w:tcW w:type="dxa" w:w="3674"/>
-            <w:tcBorders>
-              <w:top w:val="single" w:color="000000" w:sz="8" w:space="0" w:shadow="0" w:frame="0"/>
-              <w:left w:val="single" w:color="000000" w:sz="8" w:space="0" w:shadow="0" w:frame="0"/>
-              <w:bottom w:val="single" w:color="000000" w:sz="8" w:space="0" w:shadow="0" w:frame="0"/>
-              <w:right w:val="single" w:color="000000" w:sz="8" w:space="0" w:shadow="0" w:frame="0"/>
-            </w:tcBorders>
-            <w:shd w:val="clear" w:color="auto" w:fill="auto"/>
-            <w:tcMar>
-              <w:top w:type="dxa" w:w="80"/>
-              <w:left w:type="dxa" w:w="80"/>
-              <w:bottom w:type="dxa" w:w="80"/>
-              <w:right w:type="dxa" w:w="80"/>
-            </w:tcMar>
-            <w:vAlign w:val="top"/>
-          </w:tcPr>
-          <w:p>
-            <w:r>
-              <w:t/>
-            </w:r>
-          </w:p>
-        </w:tc>
-      </w:tr>
-      <w:tr>
-        <w:tblPrEx>
-          <w:shd w:val="clear" w:color="auto" w:fill="ced7e7"/>
-        </w:tblPrEx>
-        <w:trPr>
-          <w:trHeight w:val="420" w:hRule="atLeast"/>
-        </w:trPr>
-        <w:tc>
-          <w:tcPr>
-            <w:tcW w:type="dxa" w:w="3674"/>
-            <w:tcBorders>
-              <w:top w:val="single" w:color="000000" w:sz="8" w:space="0" w:shadow="0" w:frame="0"/>
-              <w:left w:val="single" w:color="000000" w:sz="8" w:space="0" w:shadow="0" w:frame="0"/>
-              <w:bottom w:val="single" w:color="000000" w:sz="8" w:space="0" w:shadow="0" w:frame="0"/>
-              <w:right w:val="single" w:color="000000" w:sz="8" w:space="0" w:shadow="0" w:frame="0"/>
-            </w:tcBorders>
-            <w:shd w:val="clear" w:color="auto" w:fill="auto"/>
-            <w:tcMar>
-              <w:top w:type="dxa" w:w="80"/>
-              <w:left w:type="dxa" w:w="80"/>
-              <w:bottom w:type="dxa" w:w="80"/>
-              <w:right w:type="dxa" w:w="80"/>
-            </w:tcMar>
-            <w:vAlign w:val="top"/>
-          </w:tcPr>
-          <w:p>
-            <w:r>
-              <w:t/>
-            </w:r>
-          </w:p>
-        </w:tc>
-        <w:tc>
-          <w:tcPr>
-            <w:tcW w:type="dxa" w:w="3674"/>
-            <w:tcBorders>
-              <w:top w:val="single" w:color="000000" w:sz="8" w:space="0" w:shadow="0" w:frame="0"/>
-              <w:left w:val="single" w:color="000000" w:sz="8" w:space="0" w:shadow="0" w:frame="0"/>
-              <w:bottom w:val="single" w:color="000000" w:sz="8" w:space="0" w:shadow="0" w:frame="0"/>
-              <w:right w:val="single" w:color="000000" w:sz="8" w:space="0" w:shadow="0" w:frame="0"/>
-            </w:tcBorders>
-            <w:shd w:val="clear" w:color="auto" w:fill="auto"/>
-            <w:tcMar>
-              <w:top w:type="dxa" w:w="80"/>
-              <w:left w:type="dxa" w:w="80"/>
-              <w:bottom w:type="dxa" w:w="80"/>
-              <w:right w:type="dxa" w:w="80"/>
-            </w:tcMar>
-            <w:vAlign w:val="top"/>
-          </w:tcPr>
-          <w:p>
-            <w:r>
-              <w:t/>
-            </w:r>
-          </w:p>
-        </w:tc>
-        <w:tc>
-          <w:tcPr>
-            <w:tcW w:type="dxa" w:w="3674"/>
-            <w:tcBorders>
-              <w:top w:val="single" w:color="000000" w:sz="8" w:space="0" w:shadow="0" w:frame="0"/>
-              <w:left w:val="single" w:color="000000" w:sz="8" w:space="0" w:shadow="0" w:frame="0"/>
-              <w:bottom w:val="single" w:color="000000" w:sz="8" w:space="0" w:shadow="0" w:frame="0"/>
-              <w:right w:val="single" w:color="000000" w:sz="8" w:space="0" w:shadow="0" w:frame="0"/>
-            </w:tcBorders>
-            <w:shd w:val="clear" w:color="auto" w:fill="auto"/>
-            <w:tcMar>
-              <w:top w:type="dxa" w:w="80"/>
-              <w:left w:type="dxa" w:w="80"/>
-              <w:bottom w:type="dxa" w:w="80"/>
-              <w:right w:type="dxa" w:w="80"/>
-            </w:tcMar>
-            <w:vAlign w:val="top"/>
-          </w:tcPr>
-          <w:p>
-            <w:r>
-              <w:t/>
-            </w:r>
-          </w:p>
-        </w:tc>
-      </w:tr>
-    </w:tbl>
-    <w:p>
-      <w:pPr>
-        <w:pStyle w:val="Body"/>
-        <w:tabs>
-          <w:tab w:val="left" w:pos="3407"/>
-          <w:tab w:val="left" w:pos="8253"/>
-        </w:tabs>
-        <w:spacing w:before="1"/>
-        <w:ind w:left="497" w:hanging="497"/>
-        <w:rPr>
-          <w:b w:val="1"/>
-          <w:bCs w:val="1"/>
-          <w:outline w:val="0"/>
-          <w:color w:val="030303"/>
-          <w:sz w:val="23"/>
-          <w:szCs w:val="23"/>
-          <w:u w:color="030303"/>
-          <w14:textFill>
-            <w14:solidFill>
-              <w14:srgbClr w14:val="030303"/>
-            </w14:solidFill>
-          </w14:textFill>
-        </w:rPr>
-      </w:pPr>
-    </w:p>
-    <w:p>
-      <w:pPr>
-        <w:pStyle w:val="Body"/>
-        <w:tabs>
-          <w:tab w:val="left" w:pos="3407"/>
-          <w:tab w:val="left" w:pos="8253"/>
-        </w:tabs>
-        <w:spacing w:before="1"/>
-        <w:ind w:left="497" w:firstLine="0"/>
-        <w:rPr>
-          <w:b w:val="1"/>
-          <w:bCs w:val="1"/>
-          <w:outline w:val="0"/>
-          <w:color w:val="030303"/>
-          <w:sz w:val="23"/>
-          <w:szCs w:val="23"/>
-          <w:u w:color="030303"/>
-          <w14:textFill>
-            <w14:solidFill>
-              <w14:srgbClr w14:val="030303"/>
-            </w14:solidFill>
-          </w14:textFill>
-        </w:rPr>
-      </w:pPr>
-    </w:p>
-    <w:p>
-      <w:pPr>
-        <w:pStyle w:val="Body"/>
-        <w:tabs>
-          <w:tab w:val="left" w:pos="3407"/>
-          <w:tab w:val="left" w:pos="8253"/>
-        </w:tabs>
-        <w:ind w:left="497" w:firstLine="0"/>
-        <w:rPr>
-          <w:b w:val="1"/>
-          <w:bCs w:val="1"/>
-          <w:outline w:val="0"/>
-          <w:color w:val="030303"/>
-          <w:sz w:val="23"/>
-          <w:szCs w:val="23"/>
-          <w:u w:color="030303"/>
-          <w14:textFill>
-            <w14:solidFill>
-              <w14:srgbClr w14:val="030303"/>
-            </w14:solidFill>
-          </w14:textFill>
-        </w:rPr>
-      </w:pPr>
-    </w:p>
-    <w:p>
-      <w:pPr>
-        <w:pStyle w:val="Body"/>
       </w:pPr>
       <w:r>
         <w:rPr>
@@ -23339,7 +21364,7 @@
             </w14:solidFill>
           </w14:textFill>
         </w:rPr>
-        <w:t>Section 3 - Major Asset Ownership</w:t>
+        <w:t>Section 1 - Major Asset Ownership</w:t>
       </w:r>
     </w:p>
     <w:p>
@@ -24483,7 +22508,7 @@
             </w14:solidFill>
           </w14:textFill>
         </w:rPr>
-        <w:t>Section 3 - Major Assets</w:t>
+        <w:t>Section 1 - Major Assets</w:t>
       </w:r>
     </w:p>
     <w:p>

</xml_diff>